<commit_message>
Aws, S3 with athena (Athena part added and other remaining file with data added)
</commit_message>
<xml_diff>
--- a/New folder/AWS Glue, S3 with Athena - Doc 3.docx
+++ b/New folder/AWS Glue, S3 with Athena - Doc 3.docx
@@ -387,7 +387,27 @@
           <w:szCs w:val="21"/>
           <w:highlight w:val="white"/>
         </w:rPr>
-        <w:t>It is similar to hive database and table hierarchy</w:t>
+        <w:t xml:space="preserve">It is </w:t>
+      </w:r>
+      <w:proofErr w:type="gramStart"/>
+      <w:r>
+        <w:rPr>
+          <w:rFonts w:ascii="Roboto" w:eastAsia="Roboto" w:hAnsi="Roboto" w:cs="Roboto"/>
+          <w:sz w:val="21"/>
+          <w:szCs w:val="21"/>
+          <w:highlight w:val="white"/>
+        </w:rPr>
+        <w:t>similar to</w:t>
+      </w:r>
+      <w:proofErr w:type="gramEnd"/>
+      <w:r>
+        <w:rPr>
+          <w:rFonts w:ascii="Roboto" w:eastAsia="Roboto" w:hAnsi="Roboto" w:cs="Roboto"/>
+          <w:sz w:val="21"/>
+          <w:szCs w:val="21"/>
+          <w:highlight w:val="white"/>
+        </w:rPr>
+        <w:t xml:space="preserve"> hive database and table hierarchy</w:t>
       </w:r>
     </w:p>
     <w:p>
@@ -509,7 +529,27 @@
           <w:szCs w:val="21"/>
           <w:highlight w:val="white"/>
         </w:rPr>
-        <w:t>. So zip codes will be your table name</w:t>
+        <w:t xml:space="preserve">. </w:t>
+      </w:r>
+      <w:proofErr w:type="gramStart"/>
+      <w:r>
+        <w:rPr>
+          <w:rFonts w:ascii="Roboto" w:eastAsia="Roboto" w:hAnsi="Roboto" w:cs="Roboto"/>
+          <w:sz w:val="21"/>
+          <w:szCs w:val="21"/>
+          <w:highlight w:val="white"/>
+        </w:rPr>
+        <w:t>So</w:t>
+      </w:r>
+      <w:proofErr w:type="gramEnd"/>
+      <w:r>
+        <w:rPr>
+          <w:rFonts w:ascii="Roboto" w:eastAsia="Roboto" w:hAnsi="Roboto" w:cs="Roboto"/>
+          <w:sz w:val="21"/>
+          <w:szCs w:val="21"/>
+          <w:highlight w:val="white"/>
+        </w:rPr>
+        <w:t xml:space="preserve"> zip codes will be your table name</w:t>
       </w:r>
     </w:p>
     <w:p>
@@ -915,7 +955,15 @@
         <w:jc w:val="both"/>
       </w:pPr>
       <w:r>
-        <w:t xml:space="preserve">Select any already created table as data source, So select </w:t>
+        <w:t xml:space="preserve">Select any already created table as data source, </w:t>
+      </w:r>
+      <w:proofErr w:type="gramStart"/>
+      <w:r>
+        <w:t>So</w:t>
+      </w:r>
+      <w:proofErr w:type="gramEnd"/>
+      <w:r>
+        <w:t xml:space="preserve"> select </w:t>
       </w:r>
       <w:proofErr w:type="spellStart"/>
       <w:r>
@@ -1227,88 +1275,615 @@
               <w:spacing w:line="240" w:lineRule="auto"/>
               <w:jc w:val="both"/>
             </w:pPr>
-            <w:r>
-              <w:t>RecordNumber,Zipcode,ZipCodeType,City,State,LocationType,Lat,Long,Xaxis,Yaxis,Zaxis,WorldRegion,Country,LocationText,Location,Decommisioned,TaxReturnsFiled,EstimatedPopulation,TotalWages,Notes</w:t>
-            </w:r>
-          </w:p>
-          <w:p>
-            <w:pPr>
-              <w:widowControl w:val="0"/>
-              <w:spacing w:line="240" w:lineRule="auto"/>
-              <w:jc w:val="both"/>
-            </w:pPr>
-            <w:r>
-              <w:t>1,704,STANDARD,PARC PARQUE,PR,NOT ACCEPTABLE,17.96,-66.22,0.38,-0.87,0.3,NA,US,"Parc Parque, PR",NA-US-PR-PARC PARQUE,FALSE,,,,</w:t>
-            </w:r>
-          </w:p>
-          <w:p>
-            <w:pPr>
-              <w:widowControl w:val="0"/>
-              <w:spacing w:line="240" w:lineRule="auto"/>
-              <w:jc w:val="both"/>
-            </w:pPr>
-            <w:r>
-              <w:t>2,704,STANDARD,PASEO COSTA DEL SUR,PR,NOT ACCEPTABLE,17.96,-66.22,0.38,-0.87,0.3,NA,US,"Paseo Costa Del Sur, PR",NA-US-PR-PASEO COSTA DEL SUR,FALSE,,,,</w:t>
-            </w:r>
-          </w:p>
-          <w:p>
-            <w:pPr>
-              <w:widowControl w:val="0"/>
-              <w:spacing w:line="240" w:lineRule="auto"/>
-              <w:jc w:val="both"/>
-            </w:pPr>
-            <w:r>
-              <w:t>10,709,STANDARD,BDA SAN LUIS,PR,NOT ACCEPTABLE,18.14,-66.26,0.38,-0.86,0.31,NA,US,"Bda San Luis, PR",NA-US-PR-BDA SAN LUIS,FALSE,,,,</w:t>
-            </w:r>
-          </w:p>
-          <w:p>
-            <w:pPr>
-              <w:widowControl w:val="0"/>
-              <w:spacing w:line="240" w:lineRule="auto"/>
-              <w:jc w:val="both"/>
-            </w:pPr>
-            <w:r>
-              <w:t>61391,76166,UNIQUE,CINGULAR WIRELESS,TX,NOT ACCEPTABLE,32.72,-97.31,-0.1,-0.83,0.54,NA,US,"Cingular Wireless, TX",NA-US-TX-CINGULAR WIRELESS,FALSE,,,,</w:t>
-            </w:r>
-          </w:p>
-          <w:p>
-            <w:pPr>
-              <w:widowControl w:val="0"/>
-              <w:spacing w:line="240" w:lineRule="auto"/>
-              <w:jc w:val="both"/>
-            </w:pPr>
-            <w:r>
-              <w:t>61392,76177,STANDARD,FORT WORTH,TX,PRIMARY,32.75,-97.33,-0.1,-0.83,0.54,NA,US,"Fort Worth, TX",NA-US-TX-FORT WORTH,FALSE,2126,4053,122396986,</w:t>
-            </w:r>
-          </w:p>
-          <w:p>
-            <w:pPr>
-              <w:widowControl w:val="0"/>
-              <w:spacing w:line="240" w:lineRule="auto"/>
-              <w:jc w:val="both"/>
-            </w:pPr>
-            <w:r>
-              <w:t>61393,76177,STANDARD,FT WORTH,TX,ACCEPTABLE,32.75,-97.33,-0.1,-0.83,0.54,NA,US,"Ft Worth, TX",NA-US-TX-FT WORTH,FALSE,2126,4053,122396986,</w:t>
-            </w:r>
-          </w:p>
-          <w:p>
-            <w:pPr>
-              <w:widowControl w:val="0"/>
-              <w:spacing w:line="240" w:lineRule="auto"/>
-              <w:jc w:val="both"/>
-            </w:pPr>
-            <w:r>
-              <w:t>4,704,STANDARD,URB EUGENE RICE,PR,NOT ACCEPTABLE,17.96,-66.22,0.38,-0.87,0.3,NA,US,"Urb Eugene Rice, PR",NA-US-PR-URB EUGENE RICE,FALSE,,,,</w:t>
-            </w:r>
-          </w:p>
-          <w:p>
-            <w:pPr>
-              <w:widowControl w:val="0"/>
-              <w:spacing w:line="240" w:lineRule="auto"/>
-              <w:jc w:val="both"/>
-            </w:pPr>
-            <w:r>
-              <w:t>39827,85209,STANDARD,MESA,AZ,PRIMARY,33.37,-111.64,-0.3,-0.77,0.55,NA,US,"Mesa, AZ",NA-US-AZ-MESA,FALSE,14962,26883,563792730,"no NWS data, "</w:t>
+            <w:proofErr w:type="gramStart"/>
+            <w:r>
+              <w:t>RecordNumber,Zipcode</w:t>
+            </w:r>
+            <w:proofErr w:type="gramEnd"/>
+            <w:r>
+              <w:t>,</w:t>
+            </w:r>
+            <w:proofErr w:type="gramStart"/>
+            <w:r>
+              <w:t>ZipCodeType,City</w:t>
+            </w:r>
+            <w:proofErr w:type="gramEnd"/>
+            <w:r>
+              <w:t>,</w:t>
+            </w:r>
+            <w:proofErr w:type="gramStart"/>
+            <w:r>
+              <w:t>State,LocationType</w:t>
+            </w:r>
+            <w:proofErr w:type="gramEnd"/>
+            <w:r>
+              <w:t>,</w:t>
+            </w:r>
+            <w:proofErr w:type="gramStart"/>
+            <w:r>
+              <w:t>Lat,Long</w:t>
+            </w:r>
+            <w:proofErr w:type="gramEnd"/>
+            <w:r>
+              <w:t>,</w:t>
+            </w:r>
+            <w:proofErr w:type="gramStart"/>
+            <w:r>
+              <w:t>Xaxis,Yaxis</w:t>
+            </w:r>
+            <w:proofErr w:type="gramEnd"/>
+            <w:r>
+              <w:t>,</w:t>
+            </w:r>
+            <w:proofErr w:type="gramStart"/>
+            <w:r>
+              <w:t>Zaxis,WorldRegion</w:t>
+            </w:r>
+            <w:proofErr w:type="gramEnd"/>
+            <w:r>
+              <w:t>,</w:t>
+            </w:r>
+            <w:proofErr w:type="gramStart"/>
+            <w:r>
+              <w:t>Country,LocationText</w:t>
+            </w:r>
+            <w:proofErr w:type="gramEnd"/>
+            <w:r>
+              <w:t>,</w:t>
+            </w:r>
+            <w:proofErr w:type="gramStart"/>
+            <w:r>
+              <w:t>Location,Decommisioned</w:t>
+            </w:r>
+            <w:proofErr w:type="gramEnd"/>
+            <w:r>
+              <w:t>,</w:t>
+            </w:r>
+            <w:proofErr w:type="gramStart"/>
+            <w:r>
+              <w:t>TaxReturnsFiled,EstimatedPopulation</w:t>
+            </w:r>
+            <w:proofErr w:type="gramEnd"/>
+            <w:r>
+              <w:t>,</w:t>
+            </w:r>
+            <w:proofErr w:type="gramStart"/>
+            <w:r>
+              <w:t>TotalWages,Notes</w:t>
+            </w:r>
+            <w:proofErr w:type="gramEnd"/>
+          </w:p>
+          <w:p>
+            <w:pPr>
+              <w:widowControl w:val="0"/>
+              <w:spacing w:line="240" w:lineRule="auto"/>
+              <w:jc w:val="both"/>
+            </w:pPr>
+            <w:proofErr w:type="gramStart"/>
+            <w:r>
+              <w:t>1,704,STANDARD</w:t>
+            </w:r>
+            <w:proofErr w:type="gramEnd"/>
+            <w:r>
+              <w:t xml:space="preserve">,PARC </w:t>
+            </w:r>
+            <w:proofErr w:type="gramStart"/>
+            <w:r>
+              <w:t>PARQUE,PR</w:t>
+            </w:r>
+            <w:proofErr w:type="gramEnd"/>
+            <w:r>
+              <w:t>,NOT ACCEPTABLE,17.</w:t>
+            </w:r>
+            <w:proofErr w:type="gramStart"/>
+            <w:r>
+              <w:t>96,-</w:t>
+            </w:r>
+            <w:proofErr w:type="gramEnd"/>
+            <w:r>
+              <w:t>66.22,0.</w:t>
+            </w:r>
+            <w:proofErr w:type="gramStart"/>
+            <w:r>
+              <w:t>38,-</w:t>
+            </w:r>
+            <w:proofErr w:type="gramEnd"/>
+            <w:r>
+              <w:t>0.87,0.</w:t>
+            </w:r>
+            <w:proofErr w:type="gramStart"/>
+            <w:r>
+              <w:t>3,NA</w:t>
+            </w:r>
+            <w:proofErr w:type="gramEnd"/>
+            <w:r>
+              <w:t>,US,"Parc Parque, PR</w:t>
+            </w:r>
+            <w:proofErr w:type="gramStart"/>
+            <w:r>
+              <w:t>",NA</w:t>
+            </w:r>
+            <w:proofErr w:type="gramEnd"/>
+            <w:r>
+              <w:t xml:space="preserve">-US-PR-PARC </w:t>
+            </w:r>
+            <w:proofErr w:type="gramStart"/>
+            <w:r>
+              <w:t>PARQUE,FALSE,,,,</w:t>
+            </w:r>
+            <w:proofErr w:type="gramEnd"/>
+          </w:p>
+          <w:p>
+            <w:pPr>
+              <w:widowControl w:val="0"/>
+              <w:spacing w:line="240" w:lineRule="auto"/>
+              <w:jc w:val="both"/>
+            </w:pPr>
+            <w:proofErr w:type="gramStart"/>
+            <w:r>
+              <w:t>2,704,STANDARD</w:t>
+            </w:r>
+            <w:proofErr w:type="gramEnd"/>
+            <w:r>
+              <w:t xml:space="preserve">,PASEO COSTA DEL </w:t>
+            </w:r>
+            <w:proofErr w:type="gramStart"/>
+            <w:r>
+              <w:t>SUR,PR</w:t>
+            </w:r>
+            <w:proofErr w:type="gramEnd"/>
+            <w:r>
+              <w:t>,NOT ACCEPTABLE,17.</w:t>
+            </w:r>
+            <w:proofErr w:type="gramStart"/>
+            <w:r>
+              <w:t>96,-</w:t>
+            </w:r>
+            <w:proofErr w:type="gramEnd"/>
+            <w:r>
+              <w:t>66.22,0.</w:t>
+            </w:r>
+            <w:proofErr w:type="gramStart"/>
+            <w:r>
+              <w:t>38,-</w:t>
+            </w:r>
+            <w:proofErr w:type="gramEnd"/>
+            <w:r>
+              <w:t>0.87,0.</w:t>
+            </w:r>
+            <w:proofErr w:type="gramStart"/>
+            <w:r>
+              <w:t>3,NA</w:t>
+            </w:r>
+            <w:proofErr w:type="gramEnd"/>
+            <w:r>
+              <w:t>,US,"Paseo Costa Del Sur, PR</w:t>
+            </w:r>
+            <w:proofErr w:type="gramStart"/>
+            <w:r>
+              <w:t>",NA</w:t>
+            </w:r>
+            <w:proofErr w:type="gramEnd"/>
+            <w:r>
+              <w:t xml:space="preserve">-US-PR-PASEO COSTA DEL </w:t>
+            </w:r>
+            <w:proofErr w:type="gramStart"/>
+            <w:r>
+              <w:t>SUR,FALSE,,,,</w:t>
+            </w:r>
+            <w:proofErr w:type="gramEnd"/>
+          </w:p>
+          <w:p>
+            <w:pPr>
+              <w:widowControl w:val="0"/>
+              <w:spacing w:line="240" w:lineRule="auto"/>
+              <w:jc w:val="both"/>
+            </w:pPr>
+            <w:proofErr w:type="gramStart"/>
+            <w:r>
+              <w:t>10,709,STANDARD</w:t>
+            </w:r>
+            <w:proofErr w:type="gramEnd"/>
+            <w:r>
+              <w:t xml:space="preserve">,BDA SAN </w:t>
+            </w:r>
+            <w:proofErr w:type="gramStart"/>
+            <w:r>
+              <w:t>LUIS,PR</w:t>
+            </w:r>
+            <w:proofErr w:type="gramEnd"/>
+            <w:r>
+              <w:t>,NOT ACCEPTABLE,18.</w:t>
+            </w:r>
+            <w:proofErr w:type="gramStart"/>
+            <w:r>
+              <w:t>14,-</w:t>
+            </w:r>
+            <w:proofErr w:type="gramEnd"/>
+            <w:r>
+              <w:t>66.26,0.</w:t>
+            </w:r>
+            <w:proofErr w:type="gramStart"/>
+            <w:r>
+              <w:t>38,-</w:t>
+            </w:r>
+            <w:proofErr w:type="gramEnd"/>
+            <w:r>
+              <w:t>0.86,0.</w:t>
+            </w:r>
+            <w:proofErr w:type="gramStart"/>
+            <w:r>
+              <w:t>31,NA</w:t>
+            </w:r>
+            <w:proofErr w:type="gramEnd"/>
+            <w:r>
+              <w:t>,US,"Bda San Luis, PR</w:t>
+            </w:r>
+            <w:proofErr w:type="gramStart"/>
+            <w:r>
+              <w:t>",NA</w:t>
+            </w:r>
+            <w:proofErr w:type="gramEnd"/>
+            <w:r>
+              <w:t xml:space="preserve">-US-PR-BDA SAN </w:t>
+            </w:r>
+            <w:proofErr w:type="gramStart"/>
+            <w:r>
+              <w:t>LUIS,FALSE,,,,</w:t>
+            </w:r>
+            <w:proofErr w:type="gramEnd"/>
+          </w:p>
+          <w:p>
+            <w:pPr>
+              <w:widowControl w:val="0"/>
+              <w:spacing w:line="240" w:lineRule="auto"/>
+              <w:jc w:val="both"/>
+            </w:pPr>
+            <w:r>
+              <w:t>61391,</w:t>
+            </w:r>
+            <w:proofErr w:type="gramStart"/>
+            <w:r>
+              <w:t>76166,UNIQUE</w:t>
+            </w:r>
+            <w:proofErr w:type="gramEnd"/>
+            <w:r>
+              <w:t xml:space="preserve">,CINGULAR </w:t>
+            </w:r>
+            <w:proofErr w:type="gramStart"/>
+            <w:r>
+              <w:t>WIRELESS,TX</w:t>
+            </w:r>
+            <w:proofErr w:type="gramEnd"/>
+            <w:r>
+              <w:t>,NOT ACCEPTABLE,32.</w:t>
+            </w:r>
+            <w:proofErr w:type="gramStart"/>
+            <w:r>
+              <w:t>72,-</w:t>
+            </w:r>
+            <w:proofErr w:type="gramEnd"/>
+            <w:r>
+              <w:t>97.</w:t>
+            </w:r>
+            <w:proofErr w:type="gramStart"/>
+            <w:r>
+              <w:t>31,-</w:t>
+            </w:r>
+            <w:proofErr w:type="gramEnd"/>
+            <w:r>
+              <w:t>0.</w:t>
+            </w:r>
+            <w:proofErr w:type="gramStart"/>
+            <w:r>
+              <w:t>1,-</w:t>
+            </w:r>
+            <w:proofErr w:type="gramEnd"/>
+            <w:r>
+              <w:t>0.83,0.</w:t>
+            </w:r>
+            <w:proofErr w:type="gramStart"/>
+            <w:r>
+              <w:t>54,NA</w:t>
+            </w:r>
+            <w:proofErr w:type="gramEnd"/>
+            <w:r>
+              <w:t>,US,"Cingular Wireless, TX</w:t>
+            </w:r>
+            <w:proofErr w:type="gramStart"/>
+            <w:r>
+              <w:t>",NA</w:t>
+            </w:r>
+            <w:proofErr w:type="gramEnd"/>
+            <w:r>
+              <w:t xml:space="preserve">-US-TX-CINGULAR </w:t>
+            </w:r>
+            <w:proofErr w:type="gramStart"/>
+            <w:r>
+              <w:t>WIRELESS,FALSE,,,,</w:t>
+            </w:r>
+            <w:proofErr w:type="gramEnd"/>
+          </w:p>
+          <w:p>
+            <w:pPr>
+              <w:widowControl w:val="0"/>
+              <w:spacing w:line="240" w:lineRule="auto"/>
+              <w:jc w:val="both"/>
+            </w:pPr>
+            <w:r>
+              <w:t>61392,</w:t>
+            </w:r>
+            <w:proofErr w:type="gramStart"/>
+            <w:r>
+              <w:t>76177,STANDARD</w:t>
+            </w:r>
+            <w:proofErr w:type="gramEnd"/>
+            <w:r>
+              <w:t xml:space="preserve">,FORT </w:t>
+            </w:r>
+            <w:proofErr w:type="gramStart"/>
+            <w:r>
+              <w:t>WORTH,TX</w:t>
+            </w:r>
+            <w:proofErr w:type="gramEnd"/>
+            <w:r>
+              <w:t>,PRIMARY,32.</w:t>
+            </w:r>
+            <w:proofErr w:type="gramStart"/>
+            <w:r>
+              <w:t>75,-</w:t>
+            </w:r>
+            <w:proofErr w:type="gramEnd"/>
+            <w:r>
+              <w:t>97.</w:t>
+            </w:r>
+            <w:proofErr w:type="gramStart"/>
+            <w:r>
+              <w:t>33,-</w:t>
+            </w:r>
+            <w:proofErr w:type="gramEnd"/>
+            <w:r>
+              <w:t>0.</w:t>
+            </w:r>
+            <w:proofErr w:type="gramStart"/>
+            <w:r>
+              <w:t>1,-</w:t>
+            </w:r>
+            <w:proofErr w:type="gramEnd"/>
+            <w:r>
+              <w:t>0.83,0.</w:t>
+            </w:r>
+            <w:proofErr w:type="gramStart"/>
+            <w:r>
+              <w:t>54,NA</w:t>
+            </w:r>
+            <w:proofErr w:type="gramEnd"/>
+            <w:r>
+              <w:t>,US,"Fort Worth, TX</w:t>
+            </w:r>
+            <w:proofErr w:type="gramStart"/>
+            <w:r>
+              <w:t>",NA</w:t>
+            </w:r>
+            <w:proofErr w:type="gramEnd"/>
+            <w:r>
+              <w:t xml:space="preserve">-US-TX-FORT </w:t>
+            </w:r>
+            <w:proofErr w:type="gramStart"/>
+            <w:r>
+              <w:t>WORTH,FALSE</w:t>
+            </w:r>
+            <w:proofErr w:type="gramEnd"/>
+            <w:r>
+              <w:t>,2126,4053,122396986,</w:t>
+            </w:r>
+          </w:p>
+          <w:p>
+            <w:pPr>
+              <w:widowControl w:val="0"/>
+              <w:spacing w:line="240" w:lineRule="auto"/>
+              <w:jc w:val="both"/>
+            </w:pPr>
+            <w:r>
+              <w:t>61393,</w:t>
+            </w:r>
+            <w:proofErr w:type="gramStart"/>
+            <w:r>
+              <w:t>76177,STANDARD</w:t>
+            </w:r>
+            <w:proofErr w:type="gramEnd"/>
+            <w:r>
+              <w:t xml:space="preserve">,FT </w:t>
+            </w:r>
+            <w:proofErr w:type="gramStart"/>
+            <w:r>
+              <w:t>WORTH,TX</w:t>
+            </w:r>
+            <w:proofErr w:type="gramEnd"/>
+            <w:r>
+              <w:t>,ACCEPTABLE,32.</w:t>
+            </w:r>
+            <w:proofErr w:type="gramStart"/>
+            <w:r>
+              <w:t>75,-</w:t>
+            </w:r>
+            <w:proofErr w:type="gramEnd"/>
+            <w:r>
+              <w:t>97.</w:t>
+            </w:r>
+            <w:proofErr w:type="gramStart"/>
+            <w:r>
+              <w:t>33,-</w:t>
+            </w:r>
+            <w:proofErr w:type="gramEnd"/>
+            <w:r>
+              <w:t>0.</w:t>
+            </w:r>
+            <w:proofErr w:type="gramStart"/>
+            <w:r>
+              <w:t>1,-</w:t>
+            </w:r>
+            <w:proofErr w:type="gramEnd"/>
+            <w:r>
+              <w:t>0.83,0.</w:t>
+            </w:r>
+            <w:proofErr w:type="gramStart"/>
+            <w:r>
+              <w:t>54,NA</w:t>
+            </w:r>
+            <w:proofErr w:type="gramEnd"/>
+            <w:r>
+              <w:t>,US,"Ft Worth, TX</w:t>
+            </w:r>
+            <w:proofErr w:type="gramStart"/>
+            <w:r>
+              <w:t>",NA</w:t>
+            </w:r>
+            <w:proofErr w:type="gramEnd"/>
+            <w:r>
+              <w:t xml:space="preserve">-US-TX-FT </w:t>
+            </w:r>
+            <w:proofErr w:type="gramStart"/>
+            <w:r>
+              <w:t>WORTH,FALSE</w:t>
+            </w:r>
+            <w:proofErr w:type="gramEnd"/>
+            <w:r>
+              <w:t>,2126,4053,122396986,</w:t>
+            </w:r>
+          </w:p>
+          <w:p>
+            <w:pPr>
+              <w:widowControl w:val="0"/>
+              <w:spacing w:line="240" w:lineRule="auto"/>
+              <w:jc w:val="both"/>
+            </w:pPr>
+            <w:proofErr w:type="gramStart"/>
+            <w:r>
+              <w:t>4,704,STANDARD</w:t>
+            </w:r>
+            <w:proofErr w:type="gramEnd"/>
+            <w:r>
+              <w:t xml:space="preserve">,URB EUGENE </w:t>
+            </w:r>
+            <w:proofErr w:type="gramStart"/>
+            <w:r>
+              <w:t>RICE,PR</w:t>
+            </w:r>
+            <w:proofErr w:type="gramEnd"/>
+            <w:r>
+              <w:t>,NOT ACCEPTABLE,17.</w:t>
+            </w:r>
+            <w:proofErr w:type="gramStart"/>
+            <w:r>
+              <w:t>96,-</w:t>
+            </w:r>
+            <w:proofErr w:type="gramEnd"/>
+            <w:r>
+              <w:t>66.22,0.</w:t>
+            </w:r>
+            <w:proofErr w:type="gramStart"/>
+            <w:r>
+              <w:t>38,-</w:t>
+            </w:r>
+            <w:proofErr w:type="gramEnd"/>
+            <w:r>
+              <w:t>0.87,0.</w:t>
+            </w:r>
+            <w:proofErr w:type="gramStart"/>
+            <w:r>
+              <w:t>3,NA</w:t>
+            </w:r>
+            <w:proofErr w:type="gramEnd"/>
+            <w:r>
+              <w:t>,US,"Urb Eugene Rice, PR</w:t>
+            </w:r>
+            <w:proofErr w:type="gramStart"/>
+            <w:r>
+              <w:t>",NA</w:t>
+            </w:r>
+            <w:proofErr w:type="gramEnd"/>
+            <w:r>
+              <w:t xml:space="preserve">-US-PR-URB EUGENE </w:t>
+            </w:r>
+            <w:proofErr w:type="gramStart"/>
+            <w:r>
+              <w:t>RICE,FALSE,,,,</w:t>
+            </w:r>
+            <w:proofErr w:type="gramEnd"/>
+          </w:p>
+          <w:p>
+            <w:pPr>
+              <w:widowControl w:val="0"/>
+              <w:spacing w:line="240" w:lineRule="auto"/>
+              <w:jc w:val="both"/>
+            </w:pPr>
+            <w:r>
+              <w:t>39827,</w:t>
+            </w:r>
+            <w:proofErr w:type="gramStart"/>
+            <w:r>
+              <w:t>85209,STANDARD</w:t>
+            </w:r>
+            <w:proofErr w:type="gramEnd"/>
+            <w:r>
+              <w:t>,</w:t>
+            </w:r>
+            <w:proofErr w:type="gramStart"/>
+            <w:r>
+              <w:t>MESA,AZ</w:t>
+            </w:r>
+            <w:proofErr w:type="gramEnd"/>
+            <w:r>
+              <w:t>,PRIMARY,33.</w:t>
+            </w:r>
+            <w:proofErr w:type="gramStart"/>
+            <w:r>
+              <w:t>37,-</w:t>
+            </w:r>
+            <w:proofErr w:type="gramEnd"/>
+            <w:r>
+              <w:t>111.</w:t>
+            </w:r>
+            <w:proofErr w:type="gramStart"/>
+            <w:r>
+              <w:t>64,-</w:t>
+            </w:r>
+            <w:proofErr w:type="gramEnd"/>
+            <w:r>
+              <w:t>0.</w:t>
+            </w:r>
+            <w:proofErr w:type="gramStart"/>
+            <w:r>
+              <w:t>3,-</w:t>
+            </w:r>
+            <w:proofErr w:type="gramEnd"/>
+            <w:r>
+              <w:t>0.77,0.</w:t>
+            </w:r>
+            <w:proofErr w:type="gramStart"/>
+            <w:r>
+              <w:t>55,NA</w:t>
+            </w:r>
+            <w:proofErr w:type="gramEnd"/>
+            <w:r>
+              <w:t>,US,"Mesa, AZ</w:t>
+            </w:r>
+            <w:proofErr w:type="gramStart"/>
+            <w:r>
+              <w:t>",NA</w:t>
+            </w:r>
+            <w:proofErr w:type="gramEnd"/>
+            <w:r>
+              <w:t>-US-AZ-</w:t>
+            </w:r>
+            <w:proofErr w:type="gramStart"/>
+            <w:r>
+              <w:t>MESA,FALSE</w:t>
+            </w:r>
+            <w:proofErr w:type="gramEnd"/>
+            <w:r>
+              <w:t>,14962,26883,563792730,"no NWS data, "</w:t>
             </w:r>
           </w:p>
           <w:p>
@@ -1319,67 +1894,452 @@
             </w:pPr>
             <w:r>
               <w:lastRenderedPageBreak/>
-              <w:t>39828,85210,STANDARD,MESA,AZ,PRIMARY,33.38,-111.84,-0.31,-0.77,0.55,NA,US,"Mesa, AZ",NA-US-AZ-MESA,FALSE,14374,25446,471000465,</w:t>
-            </w:r>
-          </w:p>
-          <w:p>
-            <w:pPr>
-              <w:widowControl w:val="0"/>
-              <w:spacing w:line="240" w:lineRule="auto"/>
-              <w:jc w:val="both"/>
-            </w:pPr>
-            <w:r>
-              <w:t>49345,32046,STANDARD,HILLIARD,FL,PRIMARY,30.69,-81.92,0.12,-0.85,0.51,NA,US,"Hilliard, FL",NA-US-FL-HILLIARD,FALSE,3922,7443,133112149,</w:t>
-            </w:r>
-          </w:p>
-          <w:p>
-            <w:pPr>
-              <w:widowControl w:val="0"/>
-              <w:spacing w:line="240" w:lineRule="auto"/>
-              <w:jc w:val="both"/>
-            </w:pPr>
-            <w:r>
-              <w:t>49346,34445,PO BOX,HOLDER,FL,PRIMARY,28.96,-82.41,0.11,-0.86,0.48,NA,US,"Holder, FL",NA-US-FL-HOLDER,FALSE,,,,</w:t>
-            </w:r>
-          </w:p>
-          <w:p>
-            <w:pPr>
-              <w:widowControl w:val="0"/>
-              <w:spacing w:line="240" w:lineRule="auto"/>
-              <w:jc w:val="both"/>
-            </w:pPr>
-            <w:r>
-              <w:t>49347,32564,STANDARD,HOLT,FL,PRIMARY,30.72,-86.67,0.04,-0.85,0.51,NA,US,"Holt, FL",NA-US-FL-HOLT,FALSE,1207,2190,36395913,</w:t>
-            </w:r>
-          </w:p>
-          <w:p>
-            <w:pPr>
-              <w:widowControl w:val="0"/>
-              <w:spacing w:line="240" w:lineRule="auto"/>
-              <w:jc w:val="both"/>
-            </w:pPr>
-            <w:r>
-              <w:t>49348,34487,PO BOX,HOMOSASSA,FL,PRIMARY,28.78,-82.61,0.11,-0.86,0.48,NA,US,"Homosassa, FL",NA-US-FL-HOMOSASSA,FALSE,,,,</w:t>
-            </w:r>
-          </w:p>
-          <w:p>
-            <w:pPr>
-              <w:widowControl w:val="0"/>
-              <w:spacing w:line="240" w:lineRule="auto"/>
-              <w:jc w:val="both"/>
-            </w:pPr>
-            <w:r>
-              <w:t>10,708,STANDARD,BDA SAN LUIS,PR,NOT ACCEPTABLE,18.14,-66.26,0.38,-0.86,0.31,NA,US,"Bda San Luis, PR",NA-US-PR-BDA SAN LUIS,FALSE,,,,</w:t>
-            </w:r>
-          </w:p>
-          <w:p>
-            <w:pPr>
-              <w:widowControl w:val="0"/>
-              <w:spacing w:line="240" w:lineRule="auto"/>
-              <w:jc w:val="both"/>
-            </w:pPr>
-            <w:r>
-              <w:t xml:space="preserve">3,704,STANDARD,SECT LANAUSSE,PR,NOT ACCEPTABLE,17.96,-66.22,0.38,-0.87,0.3,NA,US,"Sect </w:t>
+              <w:t>39828,</w:t>
+            </w:r>
+            <w:proofErr w:type="gramStart"/>
+            <w:r>
+              <w:t>85210,STANDARD</w:t>
+            </w:r>
+            <w:proofErr w:type="gramEnd"/>
+            <w:r>
+              <w:t>,</w:t>
+            </w:r>
+            <w:proofErr w:type="gramStart"/>
+            <w:r>
+              <w:t>MESA,AZ</w:t>
+            </w:r>
+            <w:proofErr w:type="gramEnd"/>
+            <w:r>
+              <w:t>,PRIMARY,33.</w:t>
+            </w:r>
+            <w:proofErr w:type="gramStart"/>
+            <w:r>
+              <w:t>38,-</w:t>
+            </w:r>
+            <w:proofErr w:type="gramEnd"/>
+            <w:r>
+              <w:t>111.</w:t>
+            </w:r>
+            <w:proofErr w:type="gramStart"/>
+            <w:r>
+              <w:t>84,-</w:t>
+            </w:r>
+            <w:proofErr w:type="gramEnd"/>
+            <w:r>
+              <w:t>0.</w:t>
+            </w:r>
+            <w:proofErr w:type="gramStart"/>
+            <w:r>
+              <w:t>31,-</w:t>
+            </w:r>
+            <w:proofErr w:type="gramEnd"/>
+            <w:r>
+              <w:t>0.77,0.</w:t>
+            </w:r>
+            <w:proofErr w:type="gramStart"/>
+            <w:r>
+              <w:t>55,NA</w:t>
+            </w:r>
+            <w:proofErr w:type="gramEnd"/>
+            <w:r>
+              <w:t>,US,"Mesa, AZ</w:t>
+            </w:r>
+            <w:proofErr w:type="gramStart"/>
+            <w:r>
+              <w:t>",NA</w:t>
+            </w:r>
+            <w:proofErr w:type="gramEnd"/>
+            <w:r>
+              <w:t>-US-AZ-</w:t>
+            </w:r>
+            <w:proofErr w:type="gramStart"/>
+            <w:r>
+              <w:t>MESA,FALSE</w:t>
+            </w:r>
+            <w:proofErr w:type="gramEnd"/>
+            <w:r>
+              <w:t>,14374,25446,471000465,</w:t>
+            </w:r>
+          </w:p>
+          <w:p>
+            <w:pPr>
+              <w:widowControl w:val="0"/>
+              <w:spacing w:line="240" w:lineRule="auto"/>
+              <w:jc w:val="both"/>
+            </w:pPr>
+            <w:r>
+              <w:t>49345,</w:t>
+            </w:r>
+            <w:proofErr w:type="gramStart"/>
+            <w:r>
+              <w:t>32046,STANDARD</w:t>
+            </w:r>
+            <w:proofErr w:type="gramEnd"/>
+            <w:r>
+              <w:t>,</w:t>
+            </w:r>
+            <w:proofErr w:type="gramStart"/>
+            <w:r>
+              <w:t>HILLIARD,FL</w:t>
+            </w:r>
+            <w:proofErr w:type="gramEnd"/>
+            <w:r>
+              <w:t>,PRIMARY,30.</w:t>
+            </w:r>
+            <w:proofErr w:type="gramStart"/>
+            <w:r>
+              <w:t>69,-</w:t>
+            </w:r>
+            <w:proofErr w:type="gramEnd"/>
+            <w:r>
+              <w:t>81.92,0.</w:t>
+            </w:r>
+            <w:proofErr w:type="gramStart"/>
+            <w:r>
+              <w:t>12,-</w:t>
+            </w:r>
+            <w:proofErr w:type="gramEnd"/>
+            <w:r>
+              <w:t>0.85,0.</w:t>
+            </w:r>
+            <w:proofErr w:type="gramStart"/>
+            <w:r>
+              <w:t>51,NA</w:t>
+            </w:r>
+            <w:proofErr w:type="gramEnd"/>
+            <w:r>
+              <w:t>,US,"Hilliard, FL</w:t>
+            </w:r>
+            <w:proofErr w:type="gramStart"/>
+            <w:r>
+              <w:t>",NA</w:t>
+            </w:r>
+            <w:proofErr w:type="gramEnd"/>
+            <w:r>
+              <w:t>-US-FL-</w:t>
+            </w:r>
+            <w:proofErr w:type="gramStart"/>
+            <w:r>
+              <w:t>HILLIARD,FALSE</w:t>
+            </w:r>
+            <w:proofErr w:type="gramEnd"/>
+            <w:r>
+              <w:t>,3922,7443,133112149,</w:t>
+            </w:r>
+          </w:p>
+          <w:p>
+            <w:pPr>
+              <w:widowControl w:val="0"/>
+              <w:spacing w:line="240" w:lineRule="auto"/>
+              <w:jc w:val="both"/>
+            </w:pPr>
+            <w:r>
+              <w:t>49346,</w:t>
+            </w:r>
+            <w:proofErr w:type="gramStart"/>
+            <w:r>
+              <w:t>34445,PO</w:t>
+            </w:r>
+            <w:proofErr w:type="gramEnd"/>
+            <w:r>
+              <w:t xml:space="preserve"> </w:t>
+            </w:r>
+            <w:proofErr w:type="gramStart"/>
+            <w:r>
+              <w:t>BOX,HOLDER</w:t>
+            </w:r>
+            <w:proofErr w:type="gramEnd"/>
+            <w:r>
+              <w:t>,</w:t>
+            </w:r>
+            <w:proofErr w:type="gramStart"/>
+            <w:r>
+              <w:t>FL,PRIMARY</w:t>
+            </w:r>
+            <w:proofErr w:type="gramEnd"/>
+            <w:r>
+              <w:t>,28.</w:t>
+            </w:r>
+            <w:proofErr w:type="gramStart"/>
+            <w:r>
+              <w:t>96,-</w:t>
+            </w:r>
+            <w:proofErr w:type="gramEnd"/>
+            <w:r>
+              <w:t>82.41,0.</w:t>
+            </w:r>
+            <w:proofErr w:type="gramStart"/>
+            <w:r>
+              <w:t>11,-</w:t>
+            </w:r>
+            <w:proofErr w:type="gramEnd"/>
+            <w:r>
+              <w:t>0.86,0.</w:t>
+            </w:r>
+            <w:proofErr w:type="gramStart"/>
+            <w:r>
+              <w:t>48,NA</w:t>
+            </w:r>
+            <w:proofErr w:type="gramEnd"/>
+            <w:r>
+              <w:t>,US,"Holder, FL</w:t>
+            </w:r>
+            <w:proofErr w:type="gramStart"/>
+            <w:r>
+              <w:t>",NA</w:t>
+            </w:r>
+            <w:proofErr w:type="gramEnd"/>
+            <w:r>
+              <w:t>-US-FL-</w:t>
+            </w:r>
+            <w:proofErr w:type="gramStart"/>
+            <w:r>
+              <w:t>HOLDER,FALSE,,,,</w:t>
+            </w:r>
+            <w:proofErr w:type="gramEnd"/>
+          </w:p>
+          <w:p>
+            <w:pPr>
+              <w:widowControl w:val="0"/>
+              <w:spacing w:line="240" w:lineRule="auto"/>
+              <w:jc w:val="both"/>
+            </w:pPr>
+            <w:r>
+              <w:t>49347,</w:t>
+            </w:r>
+            <w:proofErr w:type="gramStart"/>
+            <w:r>
+              <w:t>32564,STANDARD</w:t>
+            </w:r>
+            <w:proofErr w:type="gramEnd"/>
+            <w:r>
+              <w:t>,</w:t>
+            </w:r>
+            <w:proofErr w:type="gramStart"/>
+            <w:r>
+              <w:t>HOLT,FL</w:t>
+            </w:r>
+            <w:proofErr w:type="gramEnd"/>
+            <w:r>
+              <w:t>,PRIMARY,30.</w:t>
+            </w:r>
+            <w:proofErr w:type="gramStart"/>
+            <w:r>
+              <w:t>72,-</w:t>
+            </w:r>
+            <w:proofErr w:type="gramEnd"/>
+            <w:r>
+              <w:t>86.67,0.</w:t>
+            </w:r>
+            <w:proofErr w:type="gramStart"/>
+            <w:r>
+              <w:t>04,-</w:t>
+            </w:r>
+            <w:proofErr w:type="gramEnd"/>
+            <w:r>
+              <w:t>0.85,0.</w:t>
+            </w:r>
+            <w:proofErr w:type="gramStart"/>
+            <w:r>
+              <w:t>51,NA</w:t>
+            </w:r>
+            <w:proofErr w:type="gramEnd"/>
+            <w:r>
+              <w:t>,US,"Holt, FL</w:t>
+            </w:r>
+            <w:proofErr w:type="gramStart"/>
+            <w:r>
+              <w:t>",NA</w:t>
+            </w:r>
+            <w:proofErr w:type="gramEnd"/>
+            <w:r>
+              <w:t>-US-FL-</w:t>
+            </w:r>
+            <w:proofErr w:type="gramStart"/>
+            <w:r>
+              <w:t>HOLT,FALSE</w:t>
+            </w:r>
+            <w:proofErr w:type="gramEnd"/>
+            <w:r>
+              <w:t>,1207,2190,36395913,</w:t>
+            </w:r>
+          </w:p>
+          <w:p>
+            <w:pPr>
+              <w:widowControl w:val="0"/>
+              <w:spacing w:line="240" w:lineRule="auto"/>
+              <w:jc w:val="both"/>
+            </w:pPr>
+            <w:r>
+              <w:t>49348,</w:t>
+            </w:r>
+            <w:proofErr w:type="gramStart"/>
+            <w:r>
+              <w:t>34487,PO</w:t>
+            </w:r>
+            <w:proofErr w:type="gramEnd"/>
+            <w:r>
+              <w:t xml:space="preserve"> </w:t>
+            </w:r>
+            <w:proofErr w:type="gramStart"/>
+            <w:r>
+              <w:t>BOX,HOMOSASSA</w:t>
+            </w:r>
+            <w:proofErr w:type="gramEnd"/>
+            <w:r>
+              <w:t>,</w:t>
+            </w:r>
+            <w:proofErr w:type="gramStart"/>
+            <w:r>
+              <w:t>FL,PRIMARY</w:t>
+            </w:r>
+            <w:proofErr w:type="gramEnd"/>
+            <w:r>
+              <w:t>,28.</w:t>
+            </w:r>
+            <w:proofErr w:type="gramStart"/>
+            <w:r>
+              <w:t>78,-</w:t>
+            </w:r>
+            <w:proofErr w:type="gramEnd"/>
+            <w:r>
+              <w:t>82.61,0.</w:t>
+            </w:r>
+            <w:proofErr w:type="gramStart"/>
+            <w:r>
+              <w:t>11,-</w:t>
+            </w:r>
+            <w:proofErr w:type="gramEnd"/>
+            <w:r>
+              <w:t>0.86,0.</w:t>
+            </w:r>
+            <w:proofErr w:type="gramStart"/>
+            <w:r>
+              <w:t>48,NA</w:t>
+            </w:r>
+            <w:proofErr w:type="gramEnd"/>
+            <w:r>
+              <w:t>,US,"Homosassa, FL</w:t>
+            </w:r>
+            <w:proofErr w:type="gramStart"/>
+            <w:r>
+              <w:t>",NA</w:t>
+            </w:r>
+            <w:proofErr w:type="gramEnd"/>
+            <w:r>
+              <w:t>-US-FL-</w:t>
+            </w:r>
+            <w:proofErr w:type="gramStart"/>
+            <w:r>
+              <w:t>HOMOSASSA,FALSE,,,,</w:t>
+            </w:r>
+            <w:proofErr w:type="gramEnd"/>
+          </w:p>
+          <w:p>
+            <w:pPr>
+              <w:widowControl w:val="0"/>
+              <w:spacing w:line="240" w:lineRule="auto"/>
+              <w:jc w:val="both"/>
+            </w:pPr>
+            <w:proofErr w:type="gramStart"/>
+            <w:r>
+              <w:t>10,708,STANDARD</w:t>
+            </w:r>
+            <w:proofErr w:type="gramEnd"/>
+            <w:r>
+              <w:t xml:space="preserve">,BDA SAN </w:t>
+            </w:r>
+            <w:proofErr w:type="gramStart"/>
+            <w:r>
+              <w:t>LUIS,PR</w:t>
+            </w:r>
+            <w:proofErr w:type="gramEnd"/>
+            <w:r>
+              <w:t>,NOT ACCEPTABLE,18.</w:t>
+            </w:r>
+            <w:proofErr w:type="gramStart"/>
+            <w:r>
+              <w:t>14,-</w:t>
+            </w:r>
+            <w:proofErr w:type="gramEnd"/>
+            <w:r>
+              <w:t>66.26,0.</w:t>
+            </w:r>
+            <w:proofErr w:type="gramStart"/>
+            <w:r>
+              <w:t>38,-</w:t>
+            </w:r>
+            <w:proofErr w:type="gramEnd"/>
+            <w:r>
+              <w:t>0.86,0.</w:t>
+            </w:r>
+            <w:proofErr w:type="gramStart"/>
+            <w:r>
+              <w:t>31,NA</w:t>
+            </w:r>
+            <w:proofErr w:type="gramEnd"/>
+            <w:r>
+              <w:t>,US,"Bda San Luis, PR</w:t>
+            </w:r>
+            <w:proofErr w:type="gramStart"/>
+            <w:r>
+              <w:t>",NA</w:t>
+            </w:r>
+            <w:proofErr w:type="gramEnd"/>
+            <w:r>
+              <w:t xml:space="preserve">-US-PR-BDA SAN </w:t>
+            </w:r>
+            <w:proofErr w:type="gramStart"/>
+            <w:r>
+              <w:t>LUIS,FALSE,,,,</w:t>
+            </w:r>
+            <w:proofErr w:type="gramEnd"/>
+          </w:p>
+          <w:p>
+            <w:pPr>
+              <w:widowControl w:val="0"/>
+              <w:spacing w:line="240" w:lineRule="auto"/>
+              <w:jc w:val="both"/>
+            </w:pPr>
+            <w:proofErr w:type="gramStart"/>
+            <w:r>
+              <w:t>3,704,STANDARD</w:t>
+            </w:r>
+            <w:proofErr w:type="gramEnd"/>
+            <w:r>
+              <w:t xml:space="preserve">,SECT </w:t>
+            </w:r>
+            <w:proofErr w:type="gramStart"/>
+            <w:r>
+              <w:t>LANAUSSE,PR</w:t>
+            </w:r>
+            <w:proofErr w:type="gramEnd"/>
+            <w:r>
+              <w:t>,NOT ACCEPTABLE,17.</w:t>
+            </w:r>
+            <w:proofErr w:type="gramStart"/>
+            <w:r>
+              <w:t>96,-</w:t>
+            </w:r>
+            <w:proofErr w:type="gramEnd"/>
+            <w:r>
+              <w:t>66.22,0.</w:t>
+            </w:r>
+            <w:proofErr w:type="gramStart"/>
+            <w:r>
+              <w:t>38,-</w:t>
+            </w:r>
+            <w:proofErr w:type="gramEnd"/>
+            <w:r>
+              <w:t>0.87,0.</w:t>
+            </w:r>
+            <w:proofErr w:type="gramStart"/>
+            <w:r>
+              <w:t>3,NA</w:t>
+            </w:r>
+            <w:proofErr w:type="gramEnd"/>
+            <w:r>
+              <w:t xml:space="preserve">,US,"Sect </w:t>
             </w:r>
             <w:proofErr w:type="spellStart"/>
             <w:r>
@@ -1387,67 +2347,429 @@
             </w:r>
             <w:proofErr w:type="spellEnd"/>
             <w:r>
-              <w:t>, PR",NA-US-PR-SECT LANAUSSE,FALSE,,,,</w:t>
-            </w:r>
-          </w:p>
-          <w:p>
-            <w:pPr>
-              <w:widowControl w:val="0"/>
-              <w:spacing w:line="240" w:lineRule="auto"/>
-              <w:jc w:val="both"/>
-            </w:pPr>
-            <w:r>
-              <w:t>54354,36275,PO BOX,SPRING GARDEN,AL,PRIMARY,33.97,-85.55,0.06,-0.82,0.55,NA,US,"Spring Garden, AL",NA-US-AL-SPRING GARDEN,FALSE,,,,</w:t>
-            </w:r>
-          </w:p>
-          <w:p>
-            <w:pPr>
-              <w:widowControl w:val="0"/>
-              <w:spacing w:line="240" w:lineRule="auto"/>
-              <w:jc w:val="both"/>
-            </w:pPr>
-            <w:r>
-              <w:t>54355,35146,STANDARD,SPRINGVILLE,AL,PRIMARY,33.77,-86.47,0.05,-0.82,0.55,NA,US,"Springville, AL",NA-US-AL-SPRINGVILLE,FALSE,4046,7845,172127599,</w:t>
-            </w:r>
-          </w:p>
-          <w:p>
-            <w:pPr>
-              <w:widowControl w:val="0"/>
-              <w:spacing w:line="240" w:lineRule="auto"/>
-              <w:jc w:val="both"/>
-            </w:pPr>
-            <w:r>
-              <w:t>54356,35585,STANDARD,SPRUCE PINE,AL,PRIMARY,34.37,-87.69,0.03,-0.82,0.56,NA,US,"Spruce Pine, AL",NA-US-AL-SPRUCE PINE,FALSE,610,1209,18525517,</w:t>
-            </w:r>
-          </w:p>
-          <w:p>
-            <w:pPr>
-              <w:widowControl w:val="0"/>
-              <w:spacing w:line="240" w:lineRule="auto"/>
-              <w:jc w:val="both"/>
-            </w:pPr>
-            <w:r>
-              <w:t>76511,27007,STANDARD,ASH HILL,NC,NOT ACCEPTABLE,36.4,-80.56,0.13,-0.79,0.59,NA,US,"Ash Hill, NC",NA-US-NC-ASH HILL,FALSE,842,1666,28876493,</w:t>
-            </w:r>
-          </w:p>
-          <w:p>
-            <w:pPr>
-              <w:widowControl w:val="0"/>
-              <w:spacing w:line="240" w:lineRule="auto"/>
-              <w:jc w:val="both"/>
-            </w:pPr>
-            <w:r>
-              <w:t>76512,27203,STANDARD,ASHEBORO,NC,PRIMARY,35.71,-79.81,0.14,-0.79,0.58,NA,US,"Asheboro, NC",NA-US-NC-ASHEBORO,FALSE,8355,15228,215474318,</w:t>
-            </w:r>
-          </w:p>
-          <w:p>
-            <w:pPr>
-              <w:widowControl w:val="0"/>
-              <w:spacing w:line="240" w:lineRule="auto"/>
-              <w:jc w:val="both"/>
-            </w:pPr>
-            <w:r>
-              <w:t>76513,27204,PO BOX,ASHEBORO,NC,PRIMARY,35.71,-79.81,0.14,-0.79,0.58,NA,US,"Asheboro, NC",NA-US-NC-ASHEBORO,FALSE,1035,1816,30322473,</w:t>
+              <w:t>, PR</w:t>
+            </w:r>
+            <w:proofErr w:type="gramStart"/>
+            <w:r>
+              <w:t>",NA</w:t>
+            </w:r>
+            <w:proofErr w:type="gramEnd"/>
+            <w:r>
+              <w:t xml:space="preserve">-US-PR-SECT </w:t>
+            </w:r>
+            <w:proofErr w:type="gramStart"/>
+            <w:r>
+              <w:t>LANAUSSE,FALSE,,,,</w:t>
+            </w:r>
+            <w:proofErr w:type="gramEnd"/>
+          </w:p>
+          <w:p>
+            <w:pPr>
+              <w:widowControl w:val="0"/>
+              <w:spacing w:line="240" w:lineRule="auto"/>
+              <w:jc w:val="both"/>
+            </w:pPr>
+            <w:r>
+              <w:t>54354,</w:t>
+            </w:r>
+            <w:proofErr w:type="gramStart"/>
+            <w:r>
+              <w:t>36275,PO</w:t>
+            </w:r>
+            <w:proofErr w:type="gramEnd"/>
+            <w:r>
+              <w:t xml:space="preserve"> </w:t>
+            </w:r>
+            <w:proofErr w:type="gramStart"/>
+            <w:r>
+              <w:t>BOX,SPRING</w:t>
+            </w:r>
+            <w:proofErr w:type="gramEnd"/>
+            <w:r>
+              <w:t xml:space="preserve"> </w:t>
+            </w:r>
+            <w:proofErr w:type="gramStart"/>
+            <w:r>
+              <w:t>GARDEN,AL</w:t>
+            </w:r>
+            <w:proofErr w:type="gramEnd"/>
+            <w:r>
+              <w:t>,PRIMARY,33.</w:t>
+            </w:r>
+            <w:proofErr w:type="gramStart"/>
+            <w:r>
+              <w:t>97,-</w:t>
+            </w:r>
+            <w:proofErr w:type="gramEnd"/>
+            <w:r>
+              <w:t>85.55,0.</w:t>
+            </w:r>
+            <w:proofErr w:type="gramStart"/>
+            <w:r>
+              <w:t>06,-</w:t>
+            </w:r>
+            <w:proofErr w:type="gramEnd"/>
+            <w:r>
+              <w:t>0.82,0.</w:t>
+            </w:r>
+            <w:proofErr w:type="gramStart"/>
+            <w:r>
+              <w:t>55,NA</w:t>
+            </w:r>
+            <w:proofErr w:type="gramEnd"/>
+            <w:r>
+              <w:t>,US,"Spring Garden, AL</w:t>
+            </w:r>
+            <w:proofErr w:type="gramStart"/>
+            <w:r>
+              <w:t>",NA</w:t>
+            </w:r>
+            <w:proofErr w:type="gramEnd"/>
+            <w:r>
+              <w:t xml:space="preserve">-US-AL-SPRING </w:t>
+            </w:r>
+            <w:proofErr w:type="gramStart"/>
+            <w:r>
+              <w:t>GARDEN,FALSE,,,,</w:t>
+            </w:r>
+            <w:proofErr w:type="gramEnd"/>
+          </w:p>
+          <w:p>
+            <w:pPr>
+              <w:widowControl w:val="0"/>
+              <w:spacing w:line="240" w:lineRule="auto"/>
+              <w:jc w:val="both"/>
+            </w:pPr>
+            <w:r>
+              <w:t>54355,</w:t>
+            </w:r>
+            <w:proofErr w:type="gramStart"/>
+            <w:r>
+              <w:t>35146,STANDARD</w:t>
+            </w:r>
+            <w:proofErr w:type="gramEnd"/>
+            <w:r>
+              <w:t>,</w:t>
+            </w:r>
+            <w:proofErr w:type="gramStart"/>
+            <w:r>
+              <w:t>SPRINGVILLE,AL</w:t>
+            </w:r>
+            <w:proofErr w:type="gramEnd"/>
+            <w:r>
+              <w:t>,PRIMARY,33.</w:t>
+            </w:r>
+            <w:proofErr w:type="gramStart"/>
+            <w:r>
+              <w:t>77,-</w:t>
+            </w:r>
+            <w:proofErr w:type="gramEnd"/>
+            <w:r>
+              <w:t>86.47,0.</w:t>
+            </w:r>
+            <w:proofErr w:type="gramStart"/>
+            <w:r>
+              <w:t>05,-</w:t>
+            </w:r>
+            <w:proofErr w:type="gramEnd"/>
+            <w:r>
+              <w:t>0.82,0.</w:t>
+            </w:r>
+            <w:proofErr w:type="gramStart"/>
+            <w:r>
+              <w:t>55,NA</w:t>
+            </w:r>
+            <w:proofErr w:type="gramEnd"/>
+            <w:r>
+              <w:t>,US,"Springville, AL</w:t>
+            </w:r>
+            <w:proofErr w:type="gramStart"/>
+            <w:r>
+              <w:t>",NA</w:t>
+            </w:r>
+            <w:proofErr w:type="gramEnd"/>
+            <w:r>
+              <w:t>-US-AL-</w:t>
+            </w:r>
+            <w:proofErr w:type="gramStart"/>
+            <w:r>
+              <w:t>SPRINGVILLE,FALSE</w:t>
+            </w:r>
+            <w:proofErr w:type="gramEnd"/>
+            <w:r>
+              <w:t>,4046,7845,172127599,</w:t>
+            </w:r>
+          </w:p>
+          <w:p>
+            <w:pPr>
+              <w:widowControl w:val="0"/>
+              <w:spacing w:line="240" w:lineRule="auto"/>
+              <w:jc w:val="both"/>
+            </w:pPr>
+            <w:r>
+              <w:t>54356,</w:t>
+            </w:r>
+            <w:proofErr w:type="gramStart"/>
+            <w:r>
+              <w:t>35585,STANDARD</w:t>
+            </w:r>
+            <w:proofErr w:type="gramEnd"/>
+            <w:r>
+              <w:t xml:space="preserve">,SPRUCE </w:t>
+            </w:r>
+            <w:proofErr w:type="gramStart"/>
+            <w:r>
+              <w:t>PINE,AL</w:t>
+            </w:r>
+            <w:proofErr w:type="gramEnd"/>
+            <w:r>
+              <w:t>,PRIMARY,34.</w:t>
+            </w:r>
+            <w:proofErr w:type="gramStart"/>
+            <w:r>
+              <w:t>37,-</w:t>
+            </w:r>
+            <w:proofErr w:type="gramEnd"/>
+            <w:r>
+              <w:t>87.69,0.</w:t>
+            </w:r>
+            <w:proofErr w:type="gramStart"/>
+            <w:r>
+              <w:t>03,-</w:t>
+            </w:r>
+            <w:proofErr w:type="gramEnd"/>
+            <w:r>
+              <w:t>0.82,0.</w:t>
+            </w:r>
+            <w:proofErr w:type="gramStart"/>
+            <w:r>
+              <w:t>56,NA</w:t>
+            </w:r>
+            <w:proofErr w:type="gramEnd"/>
+            <w:r>
+              <w:t>,US,"Spruce Pine, AL</w:t>
+            </w:r>
+            <w:proofErr w:type="gramStart"/>
+            <w:r>
+              <w:t>",NA</w:t>
+            </w:r>
+            <w:proofErr w:type="gramEnd"/>
+            <w:r>
+              <w:t xml:space="preserve">-US-AL-SPRUCE </w:t>
+            </w:r>
+            <w:proofErr w:type="gramStart"/>
+            <w:r>
+              <w:t>PINE,FALSE</w:t>
+            </w:r>
+            <w:proofErr w:type="gramEnd"/>
+            <w:r>
+              <w:t>,610,1209,18525517,</w:t>
+            </w:r>
+          </w:p>
+          <w:p>
+            <w:pPr>
+              <w:widowControl w:val="0"/>
+              <w:spacing w:line="240" w:lineRule="auto"/>
+              <w:jc w:val="both"/>
+            </w:pPr>
+            <w:r>
+              <w:t>76511,</w:t>
+            </w:r>
+            <w:proofErr w:type="gramStart"/>
+            <w:r>
+              <w:t>27007,STANDARD</w:t>
+            </w:r>
+            <w:proofErr w:type="gramEnd"/>
+            <w:r>
+              <w:t xml:space="preserve">,ASH </w:t>
+            </w:r>
+            <w:proofErr w:type="gramStart"/>
+            <w:r>
+              <w:t>HILL,NC</w:t>
+            </w:r>
+            <w:proofErr w:type="gramEnd"/>
+            <w:r>
+              <w:t>,NOT ACCEPTABLE,36.</w:t>
+            </w:r>
+            <w:proofErr w:type="gramStart"/>
+            <w:r>
+              <w:t>4,-</w:t>
+            </w:r>
+            <w:proofErr w:type="gramEnd"/>
+            <w:r>
+              <w:t>80.56,0.</w:t>
+            </w:r>
+            <w:proofErr w:type="gramStart"/>
+            <w:r>
+              <w:t>13,-</w:t>
+            </w:r>
+            <w:proofErr w:type="gramEnd"/>
+            <w:r>
+              <w:t>0.79,0.</w:t>
+            </w:r>
+            <w:proofErr w:type="gramStart"/>
+            <w:r>
+              <w:t>59,NA</w:t>
+            </w:r>
+            <w:proofErr w:type="gramEnd"/>
+            <w:r>
+              <w:t>,US,"Ash Hill, NC</w:t>
+            </w:r>
+            <w:proofErr w:type="gramStart"/>
+            <w:r>
+              <w:t>",NA</w:t>
+            </w:r>
+            <w:proofErr w:type="gramEnd"/>
+            <w:r>
+              <w:t xml:space="preserve">-US-NC-ASH </w:t>
+            </w:r>
+            <w:proofErr w:type="gramStart"/>
+            <w:r>
+              <w:t>HILL,FALSE</w:t>
+            </w:r>
+            <w:proofErr w:type="gramEnd"/>
+            <w:r>
+              <w:t>,842,1666,28876493,</w:t>
+            </w:r>
+          </w:p>
+          <w:p>
+            <w:pPr>
+              <w:widowControl w:val="0"/>
+              <w:spacing w:line="240" w:lineRule="auto"/>
+              <w:jc w:val="both"/>
+            </w:pPr>
+            <w:r>
+              <w:t>76512,</w:t>
+            </w:r>
+            <w:proofErr w:type="gramStart"/>
+            <w:r>
+              <w:t>27203,STANDARD</w:t>
+            </w:r>
+            <w:proofErr w:type="gramEnd"/>
+            <w:r>
+              <w:t>,</w:t>
+            </w:r>
+            <w:proofErr w:type="gramStart"/>
+            <w:r>
+              <w:t>ASHEBORO,NC</w:t>
+            </w:r>
+            <w:proofErr w:type="gramEnd"/>
+            <w:r>
+              <w:t>,PRIMARY,35.</w:t>
+            </w:r>
+            <w:proofErr w:type="gramStart"/>
+            <w:r>
+              <w:t>71,-</w:t>
+            </w:r>
+            <w:proofErr w:type="gramEnd"/>
+            <w:r>
+              <w:t>79.81,0.</w:t>
+            </w:r>
+            <w:proofErr w:type="gramStart"/>
+            <w:r>
+              <w:t>14,-</w:t>
+            </w:r>
+            <w:proofErr w:type="gramEnd"/>
+            <w:r>
+              <w:t>0.79,0.</w:t>
+            </w:r>
+            <w:proofErr w:type="gramStart"/>
+            <w:r>
+              <w:t>58,NA</w:t>
+            </w:r>
+            <w:proofErr w:type="gramEnd"/>
+            <w:r>
+              <w:t>,US,"Asheboro, NC</w:t>
+            </w:r>
+            <w:proofErr w:type="gramStart"/>
+            <w:r>
+              <w:t>",NA</w:t>
+            </w:r>
+            <w:proofErr w:type="gramEnd"/>
+            <w:r>
+              <w:t>-US-NC-</w:t>
+            </w:r>
+            <w:proofErr w:type="gramStart"/>
+            <w:r>
+              <w:t>ASHEBORO,FALSE</w:t>
+            </w:r>
+            <w:proofErr w:type="gramEnd"/>
+            <w:r>
+              <w:t>,8355,15228,215474318,</w:t>
+            </w:r>
+          </w:p>
+          <w:p>
+            <w:pPr>
+              <w:widowControl w:val="0"/>
+              <w:spacing w:line="240" w:lineRule="auto"/>
+              <w:jc w:val="both"/>
+            </w:pPr>
+            <w:r>
+              <w:t>76513,</w:t>
+            </w:r>
+            <w:proofErr w:type="gramStart"/>
+            <w:r>
+              <w:t>27204,PO</w:t>
+            </w:r>
+            <w:proofErr w:type="gramEnd"/>
+            <w:r>
+              <w:t xml:space="preserve"> </w:t>
+            </w:r>
+            <w:proofErr w:type="gramStart"/>
+            <w:r>
+              <w:t>BOX,ASHEBORO</w:t>
+            </w:r>
+            <w:proofErr w:type="gramEnd"/>
+            <w:r>
+              <w:t>,</w:t>
+            </w:r>
+            <w:proofErr w:type="gramStart"/>
+            <w:r>
+              <w:t>NC,PRIMARY</w:t>
+            </w:r>
+            <w:proofErr w:type="gramEnd"/>
+            <w:r>
+              <w:t>,35.</w:t>
+            </w:r>
+            <w:proofErr w:type="gramStart"/>
+            <w:r>
+              <w:t>71,-</w:t>
+            </w:r>
+            <w:proofErr w:type="gramEnd"/>
+            <w:r>
+              <w:t>79.81,0.</w:t>
+            </w:r>
+            <w:proofErr w:type="gramStart"/>
+            <w:r>
+              <w:t>14,-</w:t>
+            </w:r>
+            <w:proofErr w:type="gramEnd"/>
+            <w:r>
+              <w:t>0.79,0.</w:t>
+            </w:r>
+            <w:proofErr w:type="gramStart"/>
+            <w:r>
+              <w:t>58,NA</w:t>
+            </w:r>
+            <w:proofErr w:type="gramEnd"/>
+            <w:r>
+              <w:t>,US,"Asheboro, NC</w:t>
+            </w:r>
+            <w:proofErr w:type="gramStart"/>
+            <w:r>
+              <w:t>",NA</w:t>
+            </w:r>
+            <w:proofErr w:type="gramEnd"/>
+            <w:r>
+              <w:t>-US-NC-</w:t>
+            </w:r>
+            <w:proofErr w:type="gramStart"/>
+            <w:r>
+              <w:t>ASHEBORO,FALSE</w:t>
+            </w:r>
+            <w:proofErr w:type="gramEnd"/>
+            <w:r>
+              <w:t>,1035,1816,30322473,</w:t>
             </w:r>
           </w:p>
           <w:p>
@@ -1541,6 +2863,688 @@
         <w:rPr>
           <w:b/>
         </w:rPr>
+      </w:pPr>
+    </w:p>
+    <w:p>
+      <w:pPr>
+        <w:jc w:val="both"/>
+        <w:rPr>
+          <w:b/>
+        </w:rPr>
+      </w:pPr>
+      <w:r>
+        <w:rPr>
+          <w:b/>
+        </w:rPr>
+        <w:t>venue.txt</w:t>
+      </w:r>
+    </w:p>
+    <w:p>
+      <w:pPr>
+        <w:jc w:val="both"/>
+        <w:rPr>
+          <w:b/>
+        </w:rPr>
+      </w:pPr>
+      <w:r>
+        <w:t xml:space="preserve">put this file in </w:t>
+      </w:r>
+      <w:r>
+        <w:rPr>
+          <w:color w:val="CC0000"/>
+        </w:rPr>
+        <w:t>s3://glue-bucket/bootcamp/venue</w:t>
+      </w:r>
+      <w:r>
+        <w:t xml:space="preserve"> folder</w:t>
+      </w:r>
+    </w:p>
+    <w:tbl>
+      <w:tblPr>
+        <w:tblW w:w="9029" w:type="dxa"/>
+        <w:tblBorders>
+          <w:top w:val="single" w:sz="8" w:space="0" w:color="000000"/>
+          <w:left w:val="single" w:sz="8" w:space="0" w:color="000000"/>
+          <w:bottom w:val="single" w:sz="8" w:space="0" w:color="000000"/>
+          <w:right w:val="single" w:sz="8" w:space="0" w:color="000000"/>
+          <w:insideH w:val="single" w:sz="8" w:space="0" w:color="000000"/>
+          <w:insideV w:val="single" w:sz="8" w:space="0" w:color="000000"/>
+        </w:tblBorders>
+        <w:tblLayout w:type="fixed"/>
+        <w:tblLook w:val="0600" w:firstRow="0" w:lastRow="0" w:firstColumn="0" w:lastColumn="0" w:noHBand="1" w:noVBand="1"/>
+      </w:tblPr>
+      <w:tblGrid>
+        <w:gridCol w:w="9029"/>
+      </w:tblGrid>
+      <w:tr>
+        <w:tc>
+          <w:tcPr>
+            <w:tcW w:w="9029" w:type="dxa"/>
+            <w:tcMar>
+              <w:top w:w="100" w:type="dxa"/>
+              <w:left w:w="100" w:type="dxa"/>
+              <w:bottom w:w="100" w:type="dxa"/>
+              <w:right w:w="100" w:type="dxa"/>
+            </w:tcMar>
+          </w:tcPr>
+          <w:p>
+            <w:pPr>
+              <w:widowControl w:val="0"/>
+              <w:spacing w:line="240" w:lineRule="auto"/>
+              <w:jc w:val="both"/>
+            </w:pPr>
+            <w:r>
+              <w:t>1|Toyota Park|Bridgeview|IL|0</w:t>
+            </w:r>
+          </w:p>
+          <w:p>
+            <w:pPr>
+              <w:widowControl w:val="0"/>
+              <w:spacing w:line="240" w:lineRule="auto"/>
+              <w:jc w:val="both"/>
+            </w:pPr>
+            <w:r>
+              <w:t>2|Columbus Crew Stadium|Columbus|OH|0</w:t>
+            </w:r>
+          </w:p>
+          <w:p>
+            <w:pPr>
+              <w:widowControl w:val="0"/>
+              <w:spacing w:line="240" w:lineRule="auto"/>
+              <w:jc w:val="both"/>
+            </w:pPr>
+            <w:r>
+              <w:t>3|RFK Stadium|Washington|DC|0</w:t>
+            </w:r>
+          </w:p>
+          <w:p>
+            <w:pPr>
+              <w:widowControl w:val="0"/>
+              <w:spacing w:line="240" w:lineRule="auto"/>
+              <w:jc w:val="both"/>
+            </w:pPr>
+            <w:r>
+              <w:t xml:space="preserve">4|CommunityAmerica </w:t>
+            </w:r>
+            <w:proofErr w:type="spellStart"/>
+            <w:r>
+              <w:t>Ballpark|Kansas</w:t>
+            </w:r>
+            <w:proofErr w:type="spellEnd"/>
+            <w:r>
+              <w:t xml:space="preserve"> City|KS|0</w:t>
+            </w:r>
+          </w:p>
+          <w:p>
+            <w:pPr>
+              <w:widowControl w:val="0"/>
+              <w:spacing w:line="240" w:lineRule="auto"/>
+              <w:jc w:val="both"/>
+            </w:pPr>
+            <w:r>
+              <w:t>5|Gillette Stadium|Foxborough|MA|68756</w:t>
+            </w:r>
+          </w:p>
+          <w:p>
+            <w:pPr>
+              <w:widowControl w:val="0"/>
+              <w:spacing w:line="240" w:lineRule="auto"/>
+              <w:jc w:val="both"/>
+            </w:pPr>
+            <w:r>
+              <w:t>6|New York Giants Stadium|East Rutherford|NJ|80242</w:t>
+            </w:r>
+          </w:p>
+          <w:p>
+            <w:pPr>
+              <w:widowControl w:val="0"/>
+              <w:spacing w:line="240" w:lineRule="auto"/>
+              <w:jc w:val="both"/>
+            </w:pPr>
+            <w:r>
+              <w:t>7|BMO Field|Toronto|ON|0</w:t>
+            </w:r>
+          </w:p>
+          <w:p>
+            <w:pPr>
+              <w:widowControl w:val="0"/>
+              <w:spacing w:line="240" w:lineRule="auto"/>
+              <w:jc w:val="both"/>
+            </w:pPr>
+            <w:r>
+              <w:t>8|The Home Depot Center|Carson|CA|0</w:t>
+            </w:r>
+          </w:p>
+          <w:p>
+            <w:pPr>
+              <w:widowControl w:val="0"/>
+              <w:spacing w:line="240" w:lineRule="auto"/>
+              <w:jc w:val="both"/>
+            </w:pPr>
+            <w:r>
+              <w:t xml:space="preserve">9|Dick's Sporting Goods </w:t>
+            </w:r>
+            <w:proofErr w:type="spellStart"/>
+            <w:r>
+              <w:t>Park|Commerce</w:t>
+            </w:r>
+            <w:proofErr w:type="spellEnd"/>
+            <w:r>
+              <w:t xml:space="preserve"> City|CO|0</w:t>
+            </w:r>
+          </w:p>
+          <w:p>
+            <w:pPr>
+              <w:widowControl w:val="0"/>
+              <w:spacing w:line="240" w:lineRule="auto"/>
+              <w:jc w:val="both"/>
+            </w:pPr>
+            <w:r>
+              <w:lastRenderedPageBreak/>
+              <w:t>10|Pizza Hut Park|Frisco|TX|0</w:t>
+            </w:r>
+          </w:p>
+          <w:p>
+            <w:pPr>
+              <w:widowControl w:val="0"/>
+              <w:spacing w:line="240" w:lineRule="auto"/>
+              <w:jc w:val="both"/>
+            </w:pPr>
+            <w:r>
+              <w:t>11|Robertson Stadium|Houston|TX|0</w:t>
+            </w:r>
+          </w:p>
+          <w:p>
+            <w:pPr>
+              <w:widowControl w:val="0"/>
+              <w:spacing w:line="240" w:lineRule="auto"/>
+              <w:jc w:val="both"/>
+            </w:pPr>
+            <w:r>
+              <w:t xml:space="preserve">13|Rice-Eccles </w:t>
+            </w:r>
+            <w:proofErr w:type="spellStart"/>
+            <w:r>
+              <w:t>Stadium|Salt</w:t>
+            </w:r>
+            <w:proofErr w:type="spellEnd"/>
+            <w:r>
+              <w:t xml:space="preserve"> Lake City|UT|0</w:t>
+            </w:r>
+          </w:p>
+          <w:p>
+            <w:pPr>
+              <w:widowControl w:val="0"/>
+              <w:spacing w:line="240" w:lineRule="auto"/>
+              <w:jc w:val="both"/>
+            </w:pPr>
+            <w:r>
+              <w:t xml:space="preserve">14|Buck Shaw </w:t>
+            </w:r>
+            <w:proofErr w:type="spellStart"/>
+            <w:r>
+              <w:t>Stadium|Santa</w:t>
+            </w:r>
+            <w:proofErr w:type="spellEnd"/>
+            <w:r>
+              <w:t xml:space="preserve"> Clara|CA|0</w:t>
+            </w:r>
+          </w:p>
+          <w:p>
+            <w:pPr>
+              <w:widowControl w:val="0"/>
+              <w:spacing w:line="240" w:lineRule="auto"/>
+              <w:jc w:val="both"/>
+            </w:pPr>
+            <w:r>
+              <w:t>15|McAfee Coliseum|Oakland|CA|63026</w:t>
+            </w:r>
+          </w:p>
+          <w:p>
+            <w:pPr>
+              <w:widowControl w:val="0"/>
+              <w:spacing w:line="240" w:lineRule="auto"/>
+              <w:jc w:val="both"/>
+            </w:pPr>
+            <w:r>
+              <w:t>16|TD Banknorth Garden|Boston|MA|0</w:t>
+            </w:r>
+          </w:p>
+          <w:p>
+            <w:pPr>
+              <w:widowControl w:val="0"/>
+              <w:spacing w:line="240" w:lineRule="auto"/>
+              <w:jc w:val="both"/>
+            </w:pPr>
+            <w:r>
+              <w:t xml:space="preserve">17|Izod </w:t>
+            </w:r>
+            <w:proofErr w:type="spellStart"/>
+            <w:r>
+              <w:t>Center|East</w:t>
+            </w:r>
+            <w:proofErr w:type="spellEnd"/>
+            <w:r>
+              <w:t xml:space="preserve"> Rutherford|NJ|0</w:t>
+            </w:r>
+          </w:p>
+          <w:p>
+            <w:pPr>
+              <w:widowControl w:val="0"/>
+              <w:spacing w:line="240" w:lineRule="auto"/>
+              <w:jc w:val="both"/>
+            </w:pPr>
+            <w:r>
+              <w:t xml:space="preserve">18|Madison Square </w:t>
+            </w:r>
+            <w:proofErr w:type="spellStart"/>
+            <w:r>
+              <w:t>Garden|New</w:t>
+            </w:r>
+            <w:proofErr w:type="spellEnd"/>
+            <w:r>
+              <w:t xml:space="preserve"> York City|NY|20000</w:t>
+            </w:r>
+          </w:p>
+          <w:p>
+            <w:pPr>
+              <w:widowControl w:val="0"/>
+              <w:spacing w:line="240" w:lineRule="auto"/>
+              <w:jc w:val="both"/>
+            </w:pPr>
+            <w:r>
+              <w:t>19|Wachovia Center|Philadelphia|PA|0</w:t>
+            </w:r>
+          </w:p>
+          <w:p>
+            <w:pPr>
+              <w:widowControl w:val="0"/>
+              <w:spacing w:line="240" w:lineRule="auto"/>
+              <w:jc w:val="both"/>
+            </w:pPr>
+            <w:r>
+              <w:t>20|Air Canada Centre|Toronto|ON|0</w:t>
+            </w:r>
+          </w:p>
+          <w:p>
+            <w:pPr>
+              <w:widowControl w:val="0"/>
+              <w:spacing w:line="240" w:lineRule="auto"/>
+              <w:jc w:val="both"/>
+            </w:pPr>
+          </w:p>
+          <w:p>
+            <w:pPr>
+              <w:widowControl w:val="0"/>
+              <w:spacing w:line="240" w:lineRule="auto"/>
+              <w:jc w:val="both"/>
+              <w:rPr>
+                <w:b/>
+              </w:rPr>
+            </w:pPr>
+          </w:p>
+        </w:tc>
+      </w:tr>
+    </w:tbl>
+    <w:p>
+      <w:pPr>
+        <w:jc w:val="both"/>
+        <w:rPr>
+          <w:b/>
+        </w:rPr>
+      </w:pPr>
+    </w:p>
+    <w:p>
+      <w:pPr>
+        <w:jc w:val="both"/>
+        <w:rPr>
+          <w:b/>
+        </w:rPr>
+      </w:pPr>
+      <w:r>
+        <w:rPr>
+          <w:b/>
+        </w:rPr>
+        <w:t>Table schema for venue</w:t>
+      </w:r>
+    </w:p>
+    <w:p>
+      <w:pPr>
+        <w:jc w:val="both"/>
+        <w:rPr>
+          <w:b/>
+        </w:rPr>
+      </w:pPr>
+    </w:p>
+    <w:p>
+      <w:pPr>
+        <w:jc w:val="both"/>
+        <w:rPr>
+          <w:b/>
+        </w:rPr>
+      </w:pPr>
+    </w:p>
+    <w:tbl>
+      <w:tblPr>
+        <w:tblW w:w="9029" w:type="dxa"/>
+        <w:tblBorders>
+          <w:top w:val="single" w:sz="8" w:space="0" w:color="000000"/>
+          <w:left w:val="single" w:sz="8" w:space="0" w:color="000000"/>
+          <w:bottom w:val="single" w:sz="8" w:space="0" w:color="000000"/>
+          <w:right w:val="single" w:sz="8" w:space="0" w:color="000000"/>
+          <w:insideH w:val="single" w:sz="8" w:space="0" w:color="000000"/>
+          <w:insideV w:val="single" w:sz="8" w:space="0" w:color="000000"/>
+        </w:tblBorders>
+        <w:tblLayout w:type="fixed"/>
+        <w:tblLook w:val="0600" w:firstRow="0" w:lastRow="0" w:firstColumn="0" w:lastColumn="0" w:noHBand="1" w:noVBand="1"/>
+      </w:tblPr>
+      <w:tblGrid>
+        <w:gridCol w:w="9029"/>
+      </w:tblGrid>
+      <w:tr>
+        <w:tc>
+          <w:tcPr>
+            <w:tcW w:w="9029" w:type="dxa"/>
+            <w:tcMar>
+              <w:top w:w="100" w:type="dxa"/>
+              <w:left w:w="100" w:type="dxa"/>
+              <w:bottom w:w="100" w:type="dxa"/>
+              <w:right w:w="100" w:type="dxa"/>
+            </w:tcMar>
+          </w:tcPr>
+          <w:p>
+            <w:pPr>
+              <w:widowControl w:val="0"/>
+              <w:spacing w:line="240" w:lineRule="auto"/>
+              <w:jc w:val="both"/>
+            </w:pPr>
+            <w:proofErr w:type="spellStart"/>
+            <w:r>
+              <w:t>venueid</w:t>
+            </w:r>
+            <w:proofErr w:type="spellEnd"/>
+            <w:r>
+              <w:t xml:space="preserve"> </w:t>
+            </w:r>
+            <w:proofErr w:type="spellStart"/>
+            <w:proofErr w:type="gramStart"/>
+            <w:r>
+              <w:t>smallint</w:t>
+            </w:r>
+            <w:proofErr w:type="spellEnd"/>
+            <w:r>
+              <w:t xml:space="preserve"> ,</w:t>
+            </w:r>
+            <w:proofErr w:type="gramEnd"/>
+          </w:p>
+          <w:p>
+            <w:pPr>
+              <w:widowControl w:val="0"/>
+              <w:spacing w:line="240" w:lineRule="auto"/>
+              <w:jc w:val="both"/>
+            </w:pPr>
+            <w:r>
+              <w:tab/>
+            </w:r>
+            <w:proofErr w:type="spellStart"/>
+            <w:r>
+              <w:t>venuename</w:t>
+            </w:r>
+            <w:proofErr w:type="spellEnd"/>
+            <w:r>
+              <w:t xml:space="preserve"> string,</w:t>
+            </w:r>
+          </w:p>
+          <w:p>
+            <w:pPr>
+              <w:widowControl w:val="0"/>
+              <w:spacing w:line="240" w:lineRule="auto"/>
+              <w:jc w:val="both"/>
+            </w:pPr>
+            <w:r>
+              <w:tab/>
+            </w:r>
+            <w:proofErr w:type="spellStart"/>
+            <w:r>
+              <w:t>venuecity</w:t>
+            </w:r>
+            <w:proofErr w:type="spellEnd"/>
+            <w:r>
+              <w:t xml:space="preserve"> string,</w:t>
+            </w:r>
+          </w:p>
+          <w:p>
+            <w:pPr>
+              <w:widowControl w:val="0"/>
+              <w:spacing w:line="240" w:lineRule="auto"/>
+              <w:jc w:val="both"/>
+            </w:pPr>
+            <w:r>
+              <w:tab/>
+            </w:r>
+            <w:proofErr w:type="spellStart"/>
+            <w:r>
+              <w:t>venuestate</w:t>
+            </w:r>
+            <w:proofErr w:type="spellEnd"/>
+            <w:r>
+              <w:t xml:space="preserve"> string,</w:t>
+            </w:r>
+          </w:p>
+          <w:p>
+            <w:pPr>
+              <w:widowControl w:val="0"/>
+              <w:spacing w:line="240" w:lineRule="auto"/>
+              <w:jc w:val="both"/>
+            </w:pPr>
+            <w:r>
+              <w:tab/>
+            </w:r>
+            <w:proofErr w:type="spellStart"/>
+            <w:r>
+              <w:t>venueseats</w:t>
+            </w:r>
+            <w:proofErr w:type="spellEnd"/>
+            <w:r>
+              <w:t xml:space="preserve"> </w:t>
+            </w:r>
+            <w:proofErr w:type="spellStart"/>
+            <w:r>
+              <w:t>bigint</w:t>
+            </w:r>
+            <w:proofErr w:type="spellEnd"/>
+          </w:p>
+          <w:p>
+            <w:pPr>
+              <w:widowControl w:val="0"/>
+              <w:spacing w:line="240" w:lineRule="auto"/>
+              <w:jc w:val="both"/>
+              <w:rPr>
+                <w:b/>
+              </w:rPr>
+            </w:pPr>
+          </w:p>
+        </w:tc>
+      </w:tr>
+    </w:tbl>
+    <w:p>
+      <w:pPr>
+        <w:jc w:val="both"/>
+        <w:rPr>
+          <w:b/>
+        </w:rPr>
+      </w:pPr>
+    </w:p>
+    <w:p>
+      <w:pPr>
+        <w:jc w:val="both"/>
+        <w:rPr>
+          <w:b/>
+        </w:rPr>
+      </w:pPr>
+    </w:p>
+    <w:p>
+      <w:pPr>
+        <w:jc w:val="both"/>
+        <w:rPr>
+          <w:b/>
+        </w:rPr>
+      </w:pPr>
+      <w:r>
+        <w:rPr>
+          <w:b/>
+        </w:rPr>
+        <w:t xml:space="preserve">Athena </w:t>
+      </w:r>
+    </w:p>
+    <w:p>
+      <w:pPr>
+        <w:jc w:val="both"/>
+        <w:rPr>
+          <w:b/>
+        </w:rPr>
+      </w:pPr>
+    </w:p>
+    <w:p>
+      <w:pPr>
+        <w:jc w:val="both"/>
+        <w:rPr>
+          <w:b/>
+        </w:rPr>
+      </w:pPr>
+    </w:p>
+    <w:tbl>
+      <w:tblPr>
+        <w:tblW w:w="9029" w:type="dxa"/>
+        <w:tblBorders>
+          <w:top w:val="single" w:sz="8" w:space="0" w:color="000000"/>
+          <w:left w:val="single" w:sz="8" w:space="0" w:color="000000"/>
+          <w:bottom w:val="single" w:sz="8" w:space="0" w:color="000000"/>
+          <w:right w:val="single" w:sz="8" w:space="0" w:color="000000"/>
+          <w:insideH w:val="single" w:sz="8" w:space="0" w:color="000000"/>
+          <w:insideV w:val="single" w:sz="8" w:space="0" w:color="000000"/>
+        </w:tblBorders>
+        <w:tblLayout w:type="fixed"/>
+        <w:tblLook w:val="0600" w:firstRow="0" w:lastRow="0" w:firstColumn="0" w:lastColumn="0" w:noHBand="1" w:noVBand="1"/>
+      </w:tblPr>
+      <w:tblGrid>
+        <w:gridCol w:w="9029"/>
+      </w:tblGrid>
+      <w:tr>
+        <w:tc>
+          <w:tcPr>
+            <w:tcW w:w="9029" w:type="dxa"/>
+            <w:tcMar>
+              <w:top w:w="100" w:type="dxa"/>
+              <w:left w:w="100" w:type="dxa"/>
+              <w:bottom w:w="100" w:type="dxa"/>
+              <w:right w:w="100" w:type="dxa"/>
+            </w:tcMar>
+          </w:tcPr>
+          <w:p>
+            <w:pPr>
+              <w:widowControl w:val="0"/>
+              <w:spacing w:line="240" w:lineRule="auto"/>
+              <w:jc w:val="both"/>
+            </w:pPr>
+            <w:r>
+              <w:t>select TRY_</w:t>
+            </w:r>
+            <w:proofErr w:type="gramStart"/>
+            <w:r>
+              <w:t>CAST(</w:t>
+            </w:r>
+            <w:proofErr w:type="spellStart"/>
+            <w:proofErr w:type="gramEnd"/>
+            <w:r>
+              <w:t>venueid</w:t>
+            </w:r>
+            <w:proofErr w:type="spellEnd"/>
+            <w:r>
+              <w:t xml:space="preserve"> AS INTEGER) as </w:t>
+            </w:r>
+            <w:proofErr w:type="spellStart"/>
+            <w:proofErr w:type="gramStart"/>
+            <w:r>
+              <w:t>venueid,venuename</w:t>
+            </w:r>
+            <w:proofErr w:type="gramEnd"/>
+            <w:r>
+              <w:t>,</w:t>
+            </w:r>
+            <w:proofErr w:type="gramStart"/>
+            <w:r>
+              <w:t>venuecity,venuestate</w:t>
+            </w:r>
+            <w:proofErr w:type="gramEnd"/>
+            <w:r>
+              <w:t>,TRY_</w:t>
+            </w:r>
+            <w:proofErr w:type="gramStart"/>
+            <w:r>
+              <w:t>CAST</w:t>
+            </w:r>
+            <w:proofErr w:type="spellEnd"/>
+            <w:r>
+              <w:t>(</w:t>
+            </w:r>
+            <w:proofErr w:type="spellStart"/>
+            <w:proofErr w:type="gramEnd"/>
+            <w:r>
+              <w:t>venueseats</w:t>
+            </w:r>
+            <w:proofErr w:type="spellEnd"/>
+            <w:r>
+              <w:t xml:space="preserve"> AS INTEGER) as </w:t>
+            </w:r>
+            <w:proofErr w:type="spellStart"/>
+            <w:r>
+              <w:t>venueseats</w:t>
+            </w:r>
+            <w:proofErr w:type="spellEnd"/>
+          </w:p>
+          <w:p>
+            <w:pPr>
+              <w:widowControl w:val="0"/>
+              <w:spacing w:line="240" w:lineRule="auto"/>
+              <w:jc w:val="both"/>
+            </w:pPr>
+            <w:r>
+              <w:t>FROM "</w:t>
+            </w:r>
+            <w:proofErr w:type="spellStart"/>
+            <w:r>
+              <w:t>bootcamp"."venue</w:t>
+            </w:r>
+            <w:proofErr w:type="spellEnd"/>
+            <w:r>
+              <w:t>" limit 10;</w:t>
+            </w:r>
+          </w:p>
+          <w:p>
+            <w:pPr>
+              <w:widowControl w:val="0"/>
+              <w:spacing w:line="240" w:lineRule="auto"/>
+              <w:jc w:val="both"/>
+              <w:rPr>
+                <w:b/>
+              </w:rPr>
+            </w:pPr>
+          </w:p>
+        </w:tc>
+      </w:tr>
+    </w:tbl>
+    <w:p>
+      <w:pPr>
+        <w:jc w:val="both"/>
+        <w:rPr>
+          <w:b/>
+        </w:rPr>
+      </w:pPr>
+    </w:p>
+    <w:p>
+      <w:pPr>
+        <w:jc w:val="both"/>
       </w:pPr>
     </w:p>
     <w:p>

</xml_diff>

<commit_message>
Added overall conclusion for S3, glue using Athena
</commit_message>
<xml_diff>
--- a/New folder/AWS Glue, S3 with Athena - Doc 3.docx
+++ b/New folder/AWS Glue, S3 with Athena - Doc 3.docx
@@ -3554,6 +3554,62 @@
           <w:b/>
         </w:rPr>
       </w:pPr>
+      <w:r>
+        <w:rPr>
+          <w:b/>
+        </w:rPr>
+        <w:t>Conclusion/ Summary</w:t>
+      </w:r>
+    </w:p>
+    <w:p>
+      <w:pPr>
+        <w:jc w:val="both"/>
+        <w:rPr>
+          <w:b/>
+        </w:rPr>
+      </w:pPr>
+    </w:p>
+    <w:p>
+      <w:pPr>
+        <w:jc w:val="both"/>
+        <w:rPr>
+          <w:bCs/>
+        </w:rPr>
+      </w:pPr>
+      <w:r>
+        <w:rPr>
+          <w:bCs/>
+        </w:rPr>
+        <w:t>In this lab, we learned how to use AWS Glue, Amazon S3, and Amazon Athena to build a simple ETL workflow. First, we created an S3 bucket and organized the data into folders. We created a Glue database named bootcamp and registered tables using both crawlers and manual table creation. Next, we created a Glue ETL job to transform CSV data into Parquet format and store the output in S3. We then used a crawler to create a table for the transformed data. Finally, we queried the tables using Athena and practiced TRY_</w:t>
+      </w:r>
+      <w:proofErr w:type="gramStart"/>
+      <w:r>
+        <w:rPr>
+          <w:bCs/>
+        </w:rPr>
+        <w:t>CAST(</w:t>
+      </w:r>
+      <w:proofErr w:type="gramEnd"/>
+      <w:r>
+        <w:rPr>
+          <w:bCs/>
+        </w:rPr>
+        <w:t xml:space="preserve">) to convert column values into appropriate data types. This lab demonstrates how AWS services work together to </w:t>
+      </w:r>
+      <w:proofErr w:type="spellStart"/>
+      <w:r>
+        <w:rPr>
+          <w:bCs/>
+        </w:rPr>
+        <w:t>catalog</w:t>
+      </w:r>
+      <w:proofErr w:type="spellEnd"/>
+      <w:r>
+        <w:rPr>
+          <w:bCs/>
+        </w:rPr>
+        <w:t>, transform, store, and query data efficiently in a data engineering pipeline.</w:t>
+      </w:r>
     </w:p>
     <w:sectPr>
       <w:pgSz w:w="11909" w:h="16834"/>
@@ -4433,7 +4489,6 @@
   <w:style w:type="character" w:default="1" w:styleId="DefaultParagraphFont">
     <w:name w:val="Default Paragraph Font"/>
     <w:uiPriority w:val="1"/>
-    <w:semiHidden/>
     <w:unhideWhenUsed/>
   </w:style>
   <w:style w:type="table" w:default="1" w:styleId="TableNormal">

</xml_diff>

<commit_message>
Glue and Athena, new concepts Introduced
</commit_message>
<xml_diff>
--- a/New folder/AWS Glue, S3 with Athena - Doc 3.docx
+++ b/New folder/AWS Glue, S3 with Athena - Doc 3.docx
@@ -387,27 +387,7 @@
           <w:szCs w:val="21"/>
           <w:highlight w:val="white"/>
         </w:rPr>
-        <w:t xml:space="preserve">It is </w:t>
-      </w:r>
-      <w:proofErr w:type="gramStart"/>
-      <w:r>
-        <w:rPr>
-          <w:rFonts w:ascii="Roboto" w:eastAsia="Roboto" w:hAnsi="Roboto" w:cs="Roboto"/>
-          <w:sz w:val="21"/>
-          <w:szCs w:val="21"/>
-          <w:highlight w:val="white"/>
-        </w:rPr>
-        <w:t>similar to</w:t>
-      </w:r>
-      <w:proofErr w:type="gramEnd"/>
-      <w:r>
-        <w:rPr>
-          <w:rFonts w:ascii="Roboto" w:eastAsia="Roboto" w:hAnsi="Roboto" w:cs="Roboto"/>
-          <w:sz w:val="21"/>
-          <w:szCs w:val="21"/>
-          <w:highlight w:val="white"/>
-        </w:rPr>
-        <w:t xml:space="preserve"> hive database and table hierarchy</w:t>
+        <w:t>It is similar to hive database and table hierarchy</w:t>
       </w:r>
     </w:p>
     <w:p>
@@ -529,27 +509,7 @@
           <w:szCs w:val="21"/>
           <w:highlight w:val="white"/>
         </w:rPr>
-        <w:t xml:space="preserve">. </w:t>
-      </w:r>
-      <w:proofErr w:type="gramStart"/>
-      <w:r>
-        <w:rPr>
-          <w:rFonts w:ascii="Roboto" w:eastAsia="Roboto" w:hAnsi="Roboto" w:cs="Roboto"/>
-          <w:sz w:val="21"/>
-          <w:szCs w:val="21"/>
-          <w:highlight w:val="white"/>
-        </w:rPr>
-        <w:t>So</w:t>
-      </w:r>
-      <w:proofErr w:type="gramEnd"/>
-      <w:r>
-        <w:rPr>
-          <w:rFonts w:ascii="Roboto" w:eastAsia="Roboto" w:hAnsi="Roboto" w:cs="Roboto"/>
-          <w:sz w:val="21"/>
-          <w:szCs w:val="21"/>
-          <w:highlight w:val="white"/>
-        </w:rPr>
-        <w:t xml:space="preserve"> zip codes will be your table name</w:t>
+        <w:t>. So zip codes will be your table name</w:t>
       </w:r>
     </w:p>
     <w:p>
@@ -955,15 +915,7 @@
         <w:jc w:val="both"/>
       </w:pPr>
       <w:r>
-        <w:t xml:space="preserve">Select any already created table as data source, </w:t>
-      </w:r>
-      <w:proofErr w:type="gramStart"/>
-      <w:r>
-        <w:t>So</w:t>
-      </w:r>
-      <w:proofErr w:type="gramEnd"/>
-      <w:r>
-        <w:t xml:space="preserve"> select </w:t>
+        <w:t xml:space="preserve">Select any already created table as data source, So select </w:t>
       </w:r>
       <w:proofErr w:type="spellStart"/>
       <w:r>
@@ -1275,615 +1227,88 @@
               <w:spacing w:line="240" w:lineRule="auto"/>
               <w:jc w:val="both"/>
             </w:pPr>
-            <w:proofErr w:type="gramStart"/>
-            <w:r>
-              <w:t>RecordNumber,Zipcode</w:t>
-            </w:r>
-            <w:proofErr w:type="gramEnd"/>
-            <w:r>
-              <w:t>,</w:t>
-            </w:r>
-            <w:proofErr w:type="gramStart"/>
-            <w:r>
-              <w:t>ZipCodeType,City</w:t>
-            </w:r>
-            <w:proofErr w:type="gramEnd"/>
-            <w:r>
-              <w:t>,</w:t>
-            </w:r>
-            <w:proofErr w:type="gramStart"/>
-            <w:r>
-              <w:t>State,LocationType</w:t>
-            </w:r>
-            <w:proofErr w:type="gramEnd"/>
-            <w:r>
-              <w:t>,</w:t>
-            </w:r>
-            <w:proofErr w:type="gramStart"/>
-            <w:r>
-              <w:t>Lat,Long</w:t>
-            </w:r>
-            <w:proofErr w:type="gramEnd"/>
-            <w:r>
-              <w:t>,</w:t>
-            </w:r>
-            <w:proofErr w:type="gramStart"/>
-            <w:r>
-              <w:t>Xaxis,Yaxis</w:t>
-            </w:r>
-            <w:proofErr w:type="gramEnd"/>
-            <w:r>
-              <w:t>,</w:t>
-            </w:r>
-            <w:proofErr w:type="gramStart"/>
-            <w:r>
-              <w:t>Zaxis,WorldRegion</w:t>
-            </w:r>
-            <w:proofErr w:type="gramEnd"/>
-            <w:r>
-              <w:t>,</w:t>
-            </w:r>
-            <w:proofErr w:type="gramStart"/>
-            <w:r>
-              <w:t>Country,LocationText</w:t>
-            </w:r>
-            <w:proofErr w:type="gramEnd"/>
-            <w:r>
-              <w:t>,</w:t>
-            </w:r>
-            <w:proofErr w:type="gramStart"/>
-            <w:r>
-              <w:t>Location,Decommisioned</w:t>
-            </w:r>
-            <w:proofErr w:type="gramEnd"/>
-            <w:r>
-              <w:t>,</w:t>
-            </w:r>
-            <w:proofErr w:type="gramStart"/>
-            <w:r>
-              <w:t>TaxReturnsFiled,EstimatedPopulation</w:t>
-            </w:r>
-            <w:proofErr w:type="gramEnd"/>
-            <w:r>
-              <w:t>,</w:t>
-            </w:r>
-            <w:proofErr w:type="gramStart"/>
-            <w:r>
-              <w:t>TotalWages,Notes</w:t>
-            </w:r>
-            <w:proofErr w:type="gramEnd"/>
-          </w:p>
-          <w:p>
-            <w:pPr>
-              <w:widowControl w:val="0"/>
-              <w:spacing w:line="240" w:lineRule="auto"/>
-              <w:jc w:val="both"/>
-            </w:pPr>
-            <w:proofErr w:type="gramStart"/>
-            <w:r>
-              <w:t>1,704,STANDARD</w:t>
-            </w:r>
-            <w:proofErr w:type="gramEnd"/>
-            <w:r>
-              <w:t xml:space="preserve">,PARC </w:t>
-            </w:r>
-            <w:proofErr w:type="gramStart"/>
-            <w:r>
-              <w:t>PARQUE,PR</w:t>
-            </w:r>
-            <w:proofErr w:type="gramEnd"/>
-            <w:r>
-              <w:t>,NOT ACCEPTABLE,17.</w:t>
-            </w:r>
-            <w:proofErr w:type="gramStart"/>
-            <w:r>
-              <w:t>96,-</w:t>
-            </w:r>
-            <w:proofErr w:type="gramEnd"/>
-            <w:r>
-              <w:t>66.22,0.</w:t>
-            </w:r>
-            <w:proofErr w:type="gramStart"/>
-            <w:r>
-              <w:t>38,-</w:t>
-            </w:r>
-            <w:proofErr w:type="gramEnd"/>
-            <w:r>
-              <w:t>0.87,0.</w:t>
-            </w:r>
-            <w:proofErr w:type="gramStart"/>
-            <w:r>
-              <w:t>3,NA</w:t>
-            </w:r>
-            <w:proofErr w:type="gramEnd"/>
-            <w:r>
-              <w:t>,US,"Parc Parque, PR</w:t>
-            </w:r>
-            <w:proofErr w:type="gramStart"/>
-            <w:r>
-              <w:t>",NA</w:t>
-            </w:r>
-            <w:proofErr w:type="gramEnd"/>
-            <w:r>
-              <w:t xml:space="preserve">-US-PR-PARC </w:t>
-            </w:r>
-            <w:proofErr w:type="gramStart"/>
-            <w:r>
-              <w:t>PARQUE,FALSE,,,,</w:t>
-            </w:r>
-            <w:proofErr w:type="gramEnd"/>
-          </w:p>
-          <w:p>
-            <w:pPr>
-              <w:widowControl w:val="0"/>
-              <w:spacing w:line="240" w:lineRule="auto"/>
-              <w:jc w:val="both"/>
-            </w:pPr>
-            <w:proofErr w:type="gramStart"/>
-            <w:r>
-              <w:t>2,704,STANDARD</w:t>
-            </w:r>
-            <w:proofErr w:type="gramEnd"/>
-            <w:r>
-              <w:t xml:space="preserve">,PASEO COSTA DEL </w:t>
-            </w:r>
-            <w:proofErr w:type="gramStart"/>
-            <w:r>
-              <w:t>SUR,PR</w:t>
-            </w:r>
-            <w:proofErr w:type="gramEnd"/>
-            <w:r>
-              <w:t>,NOT ACCEPTABLE,17.</w:t>
-            </w:r>
-            <w:proofErr w:type="gramStart"/>
-            <w:r>
-              <w:t>96,-</w:t>
-            </w:r>
-            <w:proofErr w:type="gramEnd"/>
-            <w:r>
-              <w:t>66.22,0.</w:t>
-            </w:r>
-            <w:proofErr w:type="gramStart"/>
-            <w:r>
-              <w:t>38,-</w:t>
-            </w:r>
-            <w:proofErr w:type="gramEnd"/>
-            <w:r>
-              <w:t>0.87,0.</w:t>
-            </w:r>
-            <w:proofErr w:type="gramStart"/>
-            <w:r>
-              <w:t>3,NA</w:t>
-            </w:r>
-            <w:proofErr w:type="gramEnd"/>
-            <w:r>
-              <w:t>,US,"Paseo Costa Del Sur, PR</w:t>
-            </w:r>
-            <w:proofErr w:type="gramStart"/>
-            <w:r>
-              <w:t>",NA</w:t>
-            </w:r>
-            <w:proofErr w:type="gramEnd"/>
-            <w:r>
-              <w:t xml:space="preserve">-US-PR-PASEO COSTA DEL </w:t>
-            </w:r>
-            <w:proofErr w:type="gramStart"/>
-            <w:r>
-              <w:t>SUR,FALSE,,,,</w:t>
-            </w:r>
-            <w:proofErr w:type="gramEnd"/>
-          </w:p>
-          <w:p>
-            <w:pPr>
-              <w:widowControl w:val="0"/>
-              <w:spacing w:line="240" w:lineRule="auto"/>
-              <w:jc w:val="both"/>
-            </w:pPr>
-            <w:proofErr w:type="gramStart"/>
-            <w:r>
-              <w:t>10,709,STANDARD</w:t>
-            </w:r>
-            <w:proofErr w:type="gramEnd"/>
-            <w:r>
-              <w:t xml:space="preserve">,BDA SAN </w:t>
-            </w:r>
-            <w:proofErr w:type="gramStart"/>
-            <w:r>
-              <w:t>LUIS,PR</w:t>
-            </w:r>
-            <w:proofErr w:type="gramEnd"/>
-            <w:r>
-              <w:t>,NOT ACCEPTABLE,18.</w:t>
-            </w:r>
-            <w:proofErr w:type="gramStart"/>
-            <w:r>
-              <w:t>14,-</w:t>
-            </w:r>
-            <w:proofErr w:type="gramEnd"/>
-            <w:r>
-              <w:t>66.26,0.</w:t>
-            </w:r>
-            <w:proofErr w:type="gramStart"/>
-            <w:r>
-              <w:t>38,-</w:t>
-            </w:r>
-            <w:proofErr w:type="gramEnd"/>
-            <w:r>
-              <w:t>0.86,0.</w:t>
-            </w:r>
-            <w:proofErr w:type="gramStart"/>
-            <w:r>
-              <w:t>31,NA</w:t>
-            </w:r>
-            <w:proofErr w:type="gramEnd"/>
-            <w:r>
-              <w:t>,US,"Bda San Luis, PR</w:t>
-            </w:r>
-            <w:proofErr w:type="gramStart"/>
-            <w:r>
-              <w:t>",NA</w:t>
-            </w:r>
-            <w:proofErr w:type="gramEnd"/>
-            <w:r>
-              <w:t xml:space="preserve">-US-PR-BDA SAN </w:t>
-            </w:r>
-            <w:proofErr w:type="gramStart"/>
-            <w:r>
-              <w:t>LUIS,FALSE,,,,</w:t>
-            </w:r>
-            <w:proofErr w:type="gramEnd"/>
-          </w:p>
-          <w:p>
-            <w:pPr>
-              <w:widowControl w:val="0"/>
-              <w:spacing w:line="240" w:lineRule="auto"/>
-              <w:jc w:val="both"/>
-            </w:pPr>
-            <w:r>
-              <w:t>61391,</w:t>
-            </w:r>
-            <w:proofErr w:type="gramStart"/>
-            <w:r>
-              <w:t>76166,UNIQUE</w:t>
-            </w:r>
-            <w:proofErr w:type="gramEnd"/>
-            <w:r>
-              <w:t xml:space="preserve">,CINGULAR </w:t>
-            </w:r>
-            <w:proofErr w:type="gramStart"/>
-            <w:r>
-              <w:t>WIRELESS,TX</w:t>
-            </w:r>
-            <w:proofErr w:type="gramEnd"/>
-            <w:r>
-              <w:t>,NOT ACCEPTABLE,32.</w:t>
-            </w:r>
-            <w:proofErr w:type="gramStart"/>
-            <w:r>
-              <w:t>72,-</w:t>
-            </w:r>
-            <w:proofErr w:type="gramEnd"/>
-            <w:r>
-              <w:t>97.</w:t>
-            </w:r>
-            <w:proofErr w:type="gramStart"/>
-            <w:r>
-              <w:t>31,-</w:t>
-            </w:r>
-            <w:proofErr w:type="gramEnd"/>
-            <w:r>
-              <w:t>0.</w:t>
-            </w:r>
-            <w:proofErr w:type="gramStart"/>
-            <w:r>
-              <w:t>1,-</w:t>
-            </w:r>
-            <w:proofErr w:type="gramEnd"/>
-            <w:r>
-              <w:t>0.83,0.</w:t>
-            </w:r>
-            <w:proofErr w:type="gramStart"/>
-            <w:r>
-              <w:t>54,NA</w:t>
-            </w:r>
-            <w:proofErr w:type="gramEnd"/>
-            <w:r>
-              <w:t>,US,"Cingular Wireless, TX</w:t>
-            </w:r>
-            <w:proofErr w:type="gramStart"/>
-            <w:r>
-              <w:t>",NA</w:t>
-            </w:r>
-            <w:proofErr w:type="gramEnd"/>
-            <w:r>
-              <w:t xml:space="preserve">-US-TX-CINGULAR </w:t>
-            </w:r>
-            <w:proofErr w:type="gramStart"/>
-            <w:r>
-              <w:t>WIRELESS,FALSE,,,,</w:t>
-            </w:r>
-            <w:proofErr w:type="gramEnd"/>
-          </w:p>
-          <w:p>
-            <w:pPr>
-              <w:widowControl w:val="0"/>
-              <w:spacing w:line="240" w:lineRule="auto"/>
-              <w:jc w:val="both"/>
-            </w:pPr>
-            <w:r>
-              <w:t>61392,</w:t>
-            </w:r>
-            <w:proofErr w:type="gramStart"/>
-            <w:r>
-              <w:t>76177,STANDARD</w:t>
-            </w:r>
-            <w:proofErr w:type="gramEnd"/>
-            <w:r>
-              <w:t xml:space="preserve">,FORT </w:t>
-            </w:r>
-            <w:proofErr w:type="gramStart"/>
-            <w:r>
-              <w:t>WORTH,TX</w:t>
-            </w:r>
-            <w:proofErr w:type="gramEnd"/>
-            <w:r>
-              <w:t>,PRIMARY,32.</w:t>
-            </w:r>
-            <w:proofErr w:type="gramStart"/>
-            <w:r>
-              <w:t>75,-</w:t>
-            </w:r>
-            <w:proofErr w:type="gramEnd"/>
-            <w:r>
-              <w:t>97.</w:t>
-            </w:r>
-            <w:proofErr w:type="gramStart"/>
-            <w:r>
-              <w:t>33,-</w:t>
-            </w:r>
-            <w:proofErr w:type="gramEnd"/>
-            <w:r>
-              <w:t>0.</w:t>
-            </w:r>
-            <w:proofErr w:type="gramStart"/>
-            <w:r>
-              <w:t>1,-</w:t>
-            </w:r>
-            <w:proofErr w:type="gramEnd"/>
-            <w:r>
-              <w:t>0.83,0.</w:t>
-            </w:r>
-            <w:proofErr w:type="gramStart"/>
-            <w:r>
-              <w:t>54,NA</w:t>
-            </w:r>
-            <w:proofErr w:type="gramEnd"/>
-            <w:r>
-              <w:t>,US,"Fort Worth, TX</w:t>
-            </w:r>
-            <w:proofErr w:type="gramStart"/>
-            <w:r>
-              <w:t>",NA</w:t>
-            </w:r>
-            <w:proofErr w:type="gramEnd"/>
-            <w:r>
-              <w:t xml:space="preserve">-US-TX-FORT </w:t>
-            </w:r>
-            <w:proofErr w:type="gramStart"/>
-            <w:r>
-              <w:t>WORTH,FALSE</w:t>
-            </w:r>
-            <w:proofErr w:type="gramEnd"/>
-            <w:r>
-              <w:t>,2126,4053,122396986,</w:t>
-            </w:r>
-          </w:p>
-          <w:p>
-            <w:pPr>
-              <w:widowControl w:val="0"/>
-              <w:spacing w:line="240" w:lineRule="auto"/>
-              <w:jc w:val="both"/>
-            </w:pPr>
-            <w:r>
-              <w:t>61393,</w:t>
-            </w:r>
-            <w:proofErr w:type="gramStart"/>
-            <w:r>
-              <w:t>76177,STANDARD</w:t>
-            </w:r>
-            <w:proofErr w:type="gramEnd"/>
-            <w:r>
-              <w:t xml:space="preserve">,FT </w:t>
-            </w:r>
-            <w:proofErr w:type="gramStart"/>
-            <w:r>
-              <w:t>WORTH,TX</w:t>
-            </w:r>
-            <w:proofErr w:type="gramEnd"/>
-            <w:r>
-              <w:t>,ACCEPTABLE,32.</w:t>
-            </w:r>
-            <w:proofErr w:type="gramStart"/>
-            <w:r>
-              <w:t>75,-</w:t>
-            </w:r>
-            <w:proofErr w:type="gramEnd"/>
-            <w:r>
-              <w:t>97.</w:t>
-            </w:r>
-            <w:proofErr w:type="gramStart"/>
-            <w:r>
-              <w:t>33,-</w:t>
-            </w:r>
-            <w:proofErr w:type="gramEnd"/>
-            <w:r>
-              <w:t>0.</w:t>
-            </w:r>
-            <w:proofErr w:type="gramStart"/>
-            <w:r>
-              <w:t>1,-</w:t>
-            </w:r>
-            <w:proofErr w:type="gramEnd"/>
-            <w:r>
-              <w:t>0.83,0.</w:t>
-            </w:r>
-            <w:proofErr w:type="gramStart"/>
-            <w:r>
-              <w:t>54,NA</w:t>
-            </w:r>
-            <w:proofErr w:type="gramEnd"/>
-            <w:r>
-              <w:t>,US,"Ft Worth, TX</w:t>
-            </w:r>
-            <w:proofErr w:type="gramStart"/>
-            <w:r>
-              <w:t>",NA</w:t>
-            </w:r>
-            <w:proofErr w:type="gramEnd"/>
-            <w:r>
-              <w:t xml:space="preserve">-US-TX-FT </w:t>
-            </w:r>
-            <w:proofErr w:type="gramStart"/>
-            <w:r>
-              <w:t>WORTH,FALSE</w:t>
-            </w:r>
-            <w:proofErr w:type="gramEnd"/>
-            <w:r>
-              <w:t>,2126,4053,122396986,</w:t>
-            </w:r>
-          </w:p>
-          <w:p>
-            <w:pPr>
-              <w:widowControl w:val="0"/>
-              <w:spacing w:line="240" w:lineRule="auto"/>
-              <w:jc w:val="both"/>
-            </w:pPr>
-            <w:proofErr w:type="gramStart"/>
-            <w:r>
-              <w:t>4,704,STANDARD</w:t>
-            </w:r>
-            <w:proofErr w:type="gramEnd"/>
-            <w:r>
-              <w:t xml:space="preserve">,URB EUGENE </w:t>
-            </w:r>
-            <w:proofErr w:type="gramStart"/>
-            <w:r>
-              <w:t>RICE,PR</w:t>
-            </w:r>
-            <w:proofErr w:type="gramEnd"/>
-            <w:r>
-              <w:t>,NOT ACCEPTABLE,17.</w:t>
-            </w:r>
-            <w:proofErr w:type="gramStart"/>
-            <w:r>
-              <w:t>96,-</w:t>
-            </w:r>
-            <w:proofErr w:type="gramEnd"/>
-            <w:r>
-              <w:t>66.22,0.</w:t>
-            </w:r>
-            <w:proofErr w:type="gramStart"/>
-            <w:r>
-              <w:t>38,-</w:t>
-            </w:r>
-            <w:proofErr w:type="gramEnd"/>
-            <w:r>
-              <w:t>0.87,0.</w:t>
-            </w:r>
-            <w:proofErr w:type="gramStart"/>
-            <w:r>
-              <w:t>3,NA</w:t>
-            </w:r>
-            <w:proofErr w:type="gramEnd"/>
-            <w:r>
-              <w:t>,US,"Urb Eugene Rice, PR</w:t>
-            </w:r>
-            <w:proofErr w:type="gramStart"/>
-            <w:r>
-              <w:t>",NA</w:t>
-            </w:r>
-            <w:proofErr w:type="gramEnd"/>
-            <w:r>
-              <w:t xml:space="preserve">-US-PR-URB EUGENE </w:t>
-            </w:r>
-            <w:proofErr w:type="gramStart"/>
-            <w:r>
-              <w:t>RICE,FALSE,,,,</w:t>
-            </w:r>
-            <w:proofErr w:type="gramEnd"/>
-          </w:p>
-          <w:p>
-            <w:pPr>
-              <w:widowControl w:val="0"/>
-              <w:spacing w:line="240" w:lineRule="auto"/>
-              <w:jc w:val="both"/>
-            </w:pPr>
-            <w:r>
-              <w:t>39827,</w:t>
-            </w:r>
-            <w:proofErr w:type="gramStart"/>
-            <w:r>
-              <w:t>85209,STANDARD</w:t>
-            </w:r>
-            <w:proofErr w:type="gramEnd"/>
-            <w:r>
-              <w:t>,</w:t>
-            </w:r>
-            <w:proofErr w:type="gramStart"/>
-            <w:r>
-              <w:t>MESA,AZ</w:t>
-            </w:r>
-            <w:proofErr w:type="gramEnd"/>
-            <w:r>
-              <w:t>,PRIMARY,33.</w:t>
-            </w:r>
-            <w:proofErr w:type="gramStart"/>
-            <w:r>
-              <w:t>37,-</w:t>
-            </w:r>
-            <w:proofErr w:type="gramEnd"/>
-            <w:r>
-              <w:t>111.</w:t>
-            </w:r>
-            <w:proofErr w:type="gramStart"/>
-            <w:r>
-              <w:t>64,-</w:t>
-            </w:r>
-            <w:proofErr w:type="gramEnd"/>
-            <w:r>
-              <w:t>0.</w:t>
-            </w:r>
-            <w:proofErr w:type="gramStart"/>
-            <w:r>
-              <w:t>3,-</w:t>
-            </w:r>
-            <w:proofErr w:type="gramEnd"/>
-            <w:r>
-              <w:t>0.77,0.</w:t>
-            </w:r>
-            <w:proofErr w:type="gramStart"/>
-            <w:r>
-              <w:t>55,NA</w:t>
-            </w:r>
-            <w:proofErr w:type="gramEnd"/>
-            <w:r>
-              <w:t>,US,"Mesa, AZ</w:t>
-            </w:r>
-            <w:proofErr w:type="gramStart"/>
-            <w:r>
-              <w:t>",NA</w:t>
-            </w:r>
-            <w:proofErr w:type="gramEnd"/>
-            <w:r>
-              <w:t>-US-AZ-</w:t>
-            </w:r>
-            <w:proofErr w:type="gramStart"/>
-            <w:r>
-              <w:t>MESA,FALSE</w:t>
-            </w:r>
-            <w:proofErr w:type="gramEnd"/>
-            <w:r>
-              <w:t>,14962,26883,563792730,"no NWS data, "</w:t>
+            <w:r>
+              <w:t>RecordNumber,Zipcode,ZipCodeType,City,State,LocationType,Lat,Long,Xaxis,Yaxis,Zaxis,WorldRegion,Country,LocationText,Location,Decommisioned,TaxReturnsFiled,EstimatedPopulation,TotalWages,Notes</w:t>
+            </w:r>
+          </w:p>
+          <w:p>
+            <w:pPr>
+              <w:widowControl w:val="0"/>
+              <w:spacing w:line="240" w:lineRule="auto"/>
+              <w:jc w:val="both"/>
+            </w:pPr>
+            <w:r>
+              <w:t>1,704,STANDARD,PARC PARQUE,PR,NOT ACCEPTABLE,17.96,-66.22,0.38,-0.87,0.3,NA,US,"Parc Parque, PR",NA-US-PR-PARC PARQUE,FALSE,,,,</w:t>
+            </w:r>
+          </w:p>
+          <w:p>
+            <w:pPr>
+              <w:widowControl w:val="0"/>
+              <w:spacing w:line="240" w:lineRule="auto"/>
+              <w:jc w:val="both"/>
+            </w:pPr>
+            <w:r>
+              <w:t>2,704,STANDARD,PASEO COSTA DEL SUR,PR,NOT ACCEPTABLE,17.96,-66.22,0.38,-0.87,0.3,NA,US,"Paseo Costa Del Sur, PR",NA-US-PR-PASEO COSTA DEL SUR,FALSE,,,,</w:t>
+            </w:r>
+          </w:p>
+          <w:p>
+            <w:pPr>
+              <w:widowControl w:val="0"/>
+              <w:spacing w:line="240" w:lineRule="auto"/>
+              <w:jc w:val="both"/>
+            </w:pPr>
+            <w:r>
+              <w:t>10,709,STANDARD,BDA SAN LUIS,PR,NOT ACCEPTABLE,18.14,-66.26,0.38,-0.86,0.31,NA,US,"Bda San Luis, PR",NA-US-PR-BDA SAN LUIS,FALSE,,,,</w:t>
+            </w:r>
+          </w:p>
+          <w:p>
+            <w:pPr>
+              <w:widowControl w:val="0"/>
+              <w:spacing w:line="240" w:lineRule="auto"/>
+              <w:jc w:val="both"/>
+            </w:pPr>
+            <w:r>
+              <w:t>61391,76166,UNIQUE,CINGULAR WIRELESS,TX,NOT ACCEPTABLE,32.72,-97.31,-0.1,-0.83,0.54,NA,US,"Cingular Wireless, TX",NA-US-TX-CINGULAR WIRELESS,FALSE,,,,</w:t>
+            </w:r>
+          </w:p>
+          <w:p>
+            <w:pPr>
+              <w:widowControl w:val="0"/>
+              <w:spacing w:line="240" w:lineRule="auto"/>
+              <w:jc w:val="both"/>
+            </w:pPr>
+            <w:r>
+              <w:t>61392,76177,STANDARD,FORT WORTH,TX,PRIMARY,32.75,-97.33,-0.1,-0.83,0.54,NA,US,"Fort Worth, TX",NA-US-TX-FORT WORTH,FALSE,2126,4053,122396986,</w:t>
+            </w:r>
+          </w:p>
+          <w:p>
+            <w:pPr>
+              <w:widowControl w:val="0"/>
+              <w:spacing w:line="240" w:lineRule="auto"/>
+              <w:jc w:val="both"/>
+            </w:pPr>
+            <w:r>
+              <w:t>61393,76177,STANDARD,FT WORTH,TX,ACCEPTABLE,32.75,-97.33,-0.1,-0.83,0.54,NA,US,"Ft Worth, TX",NA-US-TX-FT WORTH,FALSE,2126,4053,122396986,</w:t>
+            </w:r>
+          </w:p>
+          <w:p>
+            <w:pPr>
+              <w:widowControl w:val="0"/>
+              <w:spacing w:line="240" w:lineRule="auto"/>
+              <w:jc w:val="both"/>
+            </w:pPr>
+            <w:r>
+              <w:t>4,704,STANDARD,URB EUGENE RICE,PR,NOT ACCEPTABLE,17.96,-66.22,0.38,-0.87,0.3,NA,US,"Urb Eugene Rice, PR",NA-US-PR-URB EUGENE RICE,FALSE,,,,</w:t>
+            </w:r>
+          </w:p>
+          <w:p>
+            <w:pPr>
+              <w:widowControl w:val="0"/>
+              <w:spacing w:line="240" w:lineRule="auto"/>
+              <w:jc w:val="both"/>
+            </w:pPr>
+            <w:r>
+              <w:t>39827,85209,STANDARD,MESA,AZ,PRIMARY,33.37,-111.64,-0.3,-0.77,0.55,NA,US,"Mesa, AZ",NA-US-AZ-MESA,FALSE,14962,26883,563792730,"no NWS data, "</w:t>
             </w:r>
           </w:p>
           <w:p>
@@ -1894,452 +1319,67 @@
             </w:pPr>
             <w:r>
               <w:lastRenderedPageBreak/>
-              <w:t>39828,</w:t>
-            </w:r>
-            <w:proofErr w:type="gramStart"/>
-            <w:r>
-              <w:t>85210,STANDARD</w:t>
-            </w:r>
-            <w:proofErr w:type="gramEnd"/>
-            <w:r>
-              <w:t>,</w:t>
-            </w:r>
-            <w:proofErr w:type="gramStart"/>
-            <w:r>
-              <w:t>MESA,AZ</w:t>
-            </w:r>
-            <w:proofErr w:type="gramEnd"/>
-            <w:r>
-              <w:t>,PRIMARY,33.</w:t>
-            </w:r>
-            <w:proofErr w:type="gramStart"/>
-            <w:r>
-              <w:t>38,-</w:t>
-            </w:r>
-            <w:proofErr w:type="gramEnd"/>
-            <w:r>
-              <w:t>111.</w:t>
-            </w:r>
-            <w:proofErr w:type="gramStart"/>
-            <w:r>
-              <w:t>84,-</w:t>
-            </w:r>
-            <w:proofErr w:type="gramEnd"/>
-            <w:r>
-              <w:t>0.</w:t>
-            </w:r>
-            <w:proofErr w:type="gramStart"/>
-            <w:r>
-              <w:t>31,-</w:t>
-            </w:r>
-            <w:proofErr w:type="gramEnd"/>
-            <w:r>
-              <w:t>0.77,0.</w:t>
-            </w:r>
-            <w:proofErr w:type="gramStart"/>
-            <w:r>
-              <w:t>55,NA</w:t>
-            </w:r>
-            <w:proofErr w:type="gramEnd"/>
-            <w:r>
-              <w:t>,US,"Mesa, AZ</w:t>
-            </w:r>
-            <w:proofErr w:type="gramStart"/>
-            <w:r>
-              <w:t>",NA</w:t>
-            </w:r>
-            <w:proofErr w:type="gramEnd"/>
-            <w:r>
-              <w:t>-US-AZ-</w:t>
-            </w:r>
-            <w:proofErr w:type="gramStart"/>
-            <w:r>
-              <w:t>MESA,FALSE</w:t>
-            </w:r>
-            <w:proofErr w:type="gramEnd"/>
-            <w:r>
-              <w:t>,14374,25446,471000465,</w:t>
-            </w:r>
-          </w:p>
-          <w:p>
-            <w:pPr>
-              <w:widowControl w:val="0"/>
-              <w:spacing w:line="240" w:lineRule="auto"/>
-              <w:jc w:val="both"/>
-            </w:pPr>
-            <w:r>
-              <w:t>49345,</w:t>
-            </w:r>
-            <w:proofErr w:type="gramStart"/>
-            <w:r>
-              <w:t>32046,STANDARD</w:t>
-            </w:r>
-            <w:proofErr w:type="gramEnd"/>
-            <w:r>
-              <w:t>,</w:t>
-            </w:r>
-            <w:proofErr w:type="gramStart"/>
-            <w:r>
-              <w:t>HILLIARD,FL</w:t>
-            </w:r>
-            <w:proofErr w:type="gramEnd"/>
-            <w:r>
-              <w:t>,PRIMARY,30.</w:t>
-            </w:r>
-            <w:proofErr w:type="gramStart"/>
-            <w:r>
-              <w:t>69,-</w:t>
-            </w:r>
-            <w:proofErr w:type="gramEnd"/>
-            <w:r>
-              <w:t>81.92,0.</w:t>
-            </w:r>
-            <w:proofErr w:type="gramStart"/>
-            <w:r>
-              <w:t>12,-</w:t>
-            </w:r>
-            <w:proofErr w:type="gramEnd"/>
-            <w:r>
-              <w:t>0.85,0.</w:t>
-            </w:r>
-            <w:proofErr w:type="gramStart"/>
-            <w:r>
-              <w:t>51,NA</w:t>
-            </w:r>
-            <w:proofErr w:type="gramEnd"/>
-            <w:r>
-              <w:t>,US,"Hilliard, FL</w:t>
-            </w:r>
-            <w:proofErr w:type="gramStart"/>
-            <w:r>
-              <w:t>",NA</w:t>
-            </w:r>
-            <w:proofErr w:type="gramEnd"/>
-            <w:r>
-              <w:t>-US-FL-</w:t>
-            </w:r>
-            <w:proofErr w:type="gramStart"/>
-            <w:r>
-              <w:t>HILLIARD,FALSE</w:t>
-            </w:r>
-            <w:proofErr w:type="gramEnd"/>
-            <w:r>
-              <w:t>,3922,7443,133112149,</w:t>
-            </w:r>
-          </w:p>
-          <w:p>
-            <w:pPr>
-              <w:widowControl w:val="0"/>
-              <w:spacing w:line="240" w:lineRule="auto"/>
-              <w:jc w:val="both"/>
-            </w:pPr>
-            <w:r>
-              <w:t>49346,</w:t>
-            </w:r>
-            <w:proofErr w:type="gramStart"/>
-            <w:r>
-              <w:t>34445,PO</w:t>
-            </w:r>
-            <w:proofErr w:type="gramEnd"/>
-            <w:r>
-              <w:t xml:space="preserve"> </w:t>
-            </w:r>
-            <w:proofErr w:type="gramStart"/>
-            <w:r>
-              <w:t>BOX,HOLDER</w:t>
-            </w:r>
-            <w:proofErr w:type="gramEnd"/>
-            <w:r>
-              <w:t>,</w:t>
-            </w:r>
-            <w:proofErr w:type="gramStart"/>
-            <w:r>
-              <w:t>FL,PRIMARY</w:t>
-            </w:r>
-            <w:proofErr w:type="gramEnd"/>
-            <w:r>
-              <w:t>,28.</w:t>
-            </w:r>
-            <w:proofErr w:type="gramStart"/>
-            <w:r>
-              <w:t>96,-</w:t>
-            </w:r>
-            <w:proofErr w:type="gramEnd"/>
-            <w:r>
-              <w:t>82.41,0.</w:t>
-            </w:r>
-            <w:proofErr w:type="gramStart"/>
-            <w:r>
-              <w:t>11,-</w:t>
-            </w:r>
-            <w:proofErr w:type="gramEnd"/>
-            <w:r>
-              <w:t>0.86,0.</w:t>
-            </w:r>
-            <w:proofErr w:type="gramStart"/>
-            <w:r>
-              <w:t>48,NA</w:t>
-            </w:r>
-            <w:proofErr w:type="gramEnd"/>
-            <w:r>
-              <w:t>,US,"Holder, FL</w:t>
-            </w:r>
-            <w:proofErr w:type="gramStart"/>
-            <w:r>
-              <w:t>",NA</w:t>
-            </w:r>
-            <w:proofErr w:type="gramEnd"/>
-            <w:r>
-              <w:t>-US-FL-</w:t>
-            </w:r>
-            <w:proofErr w:type="gramStart"/>
-            <w:r>
-              <w:t>HOLDER,FALSE,,,,</w:t>
-            </w:r>
-            <w:proofErr w:type="gramEnd"/>
-          </w:p>
-          <w:p>
-            <w:pPr>
-              <w:widowControl w:val="0"/>
-              <w:spacing w:line="240" w:lineRule="auto"/>
-              <w:jc w:val="both"/>
-            </w:pPr>
-            <w:r>
-              <w:t>49347,</w:t>
-            </w:r>
-            <w:proofErr w:type="gramStart"/>
-            <w:r>
-              <w:t>32564,STANDARD</w:t>
-            </w:r>
-            <w:proofErr w:type="gramEnd"/>
-            <w:r>
-              <w:t>,</w:t>
-            </w:r>
-            <w:proofErr w:type="gramStart"/>
-            <w:r>
-              <w:t>HOLT,FL</w:t>
-            </w:r>
-            <w:proofErr w:type="gramEnd"/>
-            <w:r>
-              <w:t>,PRIMARY,30.</w:t>
-            </w:r>
-            <w:proofErr w:type="gramStart"/>
-            <w:r>
-              <w:t>72,-</w:t>
-            </w:r>
-            <w:proofErr w:type="gramEnd"/>
-            <w:r>
-              <w:t>86.67,0.</w:t>
-            </w:r>
-            <w:proofErr w:type="gramStart"/>
-            <w:r>
-              <w:t>04,-</w:t>
-            </w:r>
-            <w:proofErr w:type="gramEnd"/>
-            <w:r>
-              <w:t>0.85,0.</w:t>
-            </w:r>
-            <w:proofErr w:type="gramStart"/>
-            <w:r>
-              <w:t>51,NA</w:t>
-            </w:r>
-            <w:proofErr w:type="gramEnd"/>
-            <w:r>
-              <w:t>,US,"Holt, FL</w:t>
-            </w:r>
-            <w:proofErr w:type="gramStart"/>
-            <w:r>
-              <w:t>",NA</w:t>
-            </w:r>
-            <w:proofErr w:type="gramEnd"/>
-            <w:r>
-              <w:t>-US-FL-</w:t>
-            </w:r>
-            <w:proofErr w:type="gramStart"/>
-            <w:r>
-              <w:t>HOLT,FALSE</w:t>
-            </w:r>
-            <w:proofErr w:type="gramEnd"/>
-            <w:r>
-              <w:t>,1207,2190,36395913,</w:t>
-            </w:r>
-          </w:p>
-          <w:p>
-            <w:pPr>
-              <w:widowControl w:val="0"/>
-              <w:spacing w:line="240" w:lineRule="auto"/>
-              <w:jc w:val="both"/>
-            </w:pPr>
-            <w:r>
-              <w:t>49348,</w:t>
-            </w:r>
-            <w:proofErr w:type="gramStart"/>
-            <w:r>
-              <w:t>34487,PO</w:t>
-            </w:r>
-            <w:proofErr w:type="gramEnd"/>
-            <w:r>
-              <w:t xml:space="preserve"> </w:t>
-            </w:r>
-            <w:proofErr w:type="gramStart"/>
-            <w:r>
-              <w:t>BOX,HOMOSASSA</w:t>
-            </w:r>
-            <w:proofErr w:type="gramEnd"/>
-            <w:r>
-              <w:t>,</w:t>
-            </w:r>
-            <w:proofErr w:type="gramStart"/>
-            <w:r>
-              <w:t>FL,PRIMARY</w:t>
-            </w:r>
-            <w:proofErr w:type="gramEnd"/>
-            <w:r>
-              <w:t>,28.</w:t>
-            </w:r>
-            <w:proofErr w:type="gramStart"/>
-            <w:r>
-              <w:t>78,-</w:t>
-            </w:r>
-            <w:proofErr w:type="gramEnd"/>
-            <w:r>
-              <w:t>82.61,0.</w:t>
-            </w:r>
-            <w:proofErr w:type="gramStart"/>
-            <w:r>
-              <w:t>11,-</w:t>
-            </w:r>
-            <w:proofErr w:type="gramEnd"/>
-            <w:r>
-              <w:t>0.86,0.</w:t>
-            </w:r>
-            <w:proofErr w:type="gramStart"/>
-            <w:r>
-              <w:t>48,NA</w:t>
-            </w:r>
-            <w:proofErr w:type="gramEnd"/>
-            <w:r>
-              <w:t>,US,"Homosassa, FL</w:t>
-            </w:r>
-            <w:proofErr w:type="gramStart"/>
-            <w:r>
-              <w:t>",NA</w:t>
-            </w:r>
-            <w:proofErr w:type="gramEnd"/>
-            <w:r>
-              <w:t>-US-FL-</w:t>
-            </w:r>
-            <w:proofErr w:type="gramStart"/>
-            <w:r>
-              <w:t>HOMOSASSA,FALSE,,,,</w:t>
-            </w:r>
-            <w:proofErr w:type="gramEnd"/>
-          </w:p>
-          <w:p>
-            <w:pPr>
-              <w:widowControl w:val="0"/>
-              <w:spacing w:line="240" w:lineRule="auto"/>
-              <w:jc w:val="both"/>
-            </w:pPr>
-            <w:proofErr w:type="gramStart"/>
-            <w:r>
-              <w:t>10,708,STANDARD</w:t>
-            </w:r>
-            <w:proofErr w:type="gramEnd"/>
-            <w:r>
-              <w:t xml:space="preserve">,BDA SAN </w:t>
-            </w:r>
-            <w:proofErr w:type="gramStart"/>
-            <w:r>
-              <w:t>LUIS,PR</w:t>
-            </w:r>
-            <w:proofErr w:type="gramEnd"/>
-            <w:r>
-              <w:t>,NOT ACCEPTABLE,18.</w:t>
-            </w:r>
-            <w:proofErr w:type="gramStart"/>
-            <w:r>
-              <w:t>14,-</w:t>
-            </w:r>
-            <w:proofErr w:type="gramEnd"/>
-            <w:r>
-              <w:t>66.26,0.</w:t>
-            </w:r>
-            <w:proofErr w:type="gramStart"/>
-            <w:r>
-              <w:t>38,-</w:t>
-            </w:r>
-            <w:proofErr w:type="gramEnd"/>
-            <w:r>
-              <w:t>0.86,0.</w:t>
-            </w:r>
-            <w:proofErr w:type="gramStart"/>
-            <w:r>
-              <w:t>31,NA</w:t>
-            </w:r>
-            <w:proofErr w:type="gramEnd"/>
-            <w:r>
-              <w:t>,US,"Bda San Luis, PR</w:t>
-            </w:r>
-            <w:proofErr w:type="gramStart"/>
-            <w:r>
-              <w:t>",NA</w:t>
-            </w:r>
-            <w:proofErr w:type="gramEnd"/>
-            <w:r>
-              <w:t xml:space="preserve">-US-PR-BDA SAN </w:t>
-            </w:r>
-            <w:proofErr w:type="gramStart"/>
-            <w:r>
-              <w:t>LUIS,FALSE,,,,</w:t>
-            </w:r>
-            <w:proofErr w:type="gramEnd"/>
-          </w:p>
-          <w:p>
-            <w:pPr>
-              <w:widowControl w:val="0"/>
-              <w:spacing w:line="240" w:lineRule="auto"/>
-              <w:jc w:val="both"/>
-            </w:pPr>
-            <w:proofErr w:type="gramStart"/>
-            <w:r>
-              <w:t>3,704,STANDARD</w:t>
-            </w:r>
-            <w:proofErr w:type="gramEnd"/>
-            <w:r>
-              <w:t xml:space="preserve">,SECT </w:t>
-            </w:r>
-            <w:proofErr w:type="gramStart"/>
-            <w:r>
-              <w:t>LANAUSSE,PR</w:t>
-            </w:r>
-            <w:proofErr w:type="gramEnd"/>
-            <w:r>
-              <w:t>,NOT ACCEPTABLE,17.</w:t>
-            </w:r>
-            <w:proofErr w:type="gramStart"/>
-            <w:r>
-              <w:t>96,-</w:t>
-            </w:r>
-            <w:proofErr w:type="gramEnd"/>
-            <w:r>
-              <w:t>66.22,0.</w:t>
-            </w:r>
-            <w:proofErr w:type="gramStart"/>
-            <w:r>
-              <w:t>38,-</w:t>
-            </w:r>
-            <w:proofErr w:type="gramEnd"/>
-            <w:r>
-              <w:t>0.87,0.</w:t>
-            </w:r>
-            <w:proofErr w:type="gramStart"/>
-            <w:r>
-              <w:t>3,NA</w:t>
-            </w:r>
-            <w:proofErr w:type="gramEnd"/>
-            <w:r>
-              <w:t xml:space="preserve">,US,"Sect </w:t>
+              <w:t>39828,85210,STANDARD,MESA,AZ,PRIMARY,33.38,-111.84,-0.31,-0.77,0.55,NA,US,"Mesa, AZ",NA-US-AZ-MESA,FALSE,14374,25446,471000465,</w:t>
+            </w:r>
+          </w:p>
+          <w:p>
+            <w:pPr>
+              <w:widowControl w:val="0"/>
+              <w:spacing w:line="240" w:lineRule="auto"/>
+              <w:jc w:val="both"/>
+            </w:pPr>
+            <w:r>
+              <w:t>49345,32046,STANDARD,HILLIARD,FL,PRIMARY,30.69,-81.92,0.12,-0.85,0.51,NA,US,"Hilliard, FL",NA-US-FL-HILLIARD,FALSE,3922,7443,133112149,</w:t>
+            </w:r>
+          </w:p>
+          <w:p>
+            <w:pPr>
+              <w:widowControl w:val="0"/>
+              <w:spacing w:line="240" w:lineRule="auto"/>
+              <w:jc w:val="both"/>
+            </w:pPr>
+            <w:r>
+              <w:t>49346,34445,PO BOX,HOLDER,FL,PRIMARY,28.96,-82.41,0.11,-0.86,0.48,NA,US,"Holder, FL",NA-US-FL-HOLDER,FALSE,,,,</w:t>
+            </w:r>
+          </w:p>
+          <w:p>
+            <w:pPr>
+              <w:widowControl w:val="0"/>
+              <w:spacing w:line="240" w:lineRule="auto"/>
+              <w:jc w:val="both"/>
+            </w:pPr>
+            <w:r>
+              <w:t>49347,32564,STANDARD,HOLT,FL,PRIMARY,30.72,-86.67,0.04,-0.85,0.51,NA,US,"Holt, FL",NA-US-FL-HOLT,FALSE,1207,2190,36395913,</w:t>
+            </w:r>
+          </w:p>
+          <w:p>
+            <w:pPr>
+              <w:widowControl w:val="0"/>
+              <w:spacing w:line="240" w:lineRule="auto"/>
+              <w:jc w:val="both"/>
+            </w:pPr>
+            <w:r>
+              <w:t>49348,34487,PO BOX,HOMOSASSA,FL,PRIMARY,28.78,-82.61,0.11,-0.86,0.48,NA,US,"Homosassa, FL",NA-US-FL-HOMOSASSA,FALSE,,,,</w:t>
+            </w:r>
+          </w:p>
+          <w:p>
+            <w:pPr>
+              <w:widowControl w:val="0"/>
+              <w:spacing w:line="240" w:lineRule="auto"/>
+              <w:jc w:val="both"/>
+            </w:pPr>
+            <w:r>
+              <w:t>10,708,STANDARD,BDA SAN LUIS,PR,NOT ACCEPTABLE,18.14,-66.26,0.38,-0.86,0.31,NA,US,"Bda San Luis, PR",NA-US-PR-BDA SAN LUIS,FALSE,,,,</w:t>
+            </w:r>
+          </w:p>
+          <w:p>
+            <w:pPr>
+              <w:widowControl w:val="0"/>
+              <w:spacing w:line="240" w:lineRule="auto"/>
+              <w:jc w:val="both"/>
+            </w:pPr>
+            <w:r>
+              <w:t xml:space="preserve">3,704,STANDARD,SECT LANAUSSE,PR,NOT ACCEPTABLE,17.96,-66.22,0.38,-0.87,0.3,NA,US,"Sect </w:t>
             </w:r>
             <w:proofErr w:type="spellStart"/>
             <w:r>
@@ -2347,429 +1387,67 @@
             </w:r>
             <w:proofErr w:type="spellEnd"/>
             <w:r>
-              <w:t>, PR</w:t>
-            </w:r>
-            <w:proofErr w:type="gramStart"/>
-            <w:r>
-              <w:t>",NA</w:t>
-            </w:r>
-            <w:proofErr w:type="gramEnd"/>
-            <w:r>
-              <w:t xml:space="preserve">-US-PR-SECT </w:t>
-            </w:r>
-            <w:proofErr w:type="gramStart"/>
-            <w:r>
-              <w:t>LANAUSSE,FALSE,,,,</w:t>
-            </w:r>
-            <w:proofErr w:type="gramEnd"/>
-          </w:p>
-          <w:p>
-            <w:pPr>
-              <w:widowControl w:val="0"/>
-              <w:spacing w:line="240" w:lineRule="auto"/>
-              <w:jc w:val="both"/>
-            </w:pPr>
-            <w:r>
-              <w:t>54354,</w:t>
-            </w:r>
-            <w:proofErr w:type="gramStart"/>
-            <w:r>
-              <w:t>36275,PO</w:t>
-            </w:r>
-            <w:proofErr w:type="gramEnd"/>
-            <w:r>
-              <w:t xml:space="preserve"> </w:t>
-            </w:r>
-            <w:proofErr w:type="gramStart"/>
-            <w:r>
-              <w:t>BOX,SPRING</w:t>
-            </w:r>
-            <w:proofErr w:type="gramEnd"/>
-            <w:r>
-              <w:t xml:space="preserve"> </w:t>
-            </w:r>
-            <w:proofErr w:type="gramStart"/>
-            <w:r>
-              <w:t>GARDEN,AL</w:t>
-            </w:r>
-            <w:proofErr w:type="gramEnd"/>
-            <w:r>
-              <w:t>,PRIMARY,33.</w:t>
-            </w:r>
-            <w:proofErr w:type="gramStart"/>
-            <w:r>
-              <w:t>97,-</w:t>
-            </w:r>
-            <w:proofErr w:type="gramEnd"/>
-            <w:r>
-              <w:t>85.55,0.</w:t>
-            </w:r>
-            <w:proofErr w:type="gramStart"/>
-            <w:r>
-              <w:t>06,-</w:t>
-            </w:r>
-            <w:proofErr w:type="gramEnd"/>
-            <w:r>
-              <w:t>0.82,0.</w:t>
-            </w:r>
-            <w:proofErr w:type="gramStart"/>
-            <w:r>
-              <w:t>55,NA</w:t>
-            </w:r>
-            <w:proofErr w:type="gramEnd"/>
-            <w:r>
-              <w:t>,US,"Spring Garden, AL</w:t>
-            </w:r>
-            <w:proofErr w:type="gramStart"/>
-            <w:r>
-              <w:t>",NA</w:t>
-            </w:r>
-            <w:proofErr w:type="gramEnd"/>
-            <w:r>
-              <w:t xml:space="preserve">-US-AL-SPRING </w:t>
-            </w:r>
-            <w:proofErr w:type="gramStart"/>
-            <w:r>
-              <w:t>GARDEN,FALSE,,,,</w:t>
-            </w:r>
-            <w:proofErr w:type="gramEnd"/>
-          </w:p>
-          <w:p>
-            <w:pPr>
-              <w:widowControl w:val="0"/>
-              <w:spacing w:line="240" w:lineRule="auto"/>
-              <w:jc w:val="both"/>
-            </w:pPr>
-            <w:r>
-              <w:t>54355,</w:t>
-            </w:r>
-            <w:proofErr w:type="gramStart"/>
-            <w:r>
-              <w:t>35146,STANDARD</w:t>
-            </w:r>
-            <w:proofErr w:type="gramEnd"/>
-            <w:r>
-              <w:t>,</w:t>
-            </w:r>
-            <w:proofErr w:type="gramStart"/>
-            <w:r>
-              <w:t>SPRINGVILLE,AL</w:t>
-            </w:r>
-            <w:proofErr w:type="gramEnd"/>
-            <w:r>
-              <w:t>,PRIMARY,33.</w:t>
-            </w:r>
-            <w:proofErr w:type="gramStart"/>
-            <w:r>
-              <w:t>77,-</w:t>
-            </w:r>
-            <w:proofErr w:type="gramEnd"/>
-            <w:r>
-              <w:t>86.47,0.</w:t>
-            </w:r>
-            <w:proofErr w:type="gramStart"/>
-            <w:r>
-              <w:t>05,-</w:t>
-            </w:r>
-            <w:proofErr w:type="gramEnd"/>
-            <w:r>
-              <w:t>0.82,0.</w:t>
-            </w:r>
-            <w:proofErr w:type="gramStart"/>
-            <w:r>
-              <w:t>55,NA</w:t>
-            </w:r>
-            <w:proofErr w:type="gramEnd"/>
-            <w:r>
-              <w:t>,US,"Springville, AL</w:t>
-            </w:r>
-            <w:proofErr w:type="gramStart"/>
-            <w:r>
-              <w:t>",NA</w:t>
-            </w:r>
-            <w:proofErr w:type="gramEnd"/>
-            <w:r>
-              <w:t>-US-AL-</w:t>
-            </w:r>
-            <w:proofErr w:type="gramStart"/>
-            <w:r>
-              <w:t>SPRINGVILLE,FALSE</w:t>
-            </w:r>
-            <w:proofErr w:type="gramEnd"/>
-            <w:r>
-              <w:t>,4046,7845,172127599,</w:t>
-            </w:r>
-          </w:p>
-          <w:p>
-            <w:pPr>
-              <w:widowControl w:val="0"/>
-              <w:spacing w:line="240" w:lineRule="auto"/>
-              <w:jc w:val="both"/>
-            </w:pPr>
-            <w:r>
-              <w:t>54356,</w:t>
-            </w:r>
-            <w:proofErr w:type="gramStart"/>
-            <w:r>
-              <w:t>35585,STANDARD</w:t>
-            </w:r>
-            <w:proofErr w:type="gramEnd"/>
-            <w:r>
-              <w:t xml:space="preserve">,SPRUCE </w:t>
-            </w:r>
-            <w:proofErr w:type="gramStart"/>
-            <w:r>
-              <w:t>PINE,AL</w:t>
-            </w:r>
-            <w:proofErr w:type="gramEnd"/>
-            <w:r>
-              <w:t>,PRIMARY,34.</w:t>
-            </w:r>
-            <w:proofErr w:type="gramStart"/>
-            <w:r>
-              <w:t>37,-</w:t>
-            </w:r>
-            <w:proofErr w:type="gramEnd"/>
-            <w:r>
-              <w:t>87.69,0.</w:t>
-            </w:r>
-            <w:proofErr w:type="gramStart"/>
-            <w:r>
-              <w:t>03,-</w:t>
-            </w:r>
-            <w:proofErr w:type="gramEnd"/>
-            <w:r>
-              <w:t>0.82,0.</w:t>
-            </w:r>
-            <w:proofErr w:type="gramStart"/>
-            <w:r>
-              <w:t>56,NA</w:t>
-            </w:r>
-            <w:proofErr w:type="gramEnd"/>
-            <w:r>
-              <w:t>,US,"Spruce Pine, AL</w:t>
-            </w:r>
-            <w:proofErr w:type="gramStart"/>
-            <w:r>
-              <w:t>",NA</w:t>
-            </w:r>
-            <w:proofErr w:type="gramEnd"/>
-            <w:r>
-              <w:t xml:space="preserve">-US-AL-SPRUCE </w:t>
-            </w:r>
-            <w:proofErr w:type="gramStart"/>
-            <w:r>
-              <w:t>PINE,FALSE</w:t>
-            </w:r>
-            <w:proofErr w:type="gramEnd"/>
-            <w:r>
-              <w:t>,610,1209,18525517,</w:t>
-            </w:r>
-          </w:p>
-          <w:p>
-            <w:pPr>
-              <w:widowControl w:val="0"/>
-              <w:spacing w:line="240" w:lineRule="auto"/>
-              <w:jc w:val="both"/>
-            </w:pPr>
-            <w:r>
-              <w:t>76511,</w:t>
-            </w:r>
-            <w:proofErr w:type="gramStart"/>
-            <w:r>
-              <w:t>27007,STANDARD</w:t>
-            </w:r>
-            <w:proofErr w:type="gramEnd"/>
-            <w:r>
-              <w:t xml:space="preserve">,ASH </w:t>
-            </w:r>
-            <w:proofErr w:type="gramStart"/>
-            <w:r>
-              <w:t>HILL,NC</w:t>
-            </w:r>
-            <w:proofErr w:type="gramEnd"/>
-            <w:r>
-              <w:t>,NOT ACCEPTABLE,36.</w:t>
-            </w:r>
-            <w:proofErr w:type="gramStart"/>
-            <w:r>
-              <w:t>4,-</w:t>
-            </w:r>
-            <w:proofErr w:type="gramEnd"/>
-            <w:r>
-              <w:t>80.56,0.</w:t>
-            </w:r>
-            <w:proofErr w:type="gramStart"/>
-            <w:r>
-              <w:t>13,-</w:t>
-            </w:r>
-            <w:proofErr w:type="gramEnd"/>
-            <w:r>
-              <w:t>0.79,0.</w:t>
-            </w:r>
-            <w:proofErr w:type="gramStart"/>
-            <w:r>
-              <w:t>59,NA</w:t>
-            </w:r>
-            <w:proofErr w:type="gramEnd"/>
-            <w:r>
-              <w:t>,US,"Ash Hill, NC</w:t>
-            </w:r>
-            <w:proofErr w:type="gramStart"/>
-            <w:r>
-              <w:t>",NA</w:t>
-            </w:r>
-            <w:proofErr w:type="gramEnd"/>
-            <w:r>
-              <w:t xml:space="preserve">-US-NC-ASH </w:t>
-            </w:r>
-            <w:proofErr w:type="gramStart"/>
-            <w:r>
-              <w:t>HILL,FALSE</w:t>
-            </w:r>
-            <w:proofErr w:type="gramEnd"/>
-            <w:r>
-              <w:t>,842,1666,28876493,</w:t>
-            </w:r>
-          </w:p>
-          <w:p>
-            <w:pPr>
-              <w:widowControl w:val="0"/>
-              <w:spacing w:line="240" w:lineRule="auto"/>
-              <w:jc w:val="both"/>
-            </w:pPr>
-            <w:r>
-              <w:t>76512,</w:t>
-            </w:r>
-            <w:proofErr w:type="gramStart"/>
-            <w:r>
-              <w:t>27203,STANDARD</w:t>
-            </w:r>
-            <w:proofErr w:type="gramEnd"/>
-            <w:r>
-              <w:t>,</w:t>
-            </w:r>
-            <w:proofErr w:type="gramStart"/>
-            <w:r>
-              <w:t>ASHEBORO,NC</w:t>
-            </w:r>
-            <w:proofErr w:type="gramEnd"/>
-            <w:r>
-              <w:t>,PRIMARY,35.</w:t>
-            </w:r>
-            <w:proofErr w:type="gramStart"/>
-            <w:r>
-              <w:t>71,-</w:t>
-            </w:r>
-            <w:proofErr w:type="gramEnd"/>
-            <w:r>
-              <w:t>79.81,0.</w:t>
-            </w:r>
-            <w:proofErr w:type="gramStart"/>
-            <w:r>
-              <w:t>14,-</w:t>
-            </w:r>
-            <w:proofErr w:type="gramEnd"/>
-            <w:r>
-              <w:t>0.79,0.</w:t>
-            </w:r>
-            <w:proofErr w:type="gramStart"/>
-            <w:r>
-              <w:t>58,NA</w:t>
-            </w:r>
-            <w:proofErr w:type="gramEnd"/>
-            <w:r>
-              <w:t>,US,"Asheboro, NC</w:t>
-            </w:r>
-            <w:proofErr w:type="gramStart"/>
-            <w:r>
-              <w:t>",NA</w:t>
-            </w:r>
-            <w:proofErr w:type="gramEnd"/>
-            <w:r>
-              <w:t>-US-NC-</w:t>
-            </w:r>
-            <w:proofErr w:type="gramStart"/>
-            <w:r>
-              <w:t>ASHEBORO,FALSE</w:t>
-            </w:r>
-            <w:proofErr w:type="gramEnd"/>
-            <w:r>
-              <w:t>,8355,15228,215474318,</w:t>
-            </w:r>
-          </w:p>
-          <w:p>
-            <w:pPr>
-              <w:widowControl w:val="0"/>
-              <w:spacing w:line="240" w:lineRule="auto"/>
-              <w:jc w:val="both"/>
-            </w:pPr>
-            <w:r>
-              <w:t>76513,</w:t>
-            </w:r>
-            <w:proofErr w:type="gramStart"/>
-            <w:r>
-              <w:t>27204,PO</w:t>
-            </w:r>
-            <w:proofErr w:type="gramEnd"/>
-            <w:r>
-              <w:t xml:space="preserve"> </w:t>
-            </w:r>
-            <w:proofErr w:type="gramStart"/>
-            <w:r>
-              <w:t>BOX,ASHEBORO</w:t>
-            </w:r>
-            <w:proofErr w:type="gramEnd"/>
-            <w:r>
-              <w:t>,</w:t>
-            </w:r>
-            <w:proofErr w:type="gramStart"/>
-            <w:r>
-              <w:t>NC,PRIMARY</w:t>
-            </w:r>
-            <w:proofErr w:type="gramEnd"/>
-            <w:r>
-              <w:t>,35.</w:t>
-            </w:r>
-            <w:proofErr w:type="gramStart"/>
-            <w:r>
-              <w:t>71,-</w:t>
-            </w:r>
-            <w:proofErr w:type="gramEnd"/>
-            <w:r>
-              <w:t>79.81,0.</w:t>
-            </w:r>
-            <w:proofErr w:type="gramStart"/>
-            <w:r>
-              <w:t>14,-</w:t>
-            </w:r>
-            <w:proofErr w:type="gramEnd"/>
-            <w:r>
-              <w:t>0.79,0.</w:t>
-            </w:r>
-            <w:proofErr w:type="gramStart"/>
-            <w:r>
-              <w:t>58,NA</w:t>
-            </w:r>
-            <w:proofErr w:type="gramEnd"/>
-            <w:r>
-              <w:t>,US,"Asheboro, NC</w:t>
-            </w:r>
-            <w:proofErr w:type="gramStart"/>
-            <w:r>
-              <w:t>",NA</w:t>
-            </w:r>
-            <w:proofErr w:type="gramEnd"/>
-            <w:r>
-              <w:t>-US-NC-</w:t>
-            </w:r>
-            <w:proofErr w:type="gramStart"/>
-            <w:r>
-              <w:t>ASHEBORO,FALSE</w:t>
-            </w:r>
-            <w:proofErr w:type="gramEnd"/>
-            <w:r>
-              <w:t>,1035,1816,30322473,</w:t>
+              <w:t>, PR",NA-US-PR-SECT LANAUSSE,FALSE,,,,</w:t>
+            </w:r>
+          </w:p>
+          <w:p>
+            <w:pPr>
+              <w:widowControl w:val="0"/>
+              <w:spacing w:line="240" w:lineRule="auto"/>
+              <w:jc w:val="both"/>
+            </w:pPr>
+            <w:r>
+              <w:t>54354,36275,PO BOX,SPRING GARDEN,AL,PRIMARY,33.97,-85.55,0.06,-0.82,0.55,NA,US,"Spring Garden, AL",NA-US-AL-SPRING GARDEN,FALSE,,,,</w:t>
+            </w:r>
+          </w:p>
+          <w:p>
+            <w:pPr>
+              <w:widowControl w:val="0"/>
+              <w:spacing w:line="240" w:lineRule="auto"/>
+              <w:jc w:val="both"/>
+            </w:pPr>
+            <w:r>
+              <w:t>54355,35146,STANDARD,SPRINGVILLE,AL,PRIMARY,33.77,-86.47,0.05,-0.82,0.55,NA,US,"Springville, AL",NA-US-AL-SPRINGVILLE,FALSE,4046,7845,172127599,</w:t>
+            </w:r>
+          </w:p>
+          <w:p>
+            <w:pPr>
+              <w:widowControl w:val="0"/>
+              <w:spacing w:line="240" w:lineRule="auto"/>
+              <w:jc w:val="both"/>
+            </w:pPr>
+            <w:r>
+              <w:t>54356,35585,STANDARD,SPRUCE PINE,AL,PRIMARY,34.37,-87.69,0.03,-0.82,0.56,NA,US,"Spruce Pine, AL",NA-US-AL-SPRUCE PINE,FALSE,610,1209,18525517,</w:t>
+            </w:r>
+          </w:p>
+          <w:p>
+            <w:pPr>
+              <w:widowControl w:val="0"/>
+              <w:spacing w:line="240" w:lineRule="auto"/>
+              <w:jc w:val="both"/>
+            </w:pPr>
+            <w:r>
+              <w:t>76511,27007,STANDARD,ASH HILL,NC,NOT ACCEPTABLE,36.4,-80.56,0.13,-0.79,0.59,NA,US,"Ash Hill, NC",NA-US-NC-ASH HILL,FALSE,842,1666,28876493,</w:t>
+            </w:r>
+          </w:p>
+          <w:p>
+            <w:pPr>
+              <w:widowControl w:val="0"/>
+              <w:spacing w:line="240" w:lineRule="auto"/>
+              <w:jc w:val="both"/>
+            </w:pPr>
+            <w:r>
+              <w:t>76512,27203,STANDARD,ASHEBORO,NC,PRIMARY,35.71,-79.81,0.14,-0.79,0.58,NA,US,"Asheboro, NC",NA-US-NC-ASHEBORO,FALSE,8355,15228,215474318,</w:t>
+            </w:r>
+          </w:p>
+          <w:p>
+            <w:pPr>
+              <w:widowControl w:val="0"/>
+              <w:spacing w:line="240" w:lineRule="auto"/>
+              <w:jc w:val="both"/>
+            </w:pPr>
+            <w:r>
+              <w:t>76513,27204,PO BOX,ASHEBORO,NC,PRIMARY,35.71,-79.81,0.14,-0.79,0.58,NA,US,"Asheboro, NC",NA-US-NC-ASHEBORO,FALSE,1035,1816,30322473,</w:t>
             </w:r>
           </w:p>
           <w:p>
@@ -3267,7 +1945,6 @@
               <w:t xml:space="preserve"> </w:t>
             </w:r>
             <w:proofErr w:type="spellStart"/>
-            <w:proofErr w:type="gramStart"/>
             <w:r>
               <w:t>smallint</w:t>
             </w:r>
@@ -3275,7 +1952,6 @@
             <w:r>
               <w:t xml:space="preserve"> ,</w:t>
             </w:r>
-            <w:proofErr w:type="gramEnd"/>
           </w:p>
           <w:p>
             <w:pPr>
@@ -3448,14 +2124,9 @@
               <w:jc w:val="both"/>
             </w:pPr>
             <w:r>
-              <w:t>select TRY_</w:t>
-            </w:r>
-            <w:proofErr w:type="gramStart"/>
-            <w:r>
-              <w:t>CAST(</w:t>
+              <w:t>select TRY_CAST(</w:t>
             </w:r>
             <w:proofErr w:type="spellStart"/>
-            <w:proofErr w:type="gramEnd"/>
             <w:r>
               <w:t>venueid</w:t>
             </w:r>
@@ -3464,32 +2135,14 @@
               <w:t xml:space="preserve"> AS INTEGER) as </w:t>
             </w:r>
             <w:proofErr w:type="spellStart"/>
-            <w:proofErr w:type="gramStart"/>
-            <w:r>
-              <w:t>venueid,venuename</w:t>
-            </w:r>
-            <w:proofErr w:type="gramEnd"/>
-            <w:r>
-              <w:t>,</w:t>
-            </w:r>
-            <w:proofErr w:type="gramStart"/>
-            <w:r>
-              <w:t>venuecity,venuestate</w:t>
-            </w:r>
-            <w:proofErr w:type="gramEnd"/>
-            <w:r>
-              <w:t>,TRY_</w:t>
-            </w:r>
-            <w:proofErr w:type="gramStart"/>
-            <w:r>
-              <w:t>CAST</w:t>
+            <w:r>
+              <w:t>venueid,venuename,venuecity,venuestate,TRY_CAST</w:t>
             </w:r>
             <w:proofErr w:type="spellEnd"/>
             <w:r>
               <w:t>(</w:t>
             </w:r>
             <w:proofErr w:type="spellStart"/>
-            <w:proofErr w:type="gramEnd"/>
             <w:r>
               <w:t>venueseats</w:t>
             </w:r>
@@ -3552,12 +2205,71 @@
         <w:jc w:val="both"/>
         <w:rPr>
           <w:b/>
-        </w:rPr>
-      </w:pPr>
-      <w:r>
-        <w:rPr>
-          <w:b/>
-        </w:rPr>
+          <w:bCs/>
+          <w:lang w:val="en-US"/>
+        </w:rPr>
+      </w:pPr>
+      <w:r>
+        <w:rPr>
+          <w:b/>
+          <w:bCs/>
+          <w:lang w:val="en-US"/>
+        </w:rPr>
+        <w:t xml:space="preserve">1. What </w:t>
+      </w:r>
+      <w:r>
+        <w:rPr>
+          <w:b/>
+          <w:bCs/>
+          <w:lang w:val="en-US"/>
+        </w:rPr>
+        <w:t xml:space="preserve">is Glue and Athena? </w:t>
+      </w:r>
+    </w:p>
+    <w:p>
+      <w:pPr>
+        <w:jc w:val="both"/>
+        <w:rPr>
+          <w:bCs/>
+          <w:lang w:val="en-US"/>
+        </w:rPr>
+      </w:pPr>
+      <w:r>
+        <w:rPr>
+          <w:bCs/>
+          <w:lang w:val="en-US"/>
+        </w:rPr>
+        <w:t>This documentation introduces AWS Glue Data Catalog, Glue Crawlers, manual table creation, AWS Glue ETL Jobs, CSV-to-Parquet conversion, Amazon Athena, and schema/type conversion using SQL. The Glue Data Catalog stores metadata about datasets, including table names, column names, data types, and S3 locations. Glue Crawlers automatically discover schemas from files in S3, while manual table creation allows us to define the schema and file format ourselves. AWS Glue ETL Jobs process data and can convert CSV files into Parquet, a column-oriented format that is often more efficient for analytical queries. Amazon Athena is a serverless query service that allows us to run SQL directly against data stored in S3. The TRY_CAST() function in Athena attempts to convert values into a specified data type and returns NULL when a conversion fails, helping handle incompatible values without failing the entire query.</w:t>
+      </w:r>
+    </w:p>
+    <w:p>
+      <w:pPr>
+        <w:jc w:val="both"/>
+        <w:rPr>
+          <w:b/>
+        </w:rPr>
+      </w:pPr>
+    </w:p>
+    <w:p>
+      <w:pPr>
+        <w:jc w:val="both"/>
+        <w:rPr>
+          <w:b/>
+        </w:rPr>
+      </w:pPr>
+    </w:p>
+    <w:p>
+      <w:pPr>
+        <w:jc w:val="both"/>
+        <w:rPr>
+          <w:b/>
+        </w:rPr>
+      </w:pPr>
+      <w:r>
+        <w:rPr>
+          <w:b/>
+        </w:rPr>
+        <w:lastRenderedPageBreak/>
         <w:t>Conclusion/ Summary</w:t>
       </w:r>
     </w:p>
@@ -3580,21 +2292,7 @@
         <w:rPr>
           <w:bCs/>
         </w:rPr>
-        <w:t>In this lab, we learned how to use AWS Glue, Amazon S3, and Amazon Athena to build a simple ETL workflow. First, we created an S3 bucket and organized the data into folders. We created a Glue database named bootcamp and registered tables using both crawlers and manual table creation. Next, we created a Glue ETL job to transform CSV data into Parquet format and store the output in S3. We then used a crawler to create a table for the transformed data. Finally, we queried the tables using Athena and practiced TRY_</w:t>
-      </w:r>
-      <w:proofErr w:type="gramStart"/>
-      <w:r>
-        <w:rPr>
-          <w:bCs/>
-        </w:rPr>
-        <w:t>CAST(</w:t>
-      </w:r>
-      <w:proofErr w:type="gramEnd"/>
-      <w:r>
-        <w:rPr>
-          <w:bCs/>
-        </w:rPr>
-        <w:t xml:space="preserve">) to convert column values into appropriate data types. This lab demonstrates how AWS services work together to </w:t>
+        <w:t xml:space="preserve">In this lab, we learned how to use AWS Glue, Amazon S3, and Amazon Athena to build a simple ETL workflow. First, we created an S3 bucket and organized the data into folders. We created a Glue database named bootcamp and registered tables using both crawlers and manual table creation. Next, we created a Glue ETL job to transform CSV data into Parquet format and store the output in S3. We then used a crawler to create a table for the transformed data. Finally, we queried the tables using Athena and practiced TRY_CAST() to convert column values into appropriate data types. This lab demonstrates how AWS services work together to </w:t>
       </w:r>
       <w:proofErr w:type="spellStart"/>
       <w:r>

</xml_diff>

<commit_message>
How Do S3, Glue and Athena Work Together for ETL ?
</commit_message>
<xml_diff>
--- a/New folder/AWS Glue, S3 with Athena - Doc 3.docx
+++ b/New folder/AWS Glue, S3 with Athena - Doc 3.docx
@@ -387,7 +387,27 @@
           <w:szCs w:val="21"/>
           <w:highlight w:val="white"/>
         </w:rPr>
-        <w:t>It is similar to hive database and table hierarchy</w:t>
+        <w:t xml:space="preserve">It is </w:t>
+      </w:r>
+      <w:proofErr w:type="gramStart"/>
+      <w:r>
+        <w:rPr>
+          <w:rFonts w:ascii="Roboto" w:eastAsia="Roboto" w:hAnsi="Roboto" w:cs="Roboto"/>
+          <w:sz w:val="21"/>
+          <w:szCs w:val="21"/>
+          <w:highlight w:val="white"/>
+        </w:rPr>
+        <w:t>similar to</w:t>
+      </w:r>
+      <w:proofErr w:type="gramEnd"/>
+      <w:r>
+        <w:rPr>
+          <w:rFonts w:ascii="Roboto" w:eastAsia="Roboto" w:hAnsi="Roboto" w:cs="Roboto"/>
+          <w:sz w:val="21"/>
+          <w:szCs w:val="21"/>
+          <w:highlight w:val="white"/>
+        </w:rPr>
+        <w:t xml:space="preserve"> hive database and table hierarchy</w:t>
       </w:r>
     </w:p>
     <w:p>
@@ -509,7 +529,27 @@
           <w:szCs w:val="21"/>
           <w:highlight w:val="white"/>
         </w:rPr>
-        <w:t>. So zip codes will be your table name</w:t>
+        <w:t xml:space="preserve">. </w:t>
+      </w:r>
+      <w:proofErr w:type="gramStart"/>
+      <w:r>
+        <w:rPr>
+          <w:rFonts w:ascii="Roboto" w:eastAsia="Roboto" w:hAnsi="Roboto" w:cs="Roboto"/>
+          <w:sz w:val="21"/>
+          <w:szCs w:val="21"/>
+          <w:highlight w:val="white"/>
+        </w:rPr>
+        <w:t>So</w:t>
+      </w:r>
+      <w:proofErr w:type="gramEnd"/>
+      <w:r>
+        <w:rPr>
+          <w:rFonts w:ascii="Roboto" w:eastAsia="Roboto" w:hAnsi="Roboto" w:cs="Roboto"/>
+          <w:sz w:val="21"/>
+          <w:szCs w:val="21"/>
+          <w:highlight w:val="white"/>
+        </w:rPr>
+        <w:t xml:space="preserve"> zip codes will be your table name</w:t>
       </w:r>
     </w:p>
     <w:p>
@@ -915,7 +955,15 @@
         <w:jc w:val="both"/>
       </w:pPr>
       <w:r>
-        <w:t xml:space="preserve">Select any already created table as data source, So select </w:t>
+        <w:t xml:space="preserve">Select any already created table as data source, </w:t>
+      </w:r>
+      <w:proofErr w:type="gramStart"/>
+      <w:r>
+        <w:t>So</w:t>
+      </w:r>
+      <w:proofErr w:type="gramEnd"/>
+      <w:r>
+        <w:t xml:space="preserve"> select </w:t>
       </w:r>
       <w:proofErr w:type="spellStart"/>
       <w:r>
@@ -1227,9 +1275,83 @@
               <w:spacing w:line="240" w:lineRule="auto"/>
               <w:jc w:val="both"/>
             </w:pPr>
-            <w:r>
-              <w:t>RecordNumber,Zipcode,ZipCodeType,City,State,LocationType,Lat,Long,Xaxis,Yaxis,Zaxis,WorldRegion,Country,LocationText,Location,Decommisioned,TaxReturnsFiled,EstimatedPopulation,TotalWages,Notes</w:t>
-            </w:r>
+            <w:proofErr w:type="gramStart"/>
+            <w:r>
+              <w:t>RecordNumber,Zipcode</w:t>
+            </w:r>
+            <w:proofErr w:type="gramEnd"/>
+            <w:r>
+              <w:t>,</w:t>
+            </w:r>
+            <w:proofErr w:type="gramStart"/>
+            <w:r>
+              <w:t>ZipCodeType,City</w:t>
+            </w:r>
+            <w:proofErr w:type="gramEnd"/>
+            <w:r>
+              <w:t>,</w:t>
+            </w:r>
+            <w:proofErr w:type="gramStart"/>
+            <w:r>
+              <w:t>State,LocationType</w:t>
+            </w:r>
+            <w:proofErr w:type="gramEnd"/>
+            <w:r>
+              <w:t>,</w:t>
+            </w:r>
+            <w:proofErr w:type="gramStart"/>
+            <w:r>
+              <w:t>Lat,Long</w:t>
+            </w:r>
+            <w:proofErr w:type="gramEnd"/>
+            <w:r>
+              <w:t>,</w:t>
+            </w:r>
+            <w:proofErr w:type="gramStart"/>
+            <w:r>
+              <w:t>Xaxis,Yaxis</w:t>
+            </w:r>
+            <w:proofErr w:type="gramEnd"/>
+            <w:r>
+              <w:t>,</w:t>
+            </w:r>
+            <w:proofErr w:type="gramStart"/>
+            <w:r>
+              <w:t>Zaxis,WorldRegion</w:t>
+            </w:r>
+            <w:proofErr w:type="gramEnd"/>
+            <w:r>
+              <w:t>,</w:t>
+            </w:r>
+            <w:proofErr w:type="gramStart"/>
+            <w:r>
+              <w:t>Country,LocationText</w:t>
+            </w:r>
+            <w:proofErr w:type="gramEnd"/>
+            <w:r>
+              <w:t>,</w:t>
+            </w:r>
+            <w:proofErr w:type="gramStart"/>
+            <w:r>
+              <w:t>Location,Decommisioned</w:t>
+            </w:r>
+            <w:proofErr w:type="gramEnd"/>
+            <w:r>
+              <w:t>,</w:t>
+            </w:r>
+            <w:proofErr w:type="gramStart"/>
+            <w:r>
+              <w:t>TaxReturnsFiled,EstimatedPopulation</w:t>
+            </w:r>
+            <w:proofErr w:type="gramEnd"/>
+            <w:r>
+              <w:t>,</w:t>
+            </w:r>
+            <w:proofErr w:type="gramStart"/>
+            <w:r>
+              <w:t>TotalWages,Notes</w:t>
+            </w:r>
+            <w:proofErr w:type="gramEnd"/>
           </w:p>
           <w:p>
             <w:pPr>
@@ -1237,9 +1359,59 @@
               <w:spacing w:line="240" w:lineRule="auto"/>
               <w:jc w:val="both"/>
             </w:pPr>
-            <w:r>
-              <w:t>1,704,STANDARD,PARC PARQUE,PR,NOT ACCEPTABLE,17.96,-66.22,0.38,-0.87,0.3,NA,US,"Parc Parque, PR",NA-US-PR-PARC PARQUE,FALSE,,,,</w:t>
-            </w:r>
+            <w:proofErr w:type="gramStart"/>
+            <w:r>
+              <w:t>1,704,STANDARD</w:t>
+            </w:r>
+            <w:proofErr w:type="gramEnd"/>
+            <w:r>
+              <w:t xml:space="preserve">,PARC </w:t>
+            </w:r>
+            <w:proofErr w:type="gramStart"/>
+            <w:r>
+              <w:t>PARQUE,PR</w:t>
+            </w:r>
+            <w:proofErr w:type="gramEnd"/>
+            <w:r>
+              <w:t>,NOT ACCEPTABLE,17.</w:t>
+            </w:r>
+            <w:proofErr w:type="gramStart"/>
+            <w:r>
+              <w:t>96,-</w:t>
+            </w:r>
+            <w:proofErr w:type="gramEnd"/>
+            <w:r>
+              <w:t>66.22,0.</w:t>
+            </w:r>
+            <w:proofErr w:type="gramStart"/>
+            <w:r>
+              <w:t>38,-</w:t>
+            </w:r>
+            <w:proofErr w:type="gramEnd"/>
+            <w:r>
+              <w:t>0.87,0.</w:t>
+            </w:r>
+            <w:proofErr w:type="gramStart"/>
+            <w:r>
+              <w:t>3,NA</w:t>
+            </w:r>
+            <w:proofErr w:type="gramEnd"/>
+            <w:r>
+              <w:t>,US,"Parc Parque, PR</w:t>
+            </w:r>
+            <w:proofErr w:type="gramStart"/>
+            <w:r>
+              <w:t>",NA</w:t>
+            </w:r>
+            <w:proofErr w:type="gramEnd"/>
+            <w:r>
+              <w:t xml:space="preserve">-US-PR-PARC </w:t>
+            </w:r>
+            <w:proofErr w:type="gramStart"/>
+            <w:r>
+              <w:t>PARQUE,FALSE,,,,</w:t>
+            </w:r>
+            <w:proofErr w:type="gramEnd"/>
           </w:p>
           <w:p>
             <w:pPr>
@@ -1247,9 +1419,59 @@
               <w:spacing w:line="240" w:lineRule="auto"/>
               <w:jc w:val="both"/>
             </w:pPr>
-            <w:r>
-              <w:t>2,704,STANDARD,PASEO COSTA DEL SUR,PR,NOT ACCEPTABLE,17.96,-66.22,0.38,-0.87,0.3,NA,US,"Paseo Costa Del Sur, PR",NA-US-PR-PASEO COSTA DEL SUR,FALSE,,,,</w:t>
-            </w:r>
+            <w:proofErr w:type="gramStart"/>
+            <w:r>
+              <w:t>2,704,STANDARD</w:t>
+            </w:r>
+            <w:proofErr w:type="gramEnd"/>
+            <w:r>
+              <w:t xml:space="preserve">,PASEO COSTA DEL </w:t>
+            </w:r>
+            <w:proofErr w:type="gramStart"/>
+            <w:r>
+              <w:t>SUR,PR</w:t>
+            </w:r>
+            <w:proofErr w:type="gramEnd"/>
+            <w:r>
+              <w:t>,NOT ACCEPTABLE,17.</w:t>
+            </w:r>
+            <w:proofErr w:type="gramStart"/>
+            <w:r>
+              <w:t>96,-</w:t>
+            </w:r>
+            <w:proofErr w:type="gramEnd"/>
+            <w:r>
+              <w:t>66.22,0.</w:t>
+            </w:r>
+            <w:proofErr w:type="gramStart"/>
+            <w:r>
+              <w:t>38,-</w:t>
+            </w:r>
+            <w:proofErr w:type="gramEnd"/>
+            <w:r>
+              <w:t>0.87,0.</w:t>
+            </w:r>
+            <w:proofErr w:type="gramStart"/>
+            <w:r>
+              <w:t>3,NA</w:t>
+            </w:r>
+            <w:proofErr w:type="gramEnd"/>
+            <w:r>
+              <w:t>,US,"Paseo Costa Del Sur, PR</w:t>
+            </w:r>
+            <w:proofErr w:type="gramStart"/>
+            <w:r>
+              <w:t>",NA</w:t>
+            </w:r>
+            <w:proofErr w:type="gramEnd"/>
+            <w:r>
+              <w:t xml:space="preserve">-US-PR-PASEO COSTA DEL </w:t>
+            </w:r>
+            <w:proofErr w:type="gramStart"/>
+            <w:r>
+              <w:t>SUR,FALSE,,,,</w:t>
+            </w:r>
+            <w:proofErr w:type="gramEnd"/>
           </w:p>
           <w:p>
             <w:pPr>
@@ -1257,9 +1479,59 @@
               <w:spacing w:line="240" w:lineRule="auto"/>
               <w:jc w:val="both"/>
             </w:pPr>
-            <w:r>
-              <w:t>10,709,STANDARD,BDA SAN LUIS,PR,NOT ACCEPTABLE,18.14,-66.26,0.38,-0.86,0.31,NA,US,"Bda San Luis, PR",NA-US-PR-BDA SAN LUIS,FALSE,,,,</w:t>
-            </w:r>
+            <w:proofErr w:type="gramStart"/>
+            <w:r>
+              <w:t>10,709,STANDARD</w:t>
+            </w:r>
+            <w:proofErr w:type="gramEnd"/>
+            <w:r>
+              <w:t xml:space="preserve">,BDA SAN </w:t>
+            </w:r>
+            <w:proofErr w:type="gramStart"/>
+            <w:r>
+              <w:t>LUIS,PR</w:t>
+            </w:r>
+            <w:proofErr w:type="gramEnd"/>
+            <w:r>
+              <w:t>,NOT ACCEPTABLE,18.</w:t>
+            </w:r>
+            <w:proofErr w:type="gramStart"/>
+            <w:r>
+              <w:t>14,-</w:t>
+            </w:r>
+            <w:proofErr w:type="gramEnd"/>
+            <w:r>
+              <w:t>66.26,0.</w:t>
+            </w:r>
+            <w:proofErr w:type="gramStart"/>
+            <w:r>
+              <w:t>38,-</w:t>
+            </w:r>
+            <w:proofErr w:type="gramEnd"/>
+            <w:r>
+              <w:t>0.86,0.</w:t>
+            </w:r>
+            <w:proofErr w:type="gramStart"/>
+            <w:r>
+              <w:t>31,NA</w:t>
+            </w:r>
+            <w:proofErr w:type="gramEnd"/>
+            <w:r>
+              <w:t>,US,"Bda San Luis, PR</w:t>
+            </w:r>
+            <w:proofErr w:type="gramStart"/>
+            <w:r>
+              <w:t>",NA</w:t>
+            </w:r>
+            <w:proofErr w:type="gramEnd"/>
+            <w:r>
+              <w:t xml:space="preserve">-US-PR-BDA SAN </w:t>
+            </w:r>
+            <w:proofErr w:type="gramStart"/>
+            <w:r>
+              <w:t>LUIS,FALSE,,,,</w:t>
+            </w:r>
+            <w:proofErr w:type="gramEnd"/>
           </w:p>
           <w:p>
             <w:pPr>
@@ -1268,8 +1540,69 @@
               <w:jc w:val="both"/>
             </w:pPr>
             <w:r>
-              <w:t>61391,76166,UNIQUE,CINGULAR WIRELESS,TX,NOT ACCEPTABLE,32.72,-97.31,-0.1,-0.83,0.54,NA,US,"Cingular Wireless, TX",NA-US-TX-CINGULAR WIRELESS,FALSE,,,,</w:t>
-            </w:r>
+              <w:t>61391,</w:t>
+            </w:r>
+            <w:proofErr w:type="gramStart"/>
+            <w:r>
+              <w:t>76166,UNIQUE</w:t>
+            </w:r>
+            <w:proofErr w:type="gramEnd"/>
+            <w:r>
+              <w:t xml:space="preserve">,CINGULAR </w:t>
+            </w:r>
+            <w:proofErr w:type="gramStart"/>
+            <w:r>
+              <w:t>WIRELESS,TX</w:t>
+            </w:r>
+            <w:proofErr w:type="gramEnd"/>
+            <w:r>
+              <w:t>,NOT ACCEPTABLE,32.</w:t>
+            </w:r>
+            <w:proofErr w:type="gramStart"/>
+            <w:r>
+              <w:t>72,-</w:t>
+            </w:r>
+            <w:proofErr w:type="gramEnd"/>
+            <w:r>
+              <w:t>97.</w:t>
+            </w:r>
+            <w:proofErr w:type="gramStart"/>
+            <w:r>
+              <w:t>31,-</w:t>
+            </w:r>
+            <w:proofErr w:type="gramEnd"/>
+            <w:r>
+              <w:t>0.</w:t>
+            </w:r>
+            <w:proofErr w:type="gramStart"/>
+            <w:r>
+              <w:t>1,-</w:t>
+            </w:r>
+            <w:proofErr w:type="gramEnd"/>
+            <w:r>
+              <w:t>0.83,0.</w:t>
+            </w:r>
+            <w:proofErr w:type="gramStart"/>
+            <w:r>
+              <w:t>54,NA</w:t>
+            </w:r>
+            <w:proofErr w:type="gramEnd"/>
+            <w:r>
+              <w:t>,US,"Cingular Wireless, TX</w:t>
+            </w:r>
+            <w:proofErr w:type="gramStart"/>
+            <w:r>
+              <w:t>",NA</w:t>
+            </w:r>
+            <w:proofErr w:type="gramEnd"/>
+            <w:r>
+              <w:t xml:space="preserve">-US-TX-CINGULAR </w:t>
+            </w:r>
+            <w:proofErr w:type="gramStart"/>
+            <w:r>
+              <w:t>WIRELESS,FALSE,,,,</w:t>
+            </w:r>
+            <w:proofErr w:type="gramEnd"/>
           </w:p>
           <w:p>
             <w:pPr>
@@ -1278,7 +1611,71 @@
               <w:jc w:val="both"/>
             </w:pPr>
             <w:r>
-              <w:t>61392,76177,STANDARD,FORT WORTH,TX,PRIMARY,32.75,-97.33,-0.1,-0.83,0.54,NA,US,"Fort Worth, TX",NA-US-TX-FORT WORTH,FALSE,2126,4053,122396986,</w:t>
+              <w:t>61392,</w:t>
+            </w:r>
+            <w:proofErr w:type="gramStart"/>
+            <w:r>
+              <w:t>76177,STANDARD</w:t>
+            </w:r>
+            <w:proofErr w:type="gramEnd"/>
+            <w:r>
+              <w:t xml:space="preserve">,FORT </w:t>
+            </w:r>
+            <w:proofErr w:type="gramStart"/>
+            <w:r>
+              <w:t>WORTH,TX</w:t>
+            </w:r>
+            <w:proofErr w:type="gramEnd"/>
+            <w:r>
+              <w:t>,PRIMARY,32.</w:t>
+            </w:r>
+            <w:proofErr w:type="gramStart"/>
+            <w:r>
+              <w:t>75,-</w:t>
+            </w:r>
+            <w:proofErr w:type="gramEnd"/>
+            <w:r>
+              <w:t>97.</w:t>
+            </w:r>
+            <w:proofErr w:type="gramStart"/>
+            <w:r>
+              <w:t>33,-</w:t>
+            </w:r>
+            <w:proofErr w:type="gramEnd"/>
+            <w:r>
+              <w:t>0.</w:t>
+            </w:r>
+            <w:proofErr w:type="gramStart"/>
+            <w:r>
+              <w:t>1,-</w:t>
+            </w:r>
+            <w:proofErr w:type="gramEnd"/>
+            <w:r>
+              <w:t>0.83,0.</w:t>
+            </w:r>
+            <w:proofErr w:type="gramStart"/>
+            <w:r>
+              <w:t>54,NA</w:t>
+            </w:r>
+            <w:proofErr w:type="gramEnd"/>
+            <w:r>
+              <w:t>,US,"Fort Worth, TX</w:t>
+            </w:r>
+            <w:proofErr w:type="gramStart"/>
+            <w:r>
+              <w:t>",NA</w:t>
+            </w:r>
+            <w:proofErr w:type="gramEnd"/>
+            <w:r>
+              <w:t xml:space="preserve">-US-TX-FORT </w:t>
+            </w:r>
+            <w:proofErr w:type="gramStart"/>
+            <w:r>
+              <w:t>WORTH,FALSE</w:t>
+            </w:r>
+            <w:proofErr w:type="gramEnd"/>
+            <w:r>
+              <w:t>,2126,4053,122396986,</w:t>
             </w:r>
           </w:p>
           <w:p>
@@ -1288,7 +1685,71 @@
               <w:jc w:val="both"/>
             </w:pPr>
             <w:r>
-              <w:t>61393,76177,STANDARD,FT WORTH,TX,ACCEPTABLE,32.75,-97.33,-0.1,-0.83,0.54,NA,US,"Ft Worth, TX",NA-US-TX-FT WORTH,FALSE,2126,4053,122396986,</w:t>
+              <w:t>61393,</w:t>
+            </w:r>
+            <w:proofErr w:type="gramStart"/>
+            <w:r>
+              <w:t>76177,STANDARD</w:t>
+            </w:r>
+            <w:proofErr w:type="gramEnd"/>
+            <w:r>
+              <w:t xml:space="preserve">,FT </w:t>
+            </w:r>
+            <w:proofErr w:type="gramStart"/>
+            <w:r>
+              <w:t>WORTH,TX</w:t>
+            </w:r>
+            <w:proofErr w:type="gramEnd"/>
+            <w:r>
+              <w:t>,ACCEPTABLE,32.</w:t>
+            </w:r>
+            <w:proofErr w:type="gramStart"/>
+            <w:r>
+              <w:t>75,-</w:t>
+            </w:r>
+            <w:proofErr w:type="gramEnd"/>
+            <w:r>
+              <w:t>97.</w:t>
+            </w:r>
+            <w:proofErr w:type="gramStart"/>
+            <w:r>
+              <w:t>33,-</w:t>
+            </w:r>
+            <w:proofErr w:type="gramEnd"/>
+            <w:r>
+              <w:t>0.</w:t>
+            </w:r>
+            <w:proofErr w:type="gramStart"/>
+            <w:r>
+              <w:t>1,-</w:t>
+            </w:r>
+            <w:proofErr w:type="gramEnd"/>
+            <w:r>
+              <w:t>0.83,0.</w:t>
+            </w:r>
+            <w:proofErr w:type="gramStart"/>
+            <w:r>
+              <w:t>54,NA</w:t>
+            </w:r>
+            <w:proofErr w:type="gramEnd"/>
+            <w:r>
+              <w:t>,US,"Ft Worth, TX</w:t>
+            </w:r>
+            <w:proofErr w:type="gramStart"/>
+            <w:r>
+              <w:t>",NA</w:t>
+            </w:r>
+            <w:proofErr w:type="gramEnd"/>
+            <w:r>
+              <w:t xml:space="preserve">-US-TX-FT </w:t>
+            </w:r>
+            <w:proofErr w:type="gramStart"/>
+            <w:r>
+              <w:t>WORTH,FALSE</w:t>
+            </w:r>
+            <w:proofErr w:type="gramEnd"/>
+            <w:r>
+              <w:t>,2126,4053,122396986,</w:t>
             </w:r>
           </w:p>
           <w:p>
@@ -1297,9 +1758,59 @@
               <w:spacing w:line="240" w:lineRule="auto"/>
               <w:jc w:val="both"/>
             </w:pPr>
-            <w:r>
-              <w:t>4,704,STANDARD,URB EUGENE RICE,PR,NOT ACCEPTABLE,17.96,-66.22,0.38,-0.87,0.3,NA,US,"Urb Eugene Rice, PR",NA-US-PR-URB EUGENE RICE,FALSE,,,,</w:t>
-            </w:r>
+            <w:proofErr w:type="gramStart"/>
+            <w:r>
+              <w:t>4,704,STANDARD</w:t>
+            </w:r>
+            <w:proofErr w:type="gramEnd"/>
+            <w:r>
+              <w:t xml:space="preserve">,URB EUGENE </w:t>
+            </w:r>
+            <w:proofErr w:type="gramStart"/>
+            <w:r>
+              <w:t>RICE,PR</w:t>
+            </w:r>
+            <w:proofErr w:type="gramEnd"/>
+            <w:r>
+              <w:t>,NOT ACCEPTABLE,17.</w:t>
+            </w:r>
+            <w:proofErr w:type="gramStart"/>
+            <w:r>
+              <w:t>96,-</w:t>
+            </w:r>
+            <w:proofErr w:type="gramEnd"/>
+            <w:r>
+              <w:t>66.22,0.</w:t>
+            </w:r>
+            <w:proofErr w:type="gramStart"/>
+            <w:r>
+              <w:t>38,-</w:t>
+            </w:r>
+            <w:proofErr w:type="gramEnd"/>
+            <w:r>
+              <w:t>0.87,0.</w:t>
+            </w:r>
+            <w:proofErr w:type="gramStart"/>
+            <w:r>
+              <w:t>3,NA</w:t>
+            </w:r>
+            <w:proofErr w:type="gramEnd"/>
+            <w:r>
+              <w:t>,US,"Urb Eugene Rice, PR</w:t>
+            </w:r>
+            <w:proofErr w:type="gramStart"/>
+            <w:r>
+              <w:t>",NA</w:t>
+            </w:r>
+            <w:proofErr w:type="gramEnd"/>
+            <w:r>
+              <w:t xml:space="preserve">-US-PR-URB EUGENE </w:t>
+            </w:r>
+            <w:proofErr w:type="gramStart"/>
+            <w:r>
+              <w:t>RICE,FALSE,,,,</w:t>
+            </w:r>
+            <w:proofErr w:type="gramEnd"/>
           </w:p>
           <w:p>
             <w:pPr>
@@ -1308,7 +1819,71 @@
               <w:jc w:val="both"/>
             </w:pPr>
             <w:r>
-              <w:t>39827,85209,STANDARD,MESA,AZ,PRIMARY,33.37,-111.64,-0.3,-0.77,0.55,NA,US,"Mesa, AZ",NA-US-AZ-MESA,FALSE,14962,26883,563792730,"no NWS data, "</w:t>
+              <w:t>39827,</w:t>
+            </w:r>
+            <w:proofErr w:type="gramStart"/>
+            <w:r>
+              <w:t>85209,STANDARD</w:t>
+            </w:r>
+            <w:proofErr w:type="gramEnd"/>
+            <w:r>
+              <w:t>,</w:t>
+            </w:r>
+            <w:proofErr w:type="gramStart"/>
+            <w:r>
+              <w:t>MESA,AZ</w:t>
+            </w:r>
+            <w:proofErr w:type="gramEnd"/>
+            <w:r>
+              <w:t>,PRIMARY,33.</w:t>
+            </w:r>
+            <w:proofErr w:type="gramStart"/>
+            <w:r>
+              <w:t>37,-</w:t>
+            </w:r>
+            <w:proofErr w:type="gramEnd"/>
+            <w:r>
+              <w:t>111.</w:t>
+            </w:r>
+            <w:proofErr w:type="gramStart"/>
+            <w:r>
+              <w:t>64,-</w:t>
+            </w:r>
+            <w:proofErr w:type="gramEnd"/>
+            <w:r>
+              <w:t>0.</w:t>
+            </w:r>
+            <w:proofErr w:type="gramStart"/>
+            <w:r>
+              <w:t>3,-</w:t>
+            </w:r>
+            <w:proofErr w:type="gramEnd"/>
+            <w:r>
+              <w:t>0.77,0.</w:t>
+            </w:r>
+            <w:proofErr w:type="gramStart"/>
+            <w:r>
+              <w:t>55,NA</w:t>
+            </w:r>
+            <w:proofErr w:type="gramEnd"/>
+            <w:r>
+              <w:t>,US,"Mesa, AZ</w:t>
+            </w:r>
+            <w:proofErr w:type="gramStart"/>
+            <w:r>
+              <w:t>",NA</w:t>
+            </w:r>
+            <w:proofErr w:type="gramEnd"/>
+            <w:r>
+              <w:t>-US-AZ-</w:t>
+            </w:r>
+            <w:proofErr w:type="gramStart"/>
+            <w:r>
+              <w:t>MESA,FALSE</w:t>
+            </w:r>
+            <w:proofErr w:type="gramEnd"/>
+            <w:r>
+              <w:t>,14962,26883,563792730,"no NWS data, "</w:t>
             </w:r>
           </w:p>
           <w:p>
@@ -1319,7 +1894,71 @@
             </w:pPr>
             <w:r>
               <w:lastRenderedPageBreak/>
-              <w:t>39828,85210,STANDARD,MESA,AZ,PRIMARY,33.38,-111.84,-0.31,-0.77,0.55,NA,US,"Mesa, AZ",NA-US-AZ-MESA,FALSE,14374,25446,471000465,</w:t>
+              <w:t>39828,</w:t>
+            </w:r>
+            <w:proofErr w:type="gramStart"/>
+            <w:r>
+              <w:t>85210,STANDARD</w:t>
+            </w:r>
+            <w:proofErr w:type="gramEnd"/>
+            <w:r>
+              <w:t>,</w:t>
+            </w:r>
+            <w:proofErr w:type="gramStart"/>
+            <w:r>
+              <w:t>MESA,AZ</w:t>
+            </w:r>
+            <w:proofErr w:type="gramEnd"/>
+            <w:r>
+              <w:t>,PRIMARY,33.</w:t>
+            </w:r>
+            <w:proofErr w:type="gramStart"/>
+            <w:r>
+              <w:t>38,-</w:t>
+            </w:r>
+            <w:proofErr w:type="gramEnd"/>
+            <w:r>
+              <w:t>111.</w:t>
+            </w:r>
+            <w:proofErr w:type="gramStart"/>
+            <w:r>
+              <w:t>84,-</w:t>
+            </w:r>
+            <w:proofErr w:type="gramEnd"/>
+            <w:r>
+              <w:t>0.</w:t>
+            </w:r>
+            <w:proofErr w:type="gramStart"/>
+            <w:r>
+              <w:t>31,-</w:t>
+            </w:r>
+            <w:proofErr w:type="gramEnd"/>
+            <w:r>
+              <w:t>0.77,0.</w:t>
+            </w:r>
+            <w:proofErr w:type="gramStart"/>
+            <w:r>
+              <w:t>55,NA</w:t>
+            </w:r>
+            <w:proofErr w:type="gramEnd"/>
+            <w:r>
+              <w:t>,US,"Mesa, AZ</w:t>
+            </w:r>
+            <w:proofErr w:type="gramStart"/>
+            <w:r>
+              <w:t>",NA</w:t>
+            </w:r>
+            <w:proofErr w:type="gramEnd"/>
+            <w:r>
+              <w:t>-US-AZ-</w:t>
+            </w:r>
+            <w:proofErr w:type="gramStart"/>
+            <w:r>
+              <w:t>MESA,FALSE</w:t>
+            </w:r>
+            <w:proofErr w:type="gramEnd"/>
+            <w:r>
+              <w:t>,14374,25446,471000465,</w:t>
             </w:r>
           </w:p>
           <w:p>
@@ -1329,7 +1968,63 @@
               <w:jc w:val="both"/>
             </w:pPr>
             <w:r>
-              <w:t>49345,32046,STANDARD,HILLIARD,FL,PRIMARY,30.69,-81.92,0.12,-0.85,0.51,NA,US,"Hilliard, FL",NA-US-FL-HILLIARD,FALSE,3922,7443,133112149,</w:t>
+              <w:t>49345,</w:t>
+            </w:r>
+            <w:proofErr w:type="gramStart"/>
+            <w:r>
+              <w:t>32046,STANDARD</w:t>
+            </w:r>
+            <w:proofErr w:type="gramEnd"/>
+            <w:r>
+              <w:t>,</w:t>
+            </w:r>
+            <w:proofErr w:type="gramStart"/>
+            <w:r>
+              <w:t>HILLIARD,FL</w:t>
+            </w:r>
+            <w:proofErr w:type="gramEnd"/>
+            <w:r>
+              <w:t>,PRIMARY,30.</w:t>
+            </w:r>
+            <w:proofErr w:type="gramStart"/>
+            <w:r>
+              <w:t>69,-</w:t>
+            </w:r>
+            <w:proofErr w:type="gramEnd"/>
+            <w:r>
+              <w:t>81.92,0.</w:t>
+            </w:r>
+            <w:proofErr w:type="gramStart"/>
+            <w:r>
+              <w:t>12,-</w:t>
+            </w:r>
+            <w:proofErr w:type="gramEnd"/>
+            <w:r>
+              <w:t>0.85,0.</w:t>
+            </w:r>
+            <w:proofErr w:type="gramStart"/>
+            <w:r>
+              <w:t>51,NA</w:t>
+            </w:r>
+            <w:proofErr w:type="gramEnd"/>
+            <w:r>
+              <w:t>,US,"Hilliard, FL</w:t>
+            </w:r>
+            <w:proofErr w:type="gramStart"/>
+            <w:r>
+              <w:t>",NA</w:t>
+            </w:r>
+            <w:proofErr w:type="gramEnd"/>
+            <w:r>
+              <w:t>-US-FL-</w:t>
+            </w:r>
+            <w:proofErr w:type="gramStart"/>
+            <w:r>
+              <w:t>HILLIARD,FALSE</w:t>
+            </w:r>
+            <w:proofErr w:type="gramEnd"/>
+            <w:r>
+              <w:t>,3922,7443,133112149,</w:t>
             </w:r>
           </w:p>
           <w:p>
@@ -1339,8 +2034,69 @@
               <w:jc w:val="both"/>
             </w:pPr>
             <w:r>
-              <w:t>49346,34445,PO BOX,HOLDER,FL,PRIMARY,28.96,-82.41,0.11,-0.86,0.48,NA,US,"Holder, FL",NA-US-FL-HOLDER,FALSE,,,,</w:t>
-            </w:r>
+              <w:t>49346,</w:t>
+            </w:r>
+            <w:proofErr w:type="gramStart"/>
+            <w:r>
+              <w:t>34445,PO</w:t>
+            </w:r>
+            <w:proofErr w:type="gramEnd"/>
+            <w:r>
+              <w:t xml:space="preserve"> </w:t>
+            </w:r>
+            <w:proofErr w:type="gramStart"/>
+            <w:r>
+              <w:t>BOX,HOLDER</w:t>
+            </w:r>
+            <w:proofErr w:type="gramEnd"/>
+            <w:r>
+              <w:t>,</w:t>
+            </w:r>
+            <w:proofErr w:type="gramStart"/>
+            <w:r>
+              <w:t>FL,PRIMARY</w:t>
+            </w:r>
+            <w:proofErr w:type="gramEnd"/>
+            <w:r>
+              <w:t>,28.</w:t>
+            </w:r>
+            <w:proofErr w:type="gramStart"/>
+            <w:r>
+              <w:t>96,-</w:t>
+            </w:r>
+            <w:proofErr w:type="gramEnd"/>
+            <w:r>
+              <w:t>82.41,0.</w:t>
+            </w:r>
+            <w:proofErr w:type="gramStart"/>
+            <w:r>
+              <w:t>11,-</w:t>
+            </w:r>
+            <w:proofErr w:type="gramEnd"/>
+            <w:r>
+              <w:t>0.86,0.</w:t>
+            </w:r>
+            <w:proofErr w:type="gramStart"/>
+            <w:r>
+              <w:t>48,NA</w:t>
+            </w:r>
+            <w:proofErr w:type="gramEnd"/>
+            <w:r>
+              <w:t>,US,"Holder, FL</w:t>
+            </w:r>
+            <w:proofErr w:type="gramStart"/>
+            <w:r>
+              <w:t>",NA</w:t>
+            </w:r>
+            <w:proofErr w:type="gramEnd"/>
+            <w:r>
+              <w:t>-US-FL-</w:t>
+            </w:r>
+            <w:proofErr w:type="gramStart"/>
+            <w:r>
+              <w:t>HOLDER,FALSE,,,,</w:t>
+            </w:r>
+            <w:proofErr w:type="gramEnd"/>
           </w:p>
           <w:p>
             <w:pPr>
@@ -1349,7 +2105,63 @@
               <w:jc w:val="both"/>
             </w:pPr>
             <w:r>
-              <w:t>49347,32564,STANDARD,HOLT,FL,PRIMARY,30.72,-86.67,0.04,-0.85,0.51,NA,US,"Holt, FL",NA-US-FL-HOLT,FALSE,1207,2190,36395913,</w:t>
+              <w:t>49347,</w:t>
+            </w:r>
+            <w:proofErr w:type="gramStart"/>
+            <w:r>
+              <w:t>32564,STANDARD</w:t>
+            </w:r>
+            <w:proofErr w:type="gramEnd"/>
+            <w:r>
+              <w:t>,</w:t>
+            </w:r>
+            <w:proofErr w:type="gramStart"/>
+            <w:r>
+              <w:t>HOLT,FL</w:t>
+            </w:r>
+            <w:proofErr w:type="gramEnd"/>
+            <w:r>
+              <w:t>,PRIMARY,30.</w:t>
+            </w:r>
+            <w:proofErr w:type="gramStart"/>
+            <w:r>
+              <w:t>72,-</w:t>
+            </w:r>
+            <w:proofErr w:type="gramEnd"/>
+            <w:r>
+              <w:t>86.67,0.</w:t>
+            </w:r>
+            <w:proofErr w:type="gramStart"/>
+            <w:r>
+              <w:t>04,-</w:t>
+            </w:r>
+            <w:proofErr w:type="gramEnd"/>
+            <w:r>
+              <w:t>0.85,0.</w:t>
+            </w:r>
+            <w:proofErr w:type="gramStart"/>
+            <w:r>
+              <w:t>51,NA</w:t>
+            </w:r>
+            <w:proofErr w:type="gramEnd"/>
+            <w:r>
+              <w:t>,US,"Holt, FL</w:t>
+            </w:r>
+            <w:proofErr w:type="gramStart"/>
+            <w:r>
+              <w:t>",NA</w:t>
+            </w:r>
+            <w:proofErr w:type="gramEnd"/>
+            <w:r>
+              <w:t>-US-FL-</w:t>
+            </w:r>
+            <w:proofErr w:type="gramStart"/>
+            <w:r>
+              <w:t>HOLT,FALSE</w:t>
+            </w:r>
+            <w:proofErr w:type="gramEnd"/>
+            <w:r>
+              <w:t>,1207,2190,36395913,</w:t>
             </w:r>
           </w:p>
           <w:p>
@@ -1359,8 +2171,69 @@
               <w:jc w:val="both"/>
             </w:pPr>
             <w:r>
-              <w:t>49348,34487,PO BOX,HOMOSASSA,FL,PRIMARY,28.78,-82.61,0.11,-0.86,0.48,NA,US,"Homosassa, FL",NA-US-FL-HOMOSASSA,FALSE,,,,</w:t>
-            </w:r>
+              <w:t>49348,</w:t>
+            </w:r>
+            <w:proofErr w:type="gramStart"/>
+            <w:r>
+              <w:t>34487,PO</w:t>
+            </w:r>
+            <w:proofErr w:type="gramEnd"/>
+            <w:r>
+              <w:t xml:space="preserve"> </w:t>
+            </w:r>
+            <w:proofErr w:type="gramStart"/>
+            <w:r>
+              <w:t>BOX,HOMOSASSA</w:t>
+            </w:r>
+            <w:proofErr w:type="gramEnd"/>
+            <w:r>
+              <w:t>,</w:t>
+            </w:r>
+            <w:proofErr w:type="gramStart"/>
+            <w:r>
+              <w:t>FL,PRIMARY</w:t>
+            </w:r>
+            <w:proofErr w:type="gramEnd"/>
+            <w:r>
+              <w:t>,28.</w:t>
+            </w:r>
+            <w:proofErr w:type="gramStart"/>
+            <w:r>
+              <w:t>78,-</w:t>
+            </w:r>
+            <w:proofErr w:type="gramEnd"/>
+            <w:r>
+              <w:t>82.61,0.</w:t>
+            </w:r>
+            <w:proofErr w:type="gramStart"/>
+            <w:r>
+              <w:t>11,-</w:t>
+            </w:r>
+            <w:proofErr w:type="gramEnd"/>
+            <w:r>
+              <w:t>0.86,0.</w:t>
+            </w:r>
+            <w:proofErr w:type="gramStart"/>
+            <w:r>
+              <w:t>48,NA</w:t>
+            </w:r>
+            <w:proofErr w:type="gramEnd"/>
+            <w:r>
+              <w:t>,US,"Homosassa, FL</w:t>
+            </w:r>
+            <w:proofErr w:type="gramStart"/>
+            <w:r>
+              <w:t>",NA</w:t>
+            </w:r>
+            <w:proofErr w:type="gramEnd"/>
+            <w:r>
+              <w:t>-US-FL-</w:t>
+            </w:r>
+            <w:proofErr w:type="gramStart"/>
+            <w:r>
+              <w:t>HOMOSASSA,FALSE,,,,</w:t>
+            </w:r>
+            <w:proofErr w:type="gramEnd"/>
           </w:p>
           <w:p>
             <w:pPr>
@@ -1368,9 +2241,59 @@
               <w:spacing w:line="240" w:lineRule="auto"/>
               <w:jc w:val="both"/>
             </w:pPr>
-            <w:r>
-              <w:t>10,708,STANDARD,BDA SAN LUIS,PR,NOT ACCEPTABLE,18.14,-66.26,0.38,-0.86,0.31,NA,US,"Bda San Luis, PR",NA-US-PR-BDA SAN LUIS,FALSE,,,,</w:t>
-            </w:r>
+            <w:proofErr w:type="gramStart"/>
+            <w:r>
+              <w:t>10,708,STANDARD</w:t>
+            </w:r>
+            <w:proofErr w:type="gramEnd"/>
+            <w:r>
+              <w:t xml:space="preserve">,BDA SAN </w:t>
+            </w:r>
+            <w:proofErr w:type="gramStart"/>
+            <w:r>
+              <w:t>LUIS,PR</w:t>
+            </w:r>
+            <w:proofErr w:type="gramEnd"/>
+            <w:r>
+              <w:t>,NOT ACCEPTABLE,18.</w:t>
+            </w:r>
+            <w:proofErr w:type="gramStart"/>
+            <w:r>
+              <w:t>14,-</w:t>
+            </w:r>
+            <w:proofErr w:type="gramEnd"/>
+            <w:r>
+              <w:t>66.26,0.</w:t>
+            </w:r>
+            <w:proofErr w:type="gramStart"/>
+            <w:r>
+              <w:t>38,-</w:t>
+            </w:r>
+            <w:proofErr w:type="gramEnd"/>
+            <w:r>
+              <w:t>0.86,0.</w:t>
+            </w:r>
+            <w:proofErr w:type="gramStart"/>
+            <w:r>
+              <w:t>31,NA</w:t>
+            </w:r>
+            <w:proofErr w:type="gramEnd"/>
+            <w:r>
+              <w:t>,US,"Bda San Luis, PR</w:t>
+            </w:r>
+            <w:proofErr w:type="gramStart"/>
+            <w:r>
+              <w:t>",NA</w:t>
+            </w:r>
+            <w:proofErr w:type="gramEnd"/>
+            <w:r>
+              <w:t xml:space="preserve">-US-PR-BDA SAN </w:t>
+            </w:r>
+            <w:proofErr w:type="gramStart"/>
+            <w:r>
+              <w:t>LUIS,FALSE,,,,</w:t>
+            </w:r>
+            <w:proofErr w:type="gramEnd"/>
           </w:p>
           <w:p>
             <w:pPr>
@@ -1378,8 +2301,45 @@
               <w:spacing w:line="240" w:lineRule="auto"/>
               <w:jc w:val="both"/>
             </w:pPr>
-            <w:r>
-              <w:t xml:space="preserve">3,704,STANDARD,SECT LANAUSSE,PR,NOT ACCEPTABLE,17.96,-66.22,0.38,-0.87,0.3,NA,US,"Sect </w:t>
+            <w:proofErr w:type="gramStart"/>
+            <w:r>
+              <w:t>3,704,STANDARD</w:t>
+            </w:r>
+            <w:proofErr w:type="gramEnd"/>
+            <w:r>
+              <w:t xml:space="preserve">,SECT </w:t>
+            </w:r>
+            <w:proofErr w:type="gramStart"/>
+            <w:r>
+              <w:t>LANAUSSE,PR</w:t>
+            </w:r>
+            <w:proofErr w:type="gramEnd"/>
+            <w:r>
+              <w:t>,NOT ACCEPTABLE,17.</w:t>
+            </w:r>
+            <w:proofErr w:type="gramStart"/>
+            <w:r>
+              <w:t>96,-</w:t>
+            </w:r>
+            <w:proofErr w:type="gramEnd"/>
+            <w:r>
+              <w:t>66.22,0.</w:t>
+            </w:r>
+            <w:proofErr w:type="gramStart"/>
+            <w:r>
+              <w:t>38,-</w:t>
+            </w:r>
+            <w:proofErr w:type="gramEnd"/>
+            <w:r>
+              <w:t>0.87,0.</w:t>
+            </w:r>
+            <w:proofErr w:type="gramStart"/>
+            <w:r>
+              <w:t>3,NA</w:t>
+            </w:r>
+            <w:proofErr w:type="gramEnd"/>
+            <w:r>
+              <w:t xml:space="preserve">,US,"Sect </w:t>
             </w:r>
             <w:proofErr w:type="spellStart"/>
             <w:r>
@@ -1387,8 +2347,21 @@
             </w:r>
             <w:proofErr w:type="spellEnd"/>
             <w:r>
-              <w:t>, PR",NA-US-PR-SECT LANAUSSE,FALSE,,,,</w:t>
-            </w:r>
+              <w:t>, PR</w:t>
+            </w:r>
+            <w:proofErr w:type="gramStart"/>
+            <w:r>
+              <w:t>",NA</w:t>
+            </w:r>
+            <w:proofErr w:type="gramEnd"/>
+            <w:r>
+              <w:t xml:space="preserve">-US-PR-SECT </w:t>
+            </w:r>
+            <w:proofErr w:type="gramStart"/>
+            <w:r>
+              <w:t>LANAUSSE,FALSE,,,,</w:t>
+            </w:r>
+            <w:proofErr w:type="gramEnd"/>
           </w:p>
           <w:p>
             <w:pPr>
@@ -1397,8 +2370,69 @@
               <w:jc w:val="both"/>
             </w:pPr>
             <w:r>
-              <w:t>54354,36275,PO BOX,SPRING GARDEN,AL,PRIMARY,33.97,-85.55,0.06,-0.82,0.55,NA,US,"Spring Garden, AL",NA-US-AL-SPRING GARDEN,FALSE,,,,</w:t>
-            </w:r>
+              <w:t>54354,</w:t>
+            </w:r>
+            <w:proofErr w:type="gramStart"/>
+            <w:r>
+              <w:t>36275,PO</w:t>
+            </w:r>
+            <w:proofErr w:type="gramEnd"/>
+            <w:r>
+              <w:t xml:space="preserve"> </w:t>
+            </w:r>
+            <w:proofErr w:type="gramStart"/>
+            <w:r>
+              <w:t>BOX,SPRING</w:t>
+            </w:r>
+            <w:proofErr w:type="gramEnd"/>
+            <w:r>
+              <w:t xml:space="preserve"> </w:t>
+            </w:r>
+            <w:proofErr w:type="gramStart"/>
+            <w:r>
+              <w:t>GARDEN,AL</w:t>
+            </w:r>
+            <w:proofErr w:type="gramEnd"/>
+            <w:r>
+              <w:t>,PRIMARY,33.</w:t>
+            </w:r>
+            <w:proofErr w:type="gramStart"/>
+            <w:r>
+              <w:t>97,-</w:t>
+            </w:r>
+            <w:proofErr w:type="gramEnd"/>
+            <w:r>
+              <w:t>85.55,0.</w:t>
+            </w:r>
+            <w:proofErr w:type="gramStart"/>
+            <w:r>
+              <w:t>06,-</w:t>
+            </w:r>
+            <w:proofErr w:type="gramEnd"/>
+            <w:r>
+              <w:t>0.82,0.</w:t>
+            </w:r>
+            <w:proofErr w:type="gramStart"/>
+            <w:r>
+              <w:t>55,NA</w:t>
+            </w:r>
+            <w:proofErr w:type="gramEnd"/>
+            <w:r>
+              <w:t>,US,"Spring Garden, AL</w:t>
+            </w:r>
+            <w:proofErr w:type="gramStart"/>
+            <w:r>
+              <w:t>",NA</w:t>
+            </w:r>
+            <w:proofErr w:type="gramEnd"/>
+            <w:r>
+              <w:t xml:space="preserve">-US-AL-SPRING </w:t>
+            </w:r>
+            <w:proofErr w:type="gramStart"/>
+            <w:r>
+              <w:t>GARDEN,FALSE,,,,</w:t>
+            </w:r>
+            <w:proofErr w:type="gramEnd"/>
           </w:p>
           <w:p>
             <w:pPr>
@@ -1407,7 +2441,63 @@
               <w:jc w:val="both"/>
             </w:pPr>
             <w:r>
-              <w:t>54355,35146,STANDARD,SPRINGVILLE,AL,PRIMARY,33.77,-86.47,0.05,-0.82,0.55,NA,US,"Springville, AL",NA-US-AL-SPRINGVILLE,FALSE,4046,7845,172127599,</w:t>
+              <w:t>54355,</w:t>
+            </w:r>
+            <w:proofErr w:type="gramStart"/>
+            <w:r>
+              <w:t>35146,STANDARD</w:t>
+            </w:r>
+            <w:proofErr w:type="gramEnd"/>
+            <w:r>
+              <w:t>,</w:t>
+            </w:r>
+            <w:proofErr w:type="gramStart"/>
+            <w:r>
+              <w:t>SPRINGVILLE,AL</w:t>
+            </w:r>
+            <w:proofErr w:type="gramEnd"/>
+            <w:r>
+              <w:t>,PRIMARY,33.</w:t>
+            </w:r>
+            <w:proofErr w:type="gramStart"/>
+            <w:r>
+              <w:t>77,-</w:t>
+            </w:r>
+            <w:proofErr w:type="gramEnd"/>
+            <w:r>
+              <w:t>86.47,0.</w:t>
+            </w:r>
+            <w:proofErr w:type="gramStart"/>
+            <w:r>
+              <w:t>05,-</w:t>
+            </w:r>
+            <w:proofErr w:type="gramEnd"/>
+            <w:r>
+              <w:t>0.82,0.</w:t>
+            </w:r>
+            <w:proofErr w:type="gramStart"/>
+            <w:r>
+              <w:t>55,NA</w:t>
+            </w:r>
+            <w:proofErr w:type="gramEnd"/>
+            <w:r>
+              <w:t>,US,"Springville, AL</w:t>
+            </w:r>
+            <w:proofErr w:type="gramStart"/>
+            <w:r>
+              <w:t>",NA</w:t>
+            </w:r>
+            <w:proofErr w:type="gramEnd"/>
+            <w:r>
+              <w:t>-US-AL-</w:t>
+            </w:r>
+            <w:proofErr w:type="gramStart"/>
+            <w:r>
+              <w:t>SPRINGVILLE,FALSE</w:t>
+            </w:r>
+            <w:proofErr w:type="gramEnd"/>
+            <w:r>
+              <w:t>,4046,7845,172127599,</w:t>
             </w:r>
           </w:p>
           <w:p>
@@ -1417,7 +2507,63 @@
               <w:jc w:val="both"/>
             </w:pPr>
             <w:r>
-              <w:t>54356,35585,STANDARD,SPRUCE PINE,AL,PRIMARY,34.37,-87.69,0.03,-0.82,0.56,NA,US,"Spruce Pine, AL",NA-US-AL-SPRUCE PINE,FALSE,610,1209,18525517,</w:t>
+              <w:t>54356,</w:t>
+            </w:r>
+            <w:proofErr w:type="gramStart"/>
+            <w:r>
+              <w:t>35585,STANDARD</w:t>
+            </w:r>
+            <w:proofErr w:type="gramEnd"/>
+            <w:r>
+              <w:t xml:space="preserve">,SPRUCE </w:t>
+            </w:r>
+            <w:proofErr w:type="gramStart"/>
+            <w:r>
+              <w:t>PINE,AL</w:t>
+            </w:r>
+            <w:proofErr w:type="gramEnd"/>
+            <w:r>
+              <w:t>,PRIMARY,34.</w:t>
+            </w:r>
+            <w:proofErr w:type="gramStart"/>
+            <w:r>
+              <w:t>37,-</w:t>
+            </w:r>
+            <w:proofErr w:type="gramEnd"/>
+            <w:r>
+              <w:t>87.69,0.</w:t>
+            </w:r>
+            <w:proofErr w:type="gramStart"/>
+            <w:r>
+              <w:t>03,-</w:t>
+            </w:r>
+            <w:proofErr w:type="gramEnd"/>
+            <w:r>
+              <w:t>0.82,0.</w:t>
+            </w:r>
+            <w:proofErr w:type="gramStart"/>
+            <w:r>
+              <w:t>56,NA</w:t>
+            </w:r>
+            <w:proofErr w:type="gramEnd"/>
+            <w:r>
+              <w:t>,US,"Spruce Pine, AL</w:t>
+            </w:r>
+            <w:proofErr w:type="gramStart"/>
+            <w:r>
+              <w:t>",NA</w:t>
+            </w:r>
+            <w:proofErr w:type="gramEnd"/>
+            <w:r>
+              <w:t xml:space="preserve">-US-AL-SPRUCE </w:t>
+            </w:r>
+            <w:proofErr w:type="gramStart"/>
+            <w:r>
+              <w:t>PINE,FALSE</w:t>
+            </w:r>
+            <w:proofErr w:type="gramEnd"/>
+            <w:r>
+              <w:t>,610,1209,18525517,</w:t>
             </w:r>
           </w:p>
           <w:p>
@@ -1427,7 +2573,63 @@
               <w:jc w:val="both"/>
             </w:pPr>
             <w:r>
-              <w:t>76511,27007,STANDARD,ASH HILL,NC,NOT ACCEPTABLE,36.4,-80.56,0.13,-0.79,0.59,NA,US,"Ash Hill, NC",NA-US-NC-ASH HILL,FALSE,842,1666,28876493,</w:t>
+              <w:t>76511,</w:t>
+            </w:r>
+            <w:proofErr w:type="gramStart"/>
+            <w:r>
+              <w:t>27007,STANDARD</w:t>
+            </w:r>
+            <w:proofErr w:type="gramEnd"/>
+            <w:r>
+              <w:t xml:space="preserve">,ASH </w:t>
+            </w:r>
+            <w:proofErr w:type="gramStart"/>
+            <w:r>
+              <w:t>HILL,NC</w:t>
+            </w:r>
+            <w:proofErr w:type="gramEnd"/>
+            <w:r>
+              <w:t>,NOT ACCEPTABLE,36.</w:t>
+            </w:r>
+            <w:proofErr w:type="gramStart"/>
+            <w:r>
+              <w:t>4,-</w:t>
+            </w:r>
+            <w:proofErr w:type="gramEnd"/>
+            <w:r>
+              <w:t>80.56,0.</w:t>
+            </w:r>
+            <w:proofErr w:type="gramStart"/>
+            <w:r>
+              <w:t>13,-</w:t>
+            </w:r>
+            <w:proofErr w:type="gramEnd"/>
+            <w:r>
+              <w:t>0.79,0.</w:t>
+            </w:r>
+            <w:proofErr w:type="gramStart"/>
+            <w:r>
+              <w:t>59,NA</w:t>
+            </w:r>
+            <w:proofErr w:type="gramEnd"/>
+            <w:r>
+              <w:t>,US,"Ash Hill, NC</w:t>
+            </w:r>
+            <w:proofErr w:type="gramStart"/>
+            <w:r>
+              <w:t>",NA</w:t>
+            </w:r>
+            <w:proofErr w:type="gramEnd"/>
+            <w:r>
+              <w:t xml:space="preserve">-US-NC-ASH </w:t>
+            </w:r>
+            <w:proofErr w:type="gramStart"/>
+            <w:r>
+              <w:t>HILL,FALSE</w:t>
+            </w:r>
+            <w:proofErr w:type="gramEnd"/>
+            <w:r>
+              <w:t>,842,1666,28876493,</w:t>
             </w:r>
           </w:p>
           <w:p>
@@ -1437,7 +2639,63 @@
               <w:jc w:val="both"/>
             </w:pPr>
             <w:r>
-              <w:t>76512,27203,STANDARD,ASHEBORO,NC,PRIMARY,35.71,-79.81,0.14,-0.79,0.58,NA,US,"Asheboro, NC",NA-US-NC-ASHEBORO,FALSE,8355,15228,215474318,</w:t>
+              <w:t>76512,</w:t>
+            </w:r>
+            <w:proofErr w:type="gramStart"/>
+            <w:r>
+              <w:t>27203,STANDARD</w:t>
+            </w:r>
+            <w:proofErr w:type="gramEnd"/>
+            <w:r>
+              <w:t>,</w:t>
+            </w:r>
+            <w:proofErr w:type="gramStart"/>
+            <w:r>
+              <w:t>ASHEBORO,NC</w:t>
+            </w:r>
+            <w:proofErr w:type="gramEnd"/>
+            <w:r>
+              <w:t>,PRIMARY,35.</w:t>
+            </w:r>
+            <w:proofErr w:type="gramStart"/>
+            <w:r>
+              <w:t>71,-</w:t>
+            </w:r>
+            <w:proofErr w:type="gramEnd"/>
+            <w:r>
+              <w:t>79.81,0.</w:t>
+            </w:r>
+            <w:proofErr w:type="gramStart"/>
+            <w:r>
+              <w:t>14,-</w:t>
+            </w:r>
+            <w:proofErr w:type="gramEnd"/>
+            <w:r>
+              <w:t>0.79,0.</w:t>
+            </w:r>
+            <w:proofErr w:type="gramStart"/>
+            <w:r>
+              <w:t>58,NA</w:t>
+            </w:r>
+            <w:proofErr w:type="gramEnd"/>
+            <w:r>
+              <w:t>,US,"Asheboro, NC</w:t>
+            </w:r>
+            <w:proofErr w:type="gramStart"/>
+            <w:r>
+              <w:t>",NA</w:t>
+            </w:r>
+            <w:proofErr w:type="gramEnd"/>
+            <w:r>
+              <w:t>-US-NC-</w:t>
+            </w:r>
+            <w:proofErr w:type="gramStart"/>
+            <w:r>
+              <w:t>ASHEBORO,FALSE</w:t>
+            </w:r>
+            <w:proofErr w:type="gramEnd"/>
+            <w:r>
+              <w:t>,8355,15228,215474318,</w:t>
             </w:r>
           </w:p>
           <w:p>
@@ -1447,7 +2705,71 @@
               <w:jc w:val="both"/>
             </w:pPr>
             <w:r>
-              <w:t>76513,27204,PO BOX,ASHEBORO,NC,PRIMARY,35.71,-79.81,0.14,-0.79,0.58,NA,US,"Asheboro, NC",NA-US-NC-ASHEBORO,FALSE,1035,1816,30322473,</w:t>
+              <w:t>76513,</w:t>
+            </w:r>
+            <w:proofErr w:type="gramStart"/>
+            <w:r>
+              <w:t>27204,PO</w:t>
+            </w:r>
+            <w:proofErr w:type="gramEnd"/>
+            <w:r>
+              <w:t xml:space="preserve"> </w:t>
+            </w:r>
+            <w:proofErr w:type="gramStart"/>
+            <w:r>
+              <w:t>BOX,ASHEBORO</w:t>
+            </w:r>
+            <w:proofErr w:type="gramEnd"/>
+            <w:r>
+              <w:t>,</w:t>
+            </w:r>
+            <w:proofErr w:type="gramStart"/>
+            <w:r>
+              <w:t>NC,PRIMARY</w:t>
+            </w:r>
+            <w:proofErr w:type="gramEnd"/>
+            <w:r>
+              <w:t>,35.</w:t>
+            </w:r>
+            <w:proofErr w:type="gramStart"/>
+            <w:r>
+              <w:t>71,-</w:t>
+            </w:r>
+            <w:proofErr w:type="gramEnd"/>
+            <w:r>
+              <w:t>79.81,0.</w:t>
+            </w:r>
+            <w:proofErr w:type="gramStart"/>
+            <w:r>
+              <w:t>14,-</w:t>
+            </w:r>
+            <w:proofErr w:type="gramEnd"/>
+            <w:r>
+              <w:t>0.79,0.</w:t>
+            </w:r>
+            <w:proofErr w:type="gramStart"/>
+            <w:r>
+              <w:t>58,NA</w:t>
+            </w:r>
+            <w:proofErr w:type="gramEnd"/>
+            <w:r>
+              <w:t>,US,"Asheboro, NC</w:t>
+            </w:r>
+            <w:proofErr w:type="gramStart"/>
+            <w:r>
+              <w:t>",NA</w:t>
+            </w:r>
+            <w:proofErr w:type="gramEnd"/>
+            <w:r>
+              <w:t>-US-NC-</w:t>
+            </w:r>
+            <w:proofErr w:type="gramStart"/>
+            <w:r>
+              <w:t>ASHEBORO,FALSE</w:t>
+            </w:r>
+            <w:proofErr w:type="gramEnd"/>
+            <w:r>
+              <w:t>,1035,1816,30322473,</w:t>
             </w:r>
           </w:p>
           <w:p>
@@ -1945,6 +3267,7 @@
               <w:t xml:space="preserve"> </w:t>
             </w:r>
             <w:proofErr w:type="spellStart"/>
+            <w:proofErr w:type="gramStart"/>
             <w:r>
               <w:t>smallint</w:t>
             </w:r>
@@ -1952,6 +3275,7 @@
             <w:r>
               <w:t xml:space="preserve"> ,</w:t>
             </w:r>
+            <w:proofErr w:type="gramEnd"/>
           </w:p>
           <w:p>
             <w:pPr>
@@ -2124,9 +3448,14 @@
               <w:jc w:val="both"/>
             </w:pPr>
             <w:r>
-              <w:t>select TRY_CAST(</w:t>
+              <w:t>select TRY_</w:t>
+            </w:r>
+            <w:proofErr w:type="gramStart"/>
+            <w:r>
+              <w:t>CAST(</w:t>
             </w:r>
             <w:proofErr w:type="spellStart"/>
+            <w:proofErr w:type="gramEnd"/>
             <w:r>
               <w:t>venueid</w:t>
             </w:r>
@@ -2135,14 +3464,32 @@
               <w:t xml:space="preserve"> AS INTEGER) as </w:t>
             </w:r>
             <w:proofErr w:type="spellStart"/>
-            <w:r>
-              <w:t>venueid,venuename,venuecity,venuestate,TRY_CAST</w:t>
+            <w:proofErr w:type="gramStart"/>
+            <w:r>
+              <w:t>venueid,venuename</w:t>
+            </w:r>
+            <w:proofErr w:type="gramEnd"/>
+            <w:r>
+              <w:t>,</w:t>
+            </w:r>
+            <w:proofErr w:type="gramStart"/>
+            <w:r>
+              <w:t>venuecity,venuestate</w:t>
+            </w:r>
+            <w:proofErr w:type="gramEnd"/>
+            <w:r>
+              <w:t>,TRY_</w:t>
+            </w:r>
+            <w:proofErr w:type="gramStart"/>
+            <w:r>
+              <w:t>CAST</w:t>
             </w:r>
             <w:proofErr w:type="spellEnd"/>
             <w:r>
               <w:t>(</w:t>
             </w:r>
             <w:proofErr w:type="spellStart"/>
+            <w:proofErr w:type="gramEnd"/>
             <w:r>
               <w:t>venueseats</w:t>
             </w:r>
@@ -2230,46 +3577,261 @@
       <w:pPr>
         <w:jc w:val="both"/>
         <w:rPr>
+          <w:b/>
           <w:bCs/>
           <w:lang w:val="en-US"/>
         </w:rPr>
       </w:pPr>
-      <w:r>
+    </w:p>
+    <w:p>
+      <w:pPr>
+        <w:jc w:val="both"/>
         <w:rPr>
           <w:bCs/>
           <w:lang w:val="en-US"/>
         </w:rPr>
-        <w:t>This documentation introduces AWS Glue Data Catalog, Glue Crawlers, manual table creation, AWS Glue ETL Jobs, CSV-to-Parquet conversion, Amazon Athena, and schema/type conversion using SQL. The Glue Data Catalog stores metadata about datasets, including table names, column names, data types, and S3 locations. Glue Crawlers automatically discover schemas from files in S3, while manual table creation allows us to define the schema and file format ourselves. AWS Glue ETL Jobs process data and can convert CSV files into Parquet, a column-oriented format that is often more efficient for analytical queries. Amazon Athena is a serverless query service that allows us to run SQL directly against data stored in S3. The TRY_CAST() function in Athena attempts to convert values into a specified data type and returns NULL when a conversion fails, helping handle incompatible values without failing the entire query.</w:t>
-      </w:r>
-    </w:p>
-    <w:p>
-      <w:pPr>
-        <w:jc w:val="both"/>
-        <w:rPr>
-          <w:b/>
-        </w:rPr>
-      </w:pPr>
-    </w:p>
-    <w:p>
-      <w:pPr>
-        <w:jc w:val="both"/>
-        <w:rPr>
-          <w:b/>
-        </w:rPr>
-      </w:pPr>
-    </w:p>
-    <w:p>
-      <w:pPr>
-        <w:jc w:val="both"/>
-        <w:rPr>
-          <w:b/>
-        </w:rPr>
-      </w:pPr>
-      <w:r>
-        <w:rPr>
-          <w:b/>
-        </w:rPr>
-        <w:lastRenderedPageBreak/>
+      </w:pPr>
+      <w:r>
+        <w:rPr>
+          <w:bCs/>
+          <w:lang w:val="en-US"/>
+        </w:rPr>
+        <w:t xml:space="preserve">This documentation introduces AWS Glue Data Catalog, Glue Crawlers, manual table creation, AWS Glue ETL Jobs, CSV-to-Parquet conversion, Amazon Athena, and schema/type conversion using SQL. The Glue Data Catalog stores </w:t>
+      </w:r>
+      <w:proofErr w:type="gramStart"/>
+      <w:r>
+        <w:rPr>
+          <w:bCs/>
+          <w:lang w:val="en-US"/>
+        </w:rPr>
+        <w:t>metadata about datasets</w:t>
+      </w:r>
+      <w:proofErr w:type="gramEnd"/>
+      <w:r>
+        <w:rPr>
+          <w:bCs/>
+          <w:lang w:val="en-US"/>
+        </w:rPr>
+        <w:t>, including table names, column names, data types, and S3 locations. Glue Crawlers automatically discover schemas from files in S3, while manual table creation allows us to define the schema and file format ourselves. AWS Glue ETL Jobs process data and can convert CSV files into Parquet, a column-oriented format that is often more efficient for analytical queries. Amazon Athena is a serverless query service that allows us to run SQL directly against data stored in S3. The TRY_</w:t>
+      </w:r>
+      <w:proofErr w:type="gramStart"/>
+      <w:r>
+        <w:rPr>
+          <w:bCs/>
+          <w:lang w:val="en-US"/>
+        </w:rPr>
+        <w:t>CAST(</w:t>
+      </w:r>
+      <w:proofErr w:type="gramEnd"/>
+      <w:r>
+        <w:rPr>
+          <w:bCs/>
+          <w:lang w:val="en-US"/>
+        </w:rPr>
+        <w:t>) function in Athena attempts to convert values into a specified data type and returns NULL when a conversion fails, helping handle incompatible values without failing the entire query.</w:t>
+      </w:r>
+    </w:p>
+    <w:p>
+      <w:pPr>
+        <w:jc w:val="both"/>
+        <w:rPr>
+          <w:b/>
+        </w:rPr>
+      </w:pPr>
+    </w:p>
+    <w:p>
+      <w:pPr>
+        <w:jc w:val="both"/>
+        <w:rPr>
+          <w:b/>
+        </w:rPr>
+      </w:pPr>
+    </w:p>
+    <w:p>
+      <w:pPr>
+        <w:jc w:val="both"/>
+        <w:rPr>
+          <w:b/>
+          <w:bCs/>
+          <w:lang w:val="en-US"/>
+        </w:rPr>
+      </w:pPr>
+      <w:r>
+        <w:rPr>
+          <w:b/>
+          <w:bCs/>
+          <w:lang w:val="en-US"/>
+        </w:rPr>
+        <w:t xml:space="preserve">How Do </w:t>
+      </w:r>
+      <w:r>
+        <w:rPr>
+          <w:b/>
+          <w:bCs/>
+          <w:lang w:val="en-US"/>
+        </w:rPr>
+        <w:t xml:space="preserve">S3, Glue and Athena </w:t>
+      </w:r>
+      <w:r>
+        <w:rPr>
+          <w:b/>
+          <w:bCs/>
+          <w:lang w:val="en-US"/>
+        </w:rPr>
+        <w:t>Work Together</w:t>
+      </w:r>
+      <w:r>
+        <w:rPr>
+          <w:b/>
+          <w:bCs/>
+          <w:lang w:val="en-US"/>
+        </w:rPr>
+        <w:t xml:space="preserve"> for </w:t>
+      </w:r>
+      <w:proofErr w:type="gramStart"/>
+      <w:r>
+        <w:rPr>
+          <w:b/>
+          <w:bCs/>
+          <w:lang w:val="en-US"/>
+        </w:rPr>
+        <w:t>ETL ?</w:t>
+      </w:r>
+      <w:proofErr w:type="gramEnd"/>
+    </w:p>
+    <w:p>
+      <w:pPr>
+        <w:jc w:val="both"/>
+        <w:rPr>
+          <w:b/>
+          <w:bCs/>
+          <w:lang w:val="en-US"/>
+        </w:rPr>
+      </w:pPr>
+    </w:p>
+    <w:p>
+      <w:pPr>
+        <w:jc w:val="both"/>
+        <w:rPr>
+          <w:bCs/>
+          <w:lang w:val="en-US"/>
+        </w:rPr>
+      </w:pPr>
+      <w:r>
+        <w:rPr>
+          <w:bCs/>
+          <w:lang w:val="en-US"/>
+        </w:rPr>
+        <w:t xml:space="preserve">The workflow begins by creating an S3 bucket named glue-bucket and organizing folders for source data, scripts, temporary files, query results, and other datasets. Next, we create the bootcamp database in AWS Glue and register tables using either Glue Crawlers, which automatically discover the schema, or manual table creation, where we specify the columns, data types, and file format. We then create a Glue ETL Job named </w:t>
+      </w:r>
+      <w:proofErr w:type="spellStart"/>
+      <w:r>
+        <w:rPr>
+          <w:bCs/>
+          <w:lang w:val="en-US"/>
+        </w:rPr>
+        <w:t>CSV_to_parquet</w:t>
+      </w:r>
+      <w:proofErr w:type="spellEnd"/>
+      <w:r>
+        <w:rPr>
+          <w:bCs/>
+          <w:lang w:val="en-US"/>
+        </w:rPr>
+        <w:t xml:space="preserve">, configure the source as the </w:t>
+      </w:r>
+      <w:proofErr w:type="spellStart"/>
+      <w:r>
+        <w:rPr>
+          <w:bCs/>
+          <w:lang w:val="en-US"/>
+        </w:rPr>
+        <w:t>zipcodes</w:t>
+      </w:r>
+      <w:proofErr w:type="spellEnd"/>
+      <w:r>
+        <w:rPr>
+          <w:bCs/>
+          <w:lang w:val="en-US"/>
+        </w:rPr>
+        <w:t xml:space="preserve"> table, and select Amazon S3 as the destination with Parquet as the output format. After the job runs successfully, the transformed data is stored in the s3://glue-bucket/bootcamp/csvparquet1 location, where another crawler can discover the Parquet schema and register it as a new Glue table. Finally, Amazon Athena uses the metadata in the Glue Data Catalog to query the S3 data using SQL, including TRY_</w:t>
+      </w:r>
+      <w:proofErr w:type="gramStart"/>
+      <w:r>
+        <w:rPr>
+          <w:bCs/>
+          <w:lang w:val="en-US"/>
+        </w:rPr>
+        <w:t>CAST(</w:t>
+      </w:r>
+      <w:proofErr w:type="gramEnd"/>
+      <w:r>
+        <w:rPr>
+          <w:bCs/>
+          <w:lang w:val="en-US"/>
+        </w:rPr>
+        <w:t xml:space="preserve">) to convert fields such as </w:t>
+      </w:r>
+      <w:proofErr w:type="spellStart"/>
+      <w:r>
+        <w:rPr>
+          <w:bCs/>
+          <w:lang w:val="en-US"/>
+        </w:rPr>
+        <w:t>venueid</w:t>
+      </w:r>
+      <w:proofErr w:type="spellEnd"/>
+      <w:r>
+        <w:rPr>
+          <w:bCs/>
+          <w:lang w:val="en-US"/>
+        </w:rPr>
+        <w:t xml:space="preserve"> and </w:t>
+      </w:r>
+      <w:proofErr w:type="spellStart"/>
+      <w:r>
+        <w:rPr>
+          <w:bCs/>
+          <w:lang w:val="en-US"/>
+        </w:rPr>
+        <w:t>venueseats</w:t>
+      </w:r>
+      <w:proofErr w:type="spellEnd"/>
+      <w:r>
+        <w:rPr>
+          <w:bCs/>
+          <w:lang w:val="en-US"/>
+        </w:rPr>
+        <w:t xml:space="preserve"> into appropriate numeric types. Together, S3 provides storage, Glue manages metadata and ETL processing, and Athena enables serverless SQL analytics without requiring a dedicated database server.</w:t>
+      </w:r>
+    </w:p>
+    <w:p>
+      <w:pPr>
+        <w:jc w:val="both"/>
+        <w:rPr>
+          <w:b/>
+        </w:rPr>
+      </w:pPr>
+    </w:p>
+    <w:p>
+      <w:pPr>
+        <w:jc w:val="both"/>
+        <w:rPr>
+          <w:b/>
+        </w:rPr>
+      </w:pPr>
+    </w:p>
+    <w:p>
+      <w:pPr>
+        <w:jc w:val="both"/>
+        <w:rPr>
+          <w:b/>
+        </w:rPr>
+      </w:pPr>
+      <w:r>
+        <w:rPr>
+          <w:b/>
+        </w:rPr>
         <w:t>Conclusion/ Summary</w:t>
       </w:r>
     </w:p>
@@ -2292,7 +3854,21 @@
         <w:rPr>
           <w:bCs/>
         </w:rPr>
-        <w:t xml:space="preserve">In this lab, we learned how to use AWS Glue, Amazon S3, and Amazon Athena to build a simple ETL workflow. First, we created an S3 bucket and organized the data into folders. We created a Glue database named bootcamp and registered tables using both crawlers and manual table creation. Next, we created a Glue ETL job to transform CSV data into Parquet format and store the output in S3. We then used a crawler to create a table for the transformed data. Finally, we queried the tables using Athena and practiced TRY_CAST() to convert column values into appropriate data types. This lab demonstrates how AWS services work together to </w:t>
+        <w:t>In this lab, we learned how to use AWS Glue, Amazon S3, and Amazon Athena to build a simple ETL workflow. First, we created an S3 bucket and organized the data into folders. We created a Glue database named bootcamp and registered tables using both crawlers and manual table creation. Next, we created a Glue ETL job to transform CSV data into Parquet format and store the output in S3. We then used a crawler to create a table for the transformed data. Finally, we queried the tables using Athena and practiced TRY_</w:t>
+      </w:r>
+      <w:proofErr w:type="gramStart"/>
+      <w:r>
+        <w:rPr>
+          <w:bCs/>
+        </w:rPr>
+        <w:t>CAST(</w:t>
+      </w:r>
+      <w:proofErr w:type="gramEnd"/>
+      <w:r>
+        <w:rPr>
+          <w:bCs/>
+        </w:rPr>
+        <w:t xml:space="preserve">) to convert column values into appropriate data types. This lab demonstrates how AWS services work together to </w:t>
       </w:r>
       <w:proofErr w:type="spellStart"/>
       <w:r>
@@ -3295,6 +4871,17 @@
       </w:tblCellMar>
     </w:tblPr>
   </w:style>
+  <w:style w:type="paragraph" w:styleId="ListParagraph">
+    <w:name w:val="List Paragraph"/>
+    <w:basedOn w:val="Normal"/>
+    <w:uiPriority w:val="34"/>
+    <w:qFormat/>
+    <w:rsid w:val="004A7FB9"/>
+    <w:pPr>
+      <w:ind w:left="720"/>
+      <w:contextualSpacing/>
+    </w:pPr>
+  </w:style>
 </w:styles>
 </file>
 

</xml_diff>